<commit_message>
Price each shareable item and make the unit costs editable
Each item a pair can share (outage, crossing, right-of-way, access road,
permits, yard, deliveries, crews, cranes, contractors) now gets its own
savings figure with the math shown, in the pair details and the brief.
A Cost assumptions panel lets every unit cost be changed; all pairs
recalculate and the values are remembered on the device.
</commit_message>
<xml_diff>
--- a/docs/Seamline-Field-Guide.docx
+++ b/docs/Seamline-Field-Guide.docx
@@ -1427,7 +1427,7 @@
                 <w:b/>
                 <w:bCs/>
               </w:rPr>
-              <w:t xml:space="preserve">~$3.2M</w:t>
+              <w:t xml:space="preserve">~$4.0M</w:t>
             </w:r>
           </w:p>
         </w:tc>
@@ -2633,7 +2633,7 @@
         <w:t xml:space="preserve">The rough savings</w:t>
       </w:r>
       <w:r>
-        <w:t xml:space="preserve">, for example ~$1.2M.</w:t>
+        <w:t xml:space="preserve">, for example ~$1.0M.</w:t>
       </w:r>
     </w:p>
     <w:p>
@@ -2710,7 +2710,7 @@
       <w:r>
         <w:drawing>
           <wp:inline distT="0" distB="0" distL="0" distR="0">
-            <wp:extent cx="3429000" cy="7038975"/>
+            <wp:extent cx="2809875" cy="7239000"/>
             <wp:effectExtent t="0" r="0" b="0" l="0"/>
             <wp:docPr id="1" name="5-detail.png" descr="A pair's details after pressing the suggested move." title="A pair's details after pressing the suggested move."/>
             <wp:cNvGraphicFramePr>
@@ -2735,7 +2735,7 @@
                   <pic:spPr bwMode="auto">
                     <a:xfrm>
                       <a:off x="0" y="0"/>
-                      <a:ext cx="3429000" cy="7038975"/>
+                      <a:ext cx="2809875" cy="7239000"/>
                     </a:xfrm>
                     <a:prstGeom prst="rect">
                       <a:avLst/>
@@ -2834,17 +2834,17 @@
         <w:t xml:space="preserve">Reset to plan</w:t>
       </w:r>
       <w:r>
-        <w:t xml:space="preserve"> puts the dates back. In this example, the Jasper to Okatie line and McIntosh Unit 12 miss each other by six months. Starting McIntosh a year earlier unlocks about </w:t>
+        <w:t xml:space="preserve"> puts the dates back. In this example, the Jasper to Okatie line and McIntosh Unit 12 miss each other by six months. Starting McIntosh a year earlier gives them six months together and unlocks about </w:t>
       </w:r>
       <w:r>
         <w:rPr>
           <w:b/>
           <w:bCs/>
         </w:rPr>
-        <w:t xml:space="preserve">$482K</w:t>
-      </w:r>
-      <w:r>
-        <w:t xml:space="preserve">.</w:t>
+        <w:t xml:space="preserve">$643K</w:t>
+      </w:r>
+      <w:r>
+        <w:t xml:space="preserve">: $482K of shared crew mobilization, $65K of crane time and $96K of contractor setup.</w:t>
       </w:r>
     </w:p>
     <w:p>
@@ -2856,10 +2856,25 @@
           <w:b/>
           <w:bCs/>
         </w:rPr>
+        <w:t xml:space="preserve">What they can share.</w:t>
+      </w:r>
+      <w:r>
+        <w:t xml:space="preserve"> Every item the pair's tier allows, each with its own dollar figure and the math under it, like "20 days × $6.5K/day × 50%". Items that need both jobs running at the same time are greyed out until they are.</w:t>
+      </w:r>
+    </w:p>
+    <w:p>
+      <w:pPr>
+        <w:spacing w:after="140"/>
+      </w:pPr>
+      <w:r>
+        <w:rPr>
+          <w:b/>
+          <w:bCs/>
+        </w:rPr>
         <w:t xml:space="preserve">Cost and impact estimate.</w:t>
       </w:r>
       <w:r>
-        <w:t xml:space="preserve"> Where the savings come from, line by line.</w:t>
+        <w:t xml:space="preserve"> The total of those items.</w:t>
       </w:r>
     </w:p>
     <w:p>
@@ -2990,7 +3005,7 @@
       <w:r>
         <w:drawing>
           <wp:inline distT="0" distB="0" distL="0" distR="0">
-            <wp:extent cx="4381500" cy="6496050"/>
+            <wp:extent cx="4381500" cy="5943600"/>
             <wp:effectExtent t="0" r="0" b="0" l="0"/>
             <wp:docPr id="1" name="7-brief.png" descr="One page per pair, addressed to both companies." title="One page per pair, addressed to both companies."/>
             <wp:cNvGraphicFramePr>
@@ -3015,7 +3030,7 @@
                   <pic:spPr bwMode="auto">
                     <a:xfrm>
                       <a:off x="0" y="0"/>
-                      <a:ext cx="4381500" cy="6496050"/>
+                      <a:ext cx="4381500" cy="5943600"/>
                     </a:xfrm>
                     <a:prstGeom prst="rect">
                       <a:avLst/>
@@ -3067,7 +3082,7 @@
         <w:spacing w:after="140"/>
       </w:pPr>
       <w:r>
-        <w:t xml:space="preserve">It says in one paragraph how close the projects are, when they overlap, and roughly what coordinating would save. Then it shows a small locator map, the three key numbers, both projects, what they can share, the savings line by line, and the next steps to take.</w:t>
+        <w:t xml:space="preserve">It says in one paragraph how close the projects are, when they overlap, and roughly what coordinating would save. Then it shows a small locator map, the three key numbers, both projects, each shareable item with its dollar figure and math, and the next steps to take.</w:t>
       </w:r>
     </w:p>
     <w:p>
@@ -3267,7 +3282,7 @@
       <w:r>
         <w:drawing>
           <wp:inline distT="0" distB="0" distL="0" distR="0">
-            <wp:extent cx="5943600" cy="2505075"/>
+            <wp:extent cx="5943600" cy="2733675"/>
             <wp:effectExtent t="0" r="0" b="0" l="0"/>
             <wp:docPr id="1" name="9-import.png" descr="After dropping an Excel plan: 4 rows loaded, 1 skipped with the reason." title="After dropping an Excel plan: 4 rows loaded, 1 skipped with the reason."/>
             <wp:cNvGraphicFramePr>
@@ -3292,7 +3307,7 @@
                   <pic:spPr bwMode="auto">
                     <a:xfrm>
                       <a:off x="0" y="0"/>
-                      <a:ext cx="5943600" cy="2505075"/>
+                      <a:ext cx="5943600" cy="2733675"/>
                     </a:xfrm>
                     <a:prstGeom prst="rect">
                       <a:avLst/>
@@ -3538,7 +3553,15 @@
         <w:spacing w:after="140"/>
       </w:pPr>
       <w:r>
-        <w:t xml:space="preserve">These are rough, planning-level figures meant to show which pairs are worth a phone call, not a budget. A pair only earns the lines its tier allows, and the crew and yard lines only count if the two jobs are built at the same time.</w:t>
+        <w:t xml:space="preserve">These are rough, planning-level figures meant to show which pairs are worth a phone call, not a budget. Each item a pair can share gets its own figure, and the pair's total is their sum. A pair only earns the items its tier allows, and yards, deliveries, crews, cranes and contractors only count if the two jobs are built at the same time.</w:t>
+      </w:r>
+    </w:p>
+    <w:p>
+      <w:pPr>
+        <w:spacing w:after="140"/>
+      </w:pPr>
+      <w:r>
+        <w:t xml:space="preserve">When one company's cost can be shared, each side saves its share, 50% by default. A coordinated power shutoff and a crossing designed once are counted in full.</w:t>
       </w:r>
     </w:p>
     <w:tbl>
@@ -3554,9 +3577,9 @@
         </w:tblBorders>
       </w:tblPr>
       <w:tblGrid>
-        <w:gridCol w:w="3100"/>
-        <w:gridCol w:w="3300"/>
-        <w:gridCol w:w="2960"/>
+        <w:gridCol w:w="2400"/>
+        <w:gridCol w:w="2600"/>
+        <w:gridCol w:w="4360"/>
       </w:tblGrid>
       <w:tr>
         <w:trPr>
@@ -3564,7 +3587,7 @@
         </w:trPr>
         <w:tc>
           <w:tcPr>
-            <w:tcW w:type="dxa" w:w="3100"/>
+            <w:tcW w:type="dxa" w:w="2400"/>
             <w:tcBorders>
               <w:top w:val="single" w:color="D5DEDD" w:sz="4"/>
               <w:left w:val="single" w:color="D5DEDD" w:sz="4"/>
@@ -3588,13 +3611,13 @@
                 <w:sz w:val="19"/>
                 <w:szCs w:val="19"/>
               </w:rPr>
-              <w:t xml:space="preserve">What's shared</w:t>
-            </w:r>
-          </w:p>
-        </w:tc>
-        <w:tc>
-          <w:tcPr>
-            <w:tcW w:type="dxa" w:w="3300"/>
+              <w:t xml:space="preserve">Item</w:t>
+            </w:r>
+          </w:p>
+        </w:tc>
+        <w:tc>
+          <w:tcPr>
+            <w:tcW w:type="dxa" w:w="2600"/>
             <w:tcBorders>
               <w:top w:val="single" w:color="D5DEDD" w:sz="4"/>
               <w:left w:val="single" w:color="D5DEDD" w:sz="4"/>
@@ -3624,7 +3647,7 @@
         </w:tc>
         <w:tc>
           <w:tcPr>
-            <w:tcW w:type="dxa" w:w="2960"/>
+            <w:tcW w:type="dxa" w:w="4360"/>
             <w:tcBorders>
               <w:top w:val="single" w:color="D5DEDD" w:sz="4"/>
               <w:left w:val="single" w:color="D5DEDD" w:sz="4"/>
@@ -3648,7 +3671,7 @@
                 <w:sz w:val="19"/>
                 <w:szCs w:val="19"/>
               </w:rPr>
-              <w:t xml:space="preserve">Estimate</w:t>
+              <w:t xml:space="preserve">Default math</w:t>
             </w:r>
           </w:p>
         </w:tc>
@@ -3656,7 +3679,7 @@
       <w:tr>
         <w:tc>
           <w:tcPr>
-            <w:tcW w:type="dxa" w:w="3100"/>
+            <w:tcW w:type="dxa" w:w="2400"/>
             <w:tcBorders>
               <w:top w:val="single" w:color="D5DEDD" w:sz="4"/>
               <w:left w:val="single" w:color="D5DEDD" w:sz="4"/>
@@ -3672,13 +3695,13 @@
           </w:tcPr>
           <w:p>
             <w:r>
-              <w:t xml:space="preserve">Crews and equipment</w:t>
-            </w:r>
-          </w:p>
-        </w:tc>
-        <w:tc>
-          <w:tcPr>
-            <w:tcW w:type="dxa" w:w="3300"/>
+              <w:t xml:space="preserve">Outage timing</w:t>
+            </w:r>
+          </w:p>
+        </w:tc>
+        <w:tc>
+          <w:tcPr>
+            <w:tcW w:type="dxa" w:w="2600"/>
             <w:tcBorders>
               <w:top w:val="single" w:color="D5DEDD" w:sz="4"/>
               <w:left w:val="single" w:color="D5DEDD" w:sz="4"/>
@@ -3694,13 +3717,13 @@
           </w:tcPr>
           <w:p>
             <w:r>
-              <w:t xml:space="preserve">Under 40 km and built at the same time</w:t>
-            </w:r>
-          </w:p>
-        </w:tc>
-        <w:tc>
-          <w:tcPr>
-            <w:tcW w:type="dxa" w:w="2960"/>
+              <w:t xml:space="preserve">Touching</w:t>
+            </w:r>
+          </w:p>
+        </w:tc>
+        <w:tc>
+          <w:tcPr>
+            <w:tcW w:type="dxa" w:w="4360"/>
             <w:tcBorders>
               <w:top w:val="single" w:color="D5DEDD" w:sz="4"/>
               <w:left w:val="single" w:color="D5DEDD" w:sz="4"/>
@@ -3716,7 +3739,7 @@
           </w:tcPr>
           <w:p>
             <w:r>
-              <w:t xml:space="preserve">Half of 5% of the smaller job's cost</w:t>
+              <w:t xml:space="preserve">One $250K shutoff instead of two</w:t>
             </w:r>
           </w:p>
         </w:tc>
@@ -3724,7 +3747,7 @@
       <w:tr>
         <w:tc>
           <w:tcPr>
-            <w:tcW w:type="dxa" w:w="3100"/>
+            <w:tcW w:type="dxa" w:w="2400"/>
             <w:tcBorders>
               <w:top w:val="single" w:color="D5DEDD" w:sz="4"/>
               <w:left w:val="single" w:color="D5DEDD" w:sz="4"/>
@@ -3740,13 +3763,13 @@
           </w:tcPr>
           <w:p>
             <w:r>
-              <w:t xml:space="preserve">One storage yard instead of two</w:t>
-            </w:r>
-          </w:p>
-        </w:tc>
-        <w:tc>
-          <w:tcPr>
-            <w:tcW w:type="dxa" w:w="3300"/>
+              <w:t xml:space="preserve">Crossing structures</w:t>
+            </w:r>
+          </w:p>
+        </w:tc>
+        <w:tc>
+          <w:tcPr>
+            <w:tcW w:type="dxa" w:w="2600"/>
             <w:tcBorders>
               <w:top w:val="single" w:color="D5DEDD" w:sz="4"/>
               <w:left w:val="single" w:color="D5DEDD" w:sz="4"/>
@@ -3762,13 +3785,13 @@
           </w:tcPr>
           <w:p>
             <w:r>
-              <w:t xml:space="preserve">Under 8 km and built at the same time</w:t>
-            </w:r>
-          </w:p>
-        </w:tc>
-        <w:tc>
-          <w:tcPr>
-            <w:tcW w:type="dxa" w:w="2960"/>
+              <w:t xml:space="preserve">Touching</w:t>
+            </w:r>
+          </w:p>
+        </w:tc>
+        <w:tc>
+          <w:tcPr>
+            <w:tcW w:type="dxa" w:w="4360"/>
             <w:tcBorders>
               <w:top w:val="single" w:color="D5DEDD" w:sz="4"/>
               <w:left w:val="single" w:color="D5DEDD" w:sz="4"/>
@@ -3784,7 +3807,7 @@
           </w:tcPr>
           <w:p>
             <w:r>
-              <w:t xml:space="preserve">$400K</w:t>
+              <w:t xml:space="preserve">One $120K design and structure set</w:t>
             </w:r>
           </w:p>
         </w:tc>
@@ -3792,7 +3815,7 @@
       <w:tr>
         <w:tc>
           <w:tcPr>
-            <w:tcW w:type="dxa" w:w="3100"/>
+            <w:tcW w:type="dxa" w:w="2400"/>
             <w:tcBorders>
               <w:top w:val="single" w:color="D5DEDD" w:sz="4"/>
               <w:left w:val="single" w:color="D5DEDD" w:sz="4"/>
@@ -3808,13 +3831,13 @@
           </w:tcPr>
           <w:p>
             <w:r>
-              <w:t xml:space="preserve">Land, access road and permits</w:t>
-            </w:r>
-          </w:p>
-        </w:tc>
-        <w:tc>
-          <w:tcPr>
-            <w:tcW w:type="dxa" w:w="3300"/>
+              <w:t xml:space="preserve">Right-of-way</w:t>
+            </w:r>
+          </w:p>
+        </w:tc>
+        <w:tc>
+          <w:tcPr>
+            <w:tcW w:type="dxa" w:w="2600"/>
             <w:tcBorders>
               <w:top w:val="single" w:color="D5DEDD" w:sz="4"/>
               <w:left w:val="single" w:color="D5DEDD" w:sz="4"/>
@@ -3836,7 +3859,7 @@
         </w:tc>
         <w:tc>
           <w:tcPr>
-            <w:tcW w:type="dxa" w:w="2960"/>
+            <w:tcW w:type="dxa" w:w="4360"/>
             <w:tcBorders>
               <w:top w:val="single" w:color="D5DEDD" w:sz="4"/>
               <w:left w:val="single" w:color="D5DEDD" w:sz="4"/>
@@ -3852,7 +3875,7 @@
           </w:tcPr>
           <w:p>
             <w:r>
-              <w:t xml:space="preserve">About $407K</w:t>
+              <w:t xml:space="preserve">11.1 acres (1 km × 45 m) × $15K per acre × 50% = $83K</w:t>
             </w:r>
           </w:p>
         </w:tc>
@@ -3860,7 +3883,7 @@
       <w:tr>
         <w:tc>
           <w:tcPr>
-            <w:tcW w:type="dxa" w:w="3100"/>
+            <w:tcW w:type="dxa" w:w="2400"/>
             <w:tcBorders>
               <w:top w:val="single" w:color="D5DEDD" w:sz="4"/>
               <w:left w:val="single" w:color="D5DEDD" w:sz="4"/>
@@ -3876,13 +3899,13 @@
           </w:tcPr>
           <w:p>
             <w:r>
-              <w:t xml:space="preserve">One power shutoff instead of two</w:t>
-            </w:r>
-          </w:p>
-        </w:tc>
-        <w:tc>
-          <w:tcPr>
-            <w:tcW w:type="dxa" w:w="3300"/>
+              <w:t xml:space="preserve">Access roads</w:t>
+            </w:r>
+          </w:p>
+        </w:tc>
+        <w:tc>
+          <w:tcPr>
+            <w:tcW w:type="dxa" w:w="2600"/>
             <w:tcBorders>
               <w:top w:val="single" w:color="D5DEDD" w:sz="4"/>
               <w:left w:val="single" w:color="D5DEDD" w:sz="4"/>
@@ -3898,13 +3921,13 @@
           </w:tcPr>
           <w:p>
             <w:r>
-              <w:t xml:space="preserve">Touching</w:t>
-            </w:r>
-          </w:p>
-        </w:tc>
-        <w:tc>
-          <w:tcPr>
-            <w:tcW w:type="dxa" w:w="2960"/>
+              <w:t xml:space="preserve">Under 1.6 km</w:t>
+            </w:r>
+          </w:p>
+        </w:tc>
+        <w:tc>
+          <w:tcPr>
+            <w:tcW w:type="dxa" w:w="4360"/>
             <w:tcBorders>
               <w:top w:val="single" w:color="D5DEDD" w:sz="4"/>
               <w:left w:val="single" w:color="D5DEDD" w:sz="4"/>
@@ -3920,7 +3943,415 @@
           </w:tcPr>
           <w:p>
             <w:r>
-              <w:t xml:space="preserve">$250K</w:t>
+              <w:t xml:space="preserve">1 km × $90K per km × 50% = $45K</w:t>
+            </w:r>
+          </w:p>
+        </w:tc>
+      </w:tr>
+      <w:tr>
+        <w:tc>
+          <w:tcPr>
+            <w:tcW w:type="dxa" w:w="2400"/>
+            <w:tcBorders>
+              <w:top w:val="single" w:color="D5DEDD" w:sz="4"/>
+              <w:left w:val="single" w:color="D5DEDD" w:sz="4"/>
+              <w:bottom w:val="single" w:color="D5DEDD" w:sz="4"/>
+              <w:right w:val="single" w:color="D5DEDD" w:sz="4"/>
+            </w:tcBorders>
+            <w:tcMar>
+              <w:top w:type="dxa" w:w="80"/>
+              <w:left w:type="dxa" w:w="120"/>
+              <w:bottom w:type="dxa" w:w="80"/>
+              <w:right w:type="dxa" w:w="120"/>
+            </w:tcMar>
+          </w:tcPr>
+          <w:p>
+            <w:r>
+              <w:t xml:space="preserve">Permits</w:t>
+            </w:r>
+          </w:p>
+        </w:tc>
+        <w:tc>
+          <w:tcPr>
+            <w:tcW w:type="dxa" w:w="2600"/>
+            <w:tcBorders>
+              <w:top w:val="single" w:color="D5DEDD" w:sz="4"/>
+              <w:left w:val="single" w:color="D5DEDD" w:sz="4"/>
+              <w:bottom w:val="single" w:color="D5DEDD" w:sz="4"/>
+              <w:right w:val="single" w:color="D5DEDD" w:sz="4"/>
+            </w:tcBorders>
+            <w:tcMar>
+              <w:top w:type="dxa" w:w="80"/>
+              <w:left w:type="dxa" w:w="120"/>
+              <w:bottom w:type="dxa" w:w="80"/>
+              <w:right w:type="dxa" w:w="120"/>
+            </w:tcMar>
+          </w:tcPr>
+          <w:p>
+            <w:r>
+              <w:t xml:space="preserve">Under 1.6 km</w:t>
+            </w:r>
+          </w:p>
+        </w:tc>
+        <w:tc>
+          <w:tcPr>
+            <w:tcW w:type="dxa" w:w="4360"/>
+            <w:tcBorders>
+              <w:top w:val="single" w:color="D5DEDD" w:sz="4"/>
+              <w:left w:val="single" w:color="D5DEDD" w:sz="4"/>
+              <w:bottom w:val="single" w:color="D5DEDD" w:sz="4"/>
+              <w:right w:val="single" w:color="D5DEDD" w:sz="4"/>
+            </w:tcBorders>
+            <w:tcMar>
+              <w:top w:type="dxa" w:w="80"/>
+              <w:left w:type="dxa" w:w="120"/>
+              <w:bottom w:type="dxa" w:w="80"/>
+              <w:right w:type="dxa" w:w="120"/>
+            </w:tcMar>
+          </w:tcPr>
+          <w:p>
+            <w:r>
+              <w:t xml:space="preserve">One $150K package instead of two × 50% = $75K</w:t>
+            </w:r>
+          </w:p>
+        </w:tc>
+      </w:tr>
+      <w:tr>
+        <w:tc>
+          <w:tcPr>
+            <w:tcW w:type="dxa" w:w="2400"/>
+            <w:tcBorders>
+              <w:top w:val="single" w:color="D5DEDD" w:sz="4"/>
+              <w:left w:val="single" w:color="D5DEDD" w:sz="4"/>
+              <w:bottom w:val="single" w:color="D5DEDD" w:sz="4"/>
+              <w:right w:val="single" w:color="D5DEDD" w:sz="4"/>
+            </w:tcBorders>
+            <w:tcMar>
+              <w:top w:type="dxa" w:w="80"/>
+              <w:left w:type="dxa" w:w="120"/>
+              <w:bottom w:type="dxa" w:w="80"/>
+              <w:right w:type="dxa" w:w="120"/>
+            </w:tcMar>
+          </w:tcPr>
+          <w:p>
+            <w:r>
+              <w:t xml:space="preserve">Laydown yards</w:t>
+            </w:r>
+          </w:p>
+        </w:tc>
+        <w:tc>
+          <w:tcPr>
+            <w:tcW w:type="dxa" w:w="2600"/>
+            <w:tcBorders>
+              <w:top w:val="single" w:color="D5DEDD" w:sz="4"/>
+              <w:left w:val="single" w:color="D5DEDD" w:sz="4"/>
+              <w:bottom w:val="single" w:color="D5DEDD" w:sz="4"/>
+              <w:right w:val="single" w:color="D5DEDD" w:sz="4"/>
+            </w:tcBorders>
+            <w:tcMar>
+              <w:top w:type="dxa" w:w="80"/>
+              <w:left w:type="dxa" w:w="120"/>
+              <w:bottom w:type="dxa" w:w="80"/>
+              <w:right w:type="dxa" w:w="120"/>
+            </w:tcMar>
+          </w:tcPr>
+          <w:p>
+            <w:r>
+              <w:t xml:space="preserve">Under 8 km, same time</w:t>
+            </w:r>
+          </w:p>
+        </w:tc>
+        <w:tc>
+          <w:tcPr>
+            <w:tcW w:type="dxa" w:w="4360"/>
+            <w:tcBorders>
+              <w:top w:val="single" w:color="D5DEDD" w:sz="4"/>
+              <w:left w:val="single" w:color="D5DEDD" w:sz="4"/>
+              <w:bottom w:val="single" w:color="D5DEDD" w:sz="4"/>
+              <w:right w:val="single" w:color="D5DEDD" w:sz="4"/>
+            </w:tcBorders>
+            <w:tcMar>
+              <w:top w:type="dxa" w:w="80"/>
+              <w:left w:type="dxa" w:w="120"/>
+              <w:bottom w:type="dxa" w:w="80"/>
+              <w:right w:type="dxa" w:w="120"/>
+            </w:tcMar>
+          </w:tcPr>
+          <w:p>
+            <w:r>
+              <w:t xml:space="preserve">One $400K yard instead of two × 50% = $200K</w:t>
+            </w:r>
+          </w:p>
+        </w:tc>
+      </w:tr>
+      <w:tr>
+        <w:tc>
+          <w:tcPr>
+            <w:tcW w:type="dxa" w:w="2400"/>
+            <w:tcBorders>
+              <w:top w:val="single" w:color="D5DEDD" w:sz="4"/>
+              <w:left w:val="single" w:color="D5DEDD" w:sz="4"/>
+              <w:bottom w:val="single" w:color="D5DEDD" w:sz="4"/>
+              <w:right w:val="single" w:color="D5DEDD" w:sz="4"/>
+            </w:tcBorders>
+            <w:tcMar>
+              <w:top w:type="dxa" w:w="80"/>
+              <w:left w:type="dxa" w:w="120"/>
+              <w:bottom w:type="dxa" w:w="80"/>
+              <w:right w:type="dxa" w:w="120"/>
+            </w:tcMar>
+          </w:tcPr>
+          <w:p>
+            <w:r>
+              <w:t xml:space="preserve">Deliveries</w:t>
+            </w:r>
+          </w:p>
+        </w:tc>
+        <w:tc>
+          <w:tcPr>
+            <w:tcW w:type="dxa" w:w="2600"/>
+            <w:tcBorders>
+              <w:top w:val="single" w:color="D5DEDD" w:sz="4"/>
+              <w:left w:val="single" w:color="D5DEDD" w:sz="4"/>
+              <w:bottom w:val="single" w:color="D5DEDD" w:sz="4"/>
+              <w:right w:val="single" w:color="D5DEDD" w:sz="4"/>
+            </w:tcBorders>
+            <w:tcMar>
+              <w:top w:type="dxa" w:w="80"/>
+              <w:left w:type="dxa" w:w="120"/>
+              <w:bottom w:type="dxa" w:w="80"/>
+              <w:right w:type="dxa" w:w="120"/>
+            </w:tcMar>
+          </w:tcPr>
+          <w:p>
+            <w:r>
+              <w:t xml:space="preserve">Under 8 km, same time</w:t>
+            </w:r>
+          </w:p>
+        </w:tc>
+        <w:tc>
+          <w:tcPr>
+            <w:tcW w:type="dxa" w:w="4360"/>
+            <w:tcBorders>
+              <w:top w:val="single" w:color="D5DEDD" w:sz="4"/>
+              <w:left w:val="single" w:color="D5DEDD" w:sz="4"/>
+              <w:bottom w:val="single" w:color="D5DEDD" w:sz="4"/>
+              <w:right w:val="single" w:color="D5DEDD" w:sz="4"/>
+            </w:tcBorders>
+            <w:tcMar>
+              <w:top w:type="dxa" w:w="80"/>
+              <w:left w:type="dxa" w:w="120"/>
+              <w:bottom w:type="dxa" w:w="80"/>
+              <w:right w:type="dxa" w:w="120"/>
+            </w:tcMar>
+          </w:tcPr>
+          <w:p>
+            <w:r>
+              <w:t xml:space="preserve">12 loads × $5K × 50% = $30K</w:t>
+            </w:r>
+          </w:p>
+        </w:tc>
+      </w:tr>
+      <w:tr>
+        <w:tc>
+          <w:tcPr>
+            <w:tcW w:type="dxa" w:w="2400"/>
+            <w:tcBorders>
+              <w:top w:val="single" w:color="D5DEDD" w:sz="4"/>
+              <w:left w:val="single" w:color="D5DEDD" w:sz="4"/>
+              <w:bottom w:val="single" w:color="D5DEDD" w:sz="4"/>
+              <w:right w:val="single" w:color="D5DEDD" w:sz="4"/>
+            </w:tcBorders>
+            <w:tcMar>
+              <w:top w:type="dxa" w:w="80"/>
+              <w:left w:type="dxa" w:w="120"/>
+              <w:bottom w:type="dxa" w:w="80"/>
+              <w:right w:type="dxa" w:w="120"/>
+            </w:tcMar>
+          </w:tcPr>
+          <w:p>
+            <w:r>
+              <w:t xml:space="preserve">Crews</w:t>
+            </w:r>
+          </w:p>
+        </w:tc>
+        <w:tc>
+          <w:tcPr>
+            <w:tcW w:type="dxa" w:w="2600"/>
+            <w:tcBorders>
+              <w:top w:val="single" w:color="D5DEDD" w:sz="4"/>
+              <w:left w:val="single" w:color="D5DEDD" w:sz="4"/>
+              <w:bottom w:val="single" w:color="D5DEDD" w:sz="4"/>
+              <w:right w:val="single" w:color="D5DEDD" w:sz="4"/>
+            </w:tcBorders>
+            <w:tcMar>
+              <w:top w:type="dxa" w:w="80"/>
+              <w:left w:type="dxa" w:w="120"/>
+              <w:bottom w:type="dxa" w:w="80"/>
+              <w:right w:type="dxa" w:w="120"/>
+            </w:tcMar>
+          </w:tcPr>
+          <w:p>
+            <w:r>
+              <w:t xml:space="preserve">Under 40 km, same time</w:t>
+            </w:r>
+          </w:p>
+        </w:tc>
+        <w:tc>
+          <w:tcPr>
+            <w:tcW w:type="dxa" w:w="4360"/>
+            <w:tcBorders>
+              <w:top w:val="single" w:color="D5DEDD" w:sz="4"/>
+              <w:left w:val="single" w:color="D5DEDD" w:sz="4"/>
+              <w:bottom w:val="single" w:color="D5DEDD" w:sz="4"/>
+              <w:right w:val="single" w:color="D5DEDD" w:sz="4"/>
+            </w:tcBorders>
+            <w:tcMar>
+              <w:top w:type="dxa" w:w="80"/>
+              <w:left w:type="dxa" w:w="120"/>
+              <w:bottom w:type="dxa" w:w="80"/>
+              <w:right w:type="dxa" w:w="120"/>
+            </w:tcMar>
+          </w:tcPr>
+          <w:p>
+            <w:r>
+              <w:t xml:space="preserve">5% of the smaller job's cost × 50%</w:t>
+            </w:r>
+          </w:p>
+        </w:tc>
+      </w:tr>
+      <w:tr>
+        <w:tc>
+          <w:tcPr>
+            <w:tcW w:type="dxa" w:w="2400"/>
+            <w:tcBorders>
+              <w:top w:val="single" w:color="D5DEDD" w:sz="4"/>
+              <w:left w:val="single" w:color="D5DEDD" w:sz="4"/>
+              <w:bottom w:val="single" w:color="D5DEDD" w:sz="4"/>
+              <w:right w:val="single" w:color="D5DEDD" w:sz="4"/>
+            </w:tcBorders>
+            <w:tcMar>
+              <w:top w:type="dxa" w:w="80"/>
+              <w:left w:type="dxa" w:w="120"/>
+              <w:bottom w:type="dxa" w:w="80"/>
+              <w:right w:type="dxa" w:w="120"/>
+            </w:tcMar>
+          </w:tcPr>
+          <w:p>
+            <w:r>
+              <w:t xml:space="preserve">Cranes</w:t>
+            </w:r>
+          </w:p>
+        </w:tc>
+        <w:tc>
+          <w:tcPr>
+            <w:tcW w:type="dxa" w:w="2600"/>
+            <w:tcBorders>
+              <w:top w:val="single" w:color="D5DEDD" w:sz="4"/>
+              <w:left w:val="single" w:color="D5DEDD" w:sz="4"/>
+              <w:bottom w:val="single" w:color="D5DEDD" w:sz="4"/>
+              <w:right w:val="single" w:color="D5DEDD" w:sz="4"/>
+            </w:tcBorders>
+            <w:tcMar>
+              <w:top w:type="dxa" w:w="80"/>
+              <w:left w:type="dxa" w:w="120"/>
+              <w:bottom w:type="dxa" w:w="80"/>
+              <w:right w:type="dxa" w:w="120"/>
+            </w:tcMar>
+          </w:tcPr>
+          <w:p>
+            <w:r>
+              <w:t xml:space="preserve">Under 40 km, same time</w:t>
+            </w:r>
+          </w:p>
+        </w:tc>
+        <w:tc>
+          <w:tcPr>
+            <w:tcW w:type="dxa" w:w="4360"/>
+            <w:tcBorders>
+              <w:top w:val="single" w:color="D5DEDD" w:sz="4"/>
+              <w:left w:val="single" w:color="D5DEDD" w:sz="4"/>
+              <w:bottom w:val="single" w:color="D5DEDD" w:sz="4"/>
+              <w:right w:val="single" w:color="D5DEDD" w:sz="4"/>
+            </w:tcBorders>
+            <w:tcMar>
+              <w:top w:type="dxa" w:w="80"/>
+              <w:left w:type="dxa" w:w="120"/>
+              <w:bottom w:type="dxa" w:w="80"/>
+              <w:right w:type="dxa" w:w="120"/>
+            </w:tcMar>
+          </w:tcPr>
+          <w:p>
+            <w:r>
+              <w:t xml:space="preserve">20 days × $6.5K per day × 50% = $65K</w:t>
+            </w:r>
+          </w:p>
+        </w:tc>
+      </w:tr>
+      <w:tr>
+        <w:tc>
+          <w:tcPr>
+            <w:tcW w:type="dxa" w:w="2400"/>
+            <w:tcBorders>
+              <w:top w:val="single" w:color="D5DEDD" w:sz="4"/>
+              <w:left w:val="single" w:color="D5DEDD" w:sz="4"/>
+              <w:bottom w:val="single" w:color="D5DEDD" w:sz="4"/>
+              <w:right w:val="single" w:color="D5DEDD" w:sz="4"/>
+            </w:tcBorders>
+            <w:tcMar>
+              <w:top w:type="dxa" w:w="80"/>
+              <w:left w:type="dxa" w:w="120"/>
+              <w:bottom w:type="dxa" w:w="80"/>
+              <w:right w:type="dxa" w:w="120"/>
+            </w:tcMar>
+          </w:tcPr>
+          <w:p>
+            <w:r>
+              <w:t xml:space="preserve">Contractors</w:t>
+            </w:r>
+          </w:p>
+        </w:tc>
+        <w:tc>
+          <w:tcPr>
+            <w:tcW w:type="dxa" w:w="2600"/>
+            <w:tcBorders>
+              <w:top w:val="single" w:color="D5DEDD" w:sz="4"/>
+              <w:left w:val="single" w:color="D5DEDD" w:sz="4"/>
+              <w:bottom w:val="single" w:color="D5DEDD" w:sz="4"/>
+              <w:right w:val="single" w:color="D5DEDD" w:sz="4"/>
+            </w:tcBorders>
+            <w:tcMar>
+              <w:top w:type="dxa" w:w="80"/>
+              <w:left w:type="dxa" w:w="120"/>
+              <w:bottom w:type="dxa" w:w="80"/>
+              <w:right w:type="dxa" w:w="120"/>
+            </w:tcMar>
+          </w:tcPr>
+          <w:p>
+            <w:r>
+              <w:t xml:space="preserve">Under 40 km, same time</w:t>
+            </w:r>
+          </w:p>
+        </w:tc>
+        <w:tc>
+          <w:tcPr>
+            <w:tcW w:type="dxa" w:w="4360"/>
+            <w:tcBorders>
+              <w:top w:val="single" w:color="D5DEDD" w:sz="4"/>
+              <w:left w:val="single" w:color="D5DEDD" w:sz="4"/>
+              <w:bottom w:val="single" w:color="D5DEDD" w:sz="4"/>
+              <w:right w:val="single" w:color="D5DEDD" w:sz="4"/>
+            </w:tcBorders>
+            <w:tcMar>
+              <w:top w:type="dxa" w:w="80"/>
+              <w:left w:type="dxa" w:w="120"/>
+              <w:bottom w:type="dxa" w:w="80"/>
+              <w:right w:type="dxa" w:w="120"/>
+            </w:tcMar>
+          </w:tcPr>
+          <w:p>
+            <w:r>
+              <w:t xml:space="preserve">1% of the smaller job's cost × 50%</w:t>
             </w:r>
           </w:p>
         </w:tc>
@@ -3930,6 +4361,103 @@
       <w:pPr>
         <w:spacing w:after="60"/>
       </w:pPr>
+    </w:p>
+    <w:p>
+      <w:pPr>
+        <w:spacing w:after="40" w:before="80"/>
+        <w:jc w:val="center"/>
+      </w:pPr>
+      <w:r>
+        <w:drawing>
+          <wp:inline distT="0" distB="0" distL="0" distR="0">
+            <wp:extent cx="5943600" cy="4162425"/>
+            <wp:effectExtent t="0" r="0" b="0" l="0"/>
+            <wp:docPr id="1" name="12-assume.png" descr="Cost assumptions, at the bottom of the page. A changed number is outlined and shows its default." title="Cost assumptions, at the bottom of the page. A changed number is outlined and shows its default."/>
+            <wp:cNvGraphicFramePr>
+              <a:graphicFrameLocks xmlns:a="http://schemas.openxmlformats.org/drawingml/2006/main" noChangeAspect="1"/>
+            </wp:cNvGraphicFramePr>
+            <a:graphic xmlns:a="http://schemas.openxmlformats.org/drawingml/2006/main">
+              <a:graphicData uri="http://schemas.openxmlformats.org/drawingml/2006/picture">
+                <pic:pic xmlns:pic="http://schemas.openxmlformats.org/drawingml/2006/picture">
+                  <pic:nvPicPr>
+                    <pic:cNvPr id="0" name="" descr=""/>
+                    <pic:cNvPicPr>
+                      <a:picLocks noChangeAspect="1" noChangeArrowheads="1"/>
+                    </pic:cNvPicPr>
+                  </pic:nvPicPr>
+                  <pic:blipFill>
+                    <a:blip r:embed="rId18" cstate="none"/>
+                    <a:srcRect/>
+                    <a:stretch>
+                      <a:fillRect/>
+                    </a:stretch>
+                  </pic:blipFill>
+                  <pic:spPr bwMode="auto">
+                    <a:xfrm>
+                      <a:off x="0" y="0"/>
+                      <a:ext cx="5943600" cy="4162425"/>
+                    </a:xfrm>
+                    <a:prstGeom prst="rect">
+                      <a:avLst/>
+                    </a:prstGeom>
+                  </pic:spPr>
+                </pic:pic>
+              </a:graphicData>
+            </a:graphic>
+          </wp:inline>
+        </w:drawing>
+      </w:r>
+    </w:p>
+    <w:p>
+      <w:pPr>
+        <w:spacing w:after="200"/>
+        <w:jc w:val="center"/>
+      </w:pPr>
+      <w:r>
+        <w:rPr>
+          <w:i/>
+          <w:iCs/>
+          <w:color w:val="77878D"/>
+          <w:sz w:val="18"/>
+          <w:szCs w:val="18"/>
+        </w:rPr>
+        <w:t xml:space="preserve">Cost assumptions, at the bottom of the page. A changed number is outlined and shows its default.</w:t>
+      </w:r>
+    </w:p>
+    <w:p>
+      <w:pPr>
+        <w:spacing w:after="140"/>
+      </w:pPr>
+      <w:r>
+        <w:rPr>
+          <w:b/>
+          <w:bCs/>
+        </w:rPr>
+        <w:t xml:space="preserve">Change any number.</w:t>
+      </w:r>
+      <w:r>
+        <w:t xml:space="preserve"> Every unit cost above is in the </w:t>
+      </w:r>
+      <w:r>
+        <w:rPr>
+          <w:b/>
+          <w:bCs/>
+        </w:rPr>
+        <w:t xml:space="preserve">Cost assumptions</w:t>
+      </w:r>
+      <w:r>
+        <w:t xml:space="preserve"> table at the bottom of the page. Type a new value and every pair, the total and the brief update at once. Your numbers are remembered on that device, and </w:t>
+      </w:r>
+      <w:r>
+        <w:rPr>
+          <w:b/>
+          <w:bCs/>
+        </w:rPr>
+        <w:t xml:space="preserve">Reset to defaults</w:t>
+      </w:r>
+      <w:r>
+        <w:t xml:space="preserve"> puts them back. To check them, compare with USDA NASS Land Values for land, the MISO Transmission Cost Estimation Guide for line, road and yard costs, and local crane rental and trucking rates.</w:t>
+      </w:r>
     </w:p>
     <w:p>
       <w:pPr>
@@ -4035,7 +4563,7 @@
         <w:spacing w:after="80"/>
       </w:pPr>
       <w:r>
-        <w:t xml:space="preserve">Open the app. Point at the four numbers: 2,106 pairs checked, 20 close, 9 at the same time, about $3.2M.</w:t>
+        <w:t xml:space="preserve">Open the app. Point at the four numbers: 2,106 pairs checked, 20 close, 9 at the same time, about $4.0M.</w:t>
       </w:r>
     </w:p>
     <w:p>

</xml_diff>

<commit_message>
Make Auto the default 3D quality and draw shadows once
Auto builds the High scene but renders it like Standard while the
camera moves, then sharpens to High once it rests, so orbiting holds
60 fps. The shadow map is drawn once since nothing that casts a shadow
moves. Guide: Shared yards section and the Quality menu.
</commit_message>
<xml_diff>
--- a/docs/Seamline-Field-Guide.docx
+++ b/docs/Seamline-Field-Guide.docx
@@ -341,6 +341,27 @@
           <w:szCs w:val="20"/>
         </w:rPr>
         <w:t xml:space="preserve">12   </w:t>
+      </w:r>
+      <w:r>
+        <w:rPr>
+          <w:sz w:val="23"/>
+          <w:szCs w:val="23"/>
+        </w:rPr>
+        <w:t xml:space="preserve">Shared yards</w:t>
+      </w:r>
+    </w:p>
+    <w:p>
+      <w:pPr>
+        <w:spacing w:after="90"/>
+      </w:pPr>
+      <w:r>
+        <w:rPr>
+          <w:rFonts w:ascii="Consolas" w:cs="Consolas" w:eastAsia="Consolas" w:hAnsi="Consolas"/>
+          <w:color w:val="9A6B2F"/>
+          <w:sz w:val="20"/>
+          <w:szCs w:val="20"/>
+        </w:rPr>
+        <w:t xml:space="preserve">13   </w:t>
       </w:r>
       <w:r>
         <w:rPr>
@@ -784,7 +805,7 @@
       <w:r>
         <w:drawing>
           <wp:inline distT="0" distB="0" distL="0" distR="0">
-            <wp:extent cx="5943600" cy="1657350"/>
+            <wp:extent cx="5943600" cy="1666875"/>
             <wp:effectExtent t="0" r="0" b="0" l="0"/>
             <wp:docPr id="1" name="1-top.png" descr="The header, and the bar where you choose what to compare." title="The header, and the bar where you choose what to compare."/>
             <wp:cNvGraphicFramePr>
@@ -809,7 +830,7 @@
                   <pic:spPr bwMode="auto">
                     <a:xfrm>
                       <a:off x="0" y="0"/>
-                      <a:ext cx="5943600" cy="1657350"/>
+                      <a:ext cx="5943600" cy="1666875"/>
                     </a:xfrm>
                     <a:prstGeom prst="rect">
                       <a:avLst/>
@@ -2494,7 +2515,7 @@
       <w:r>
         <w:drawing>
           <wp:inline distT="0" distB="0" distL="0" distR="0">
-            <wp:extent cx="4000500" cy="3124200"/>
+            <wp:extent cx="4000500" cy="3105150"/>
             <wp:effectExtent t="0" r="0" b="0" l="0"/>
             <wp:docPr id="1" name="4-list.png" descr="Best opportunities first." title="Best opportunities first."/>
             <wp:cNvGraphicFramePr>
@@ -2519,7 +2540,7 @@
                   <pic:spPr bwMode="auto">
                     <a:xfrm>
                       <a:off x="0" y="0"/>
-                      <a:ext cx="4000500" cy="3124200"/>
+                      <a:ext cx="4000500" cy="3105150"/>
                     </a:xfrm>
                     <a:prstGeom prst="rect">
                       <a:avLst/>
@@ -2710,7 +2731,7 @@
       <w:r>
         <w:drawing>
           <wp:inline distT="0" distB="0" distL="0" distR="0">
-            <wp:extent cx="2809875" cy="7239000"/>
+            <wp:extent cx="2552700" cy="7239000"/>
             <wp:effectExtent t="0" r="0" b="0" l="0"/>
             <wp:docPr id="1" name="5-detail.png" descr="A pair's details after pressing the suggested move." title="A pair's details after pressing the suggested move."/>
             <wp:cNvGraphicFramePr>
@@ -2735,7 +2756,7 @@
                   <pic:spPr bwMode="auto">
                     <a:xfrm>
                       <a:off x="0" y="0"/>
-                      <a:ext cx="2809875" cy="7239000"/>
+                      <a:ext cx="2552700" cy="7239000"/>
                     </a:xfrm>
                     <a:prstGeom prst="rect">
                       <a:avLst/>
@@ -3005,7 +3026,7 @@
       <w:r>
         <w:drawing>
           <wp:inline distT="0" distB="0" distL="0" distR="0">
-            <wp:extent cx="4381500" cy="5943600"/>
+            <wp:extent cx="4381500" cy="6372225"/>
             <wp:effectExtent t="0" r="0" b="0" l="0"/>
             <wp:docPr id="1" name="7-brief.png" descr="One page per pair, addressed to both companies." title="One page per pair, addressed to both companies."/>
             <wp:cNvGraphicFramePr>
@@ -3030,7 +3051,7 @@
                   <pic:spPr bwMode="auto">
                     <a:xfrm>
                       <a:off x="0" y="0"/>
-                      <a:ext cx="4381500" cy="5943600"/>
+                      <a:ext cx="4381500" cy="6372225"/>
                     </a:xfrm>
                     <a:prstGeom prst="rect">
                       <a:avLst/>
@@ -3251,6 +3272,61 @@
     </w:p>
     <w:p>
       <w:pPr>
+        <w:spacing w:after="140"/>
+      </w:pPr>
+      <w:r>
+        <w:rPr>
+          <w:b/>
+          <w:bCs/>
+        </w:rPr>
+        <w:t xml:space="preserve">Quality</w:t>
+      </w:r>
+      <w:r>
+        <w:t xml:space="preserve"> sets how sharp the scene is. </w:t>
+      </w:r>
+      <w:r>
+        <w:rPr>
+          <w:b/>
+          <w:bCs/>
+        </w:rPr>
+        <w:t xml:space="preserve">Auto</w:t>
+      </w:r>
+      <w:r>
+        <w:t xml:space="preserve">, the default, draws a lighter picture while you drag so it stays smooth, then sharpens a moment after you let go. </w:t>
+      </w:r>
+      <w:r>
+        <w:rPr>
+          <w:b/>
+          <w:bCs/>
+        </w:rPr>
+        <w:t xml:space="preserve">Standard</w:t>
+      </w:r>
+      <w:r>
+        <w:t xml:space="preserve"> is the light look all the time, for slower computers; </w:t>
+      </w:r>
+      <w:r>
+        <w:rPr>
+          <w:b/>
+          <w:bCs/>
+        </w:rPr>
+        <w:t xml:space="preserve">High</w:t>
+      </w:r>
+      <w:r>
+        <w:t xml:space="preserve"> and </w:t>
+      </w:r>
+      <w:r>
+        <w:rPr>
+          <w:b/>
+          <w:bCs/>
+        </w:rPr>
+        <w:t xml:space="preserve">Ultra</w:t>
+      </w:r>
+      <w:r>
+        <w:t xml:space="preserve"> stay sharp all the time, with soft shading where towers and trees meet the ground.</w:t>
+      </w:r>
+    </w:p>
+    <w:p>
+      <w:pPr>
         <w:keepNext/>
         <w:pageBreakBefore/>
         <w:spacing w:after="40" w:before="120"/>
@@ -4370,7 +4446,7 @@
       <w:r>
         <w:drawing>
           <wp:inline distT="0" distB="0" distL="0" distR="0">
-            <wp:extent cx="5943600" cy="4162425"/>
+            <wp:extent cx="5943600" cy="5324475"/>
             <wp:effectExtent t="0" r="0" b="0" l="0"/>
             <wp:docPr id="1" name="12-assume.png" descr="Cost assumptions, at the bottom of the page. A changed number is outlined and shows its default." title="Cost assumptions, at the bottom of the page. A changed number is outlined and shows its default."/>
             <wp:cNvGraphicFramePr>
@@ -4395,7 +4471,7 @@
                   <pic:spPr bwMode="auto">
                     <a:xfrm>
                       <a:off x="0" y="0"/>
-                      <a:ext cx="5943600" cy="4162425"/>
+                      <a:ext cx="5943600" cy="5324475"/>
                     </a:xfrm>
                     <a:prstGeom prst="rect">
                       <a:avLst/>
@@ -4542,7 +4618,215 @@
           <w:sz w:val="17"/>
           <w:szCs w:val="17"/>
         </w:rPr>
-        <w:t xml:space="preserve">12 · FOR THE JUDGES</w:t>
+        <w:t xml:space="preserve">12 · ONE YARD FOR MANY JOBS</w:t>
+      </w:r>
+    </w:p>
+    <w:p>
+      <w:pPr>
+        <w:pStyle w:val="Heading1"/>
+      </w:pPr>
+      <w:r>
+        <w:t xml:space="preserve">Shared yards</w:t>
+      </w:r>
+    </w:p>
+    <w:p>
+      <w:pPr>
+        <w:spacing w:after="40" w:before="80"/>
+        <w:jc w:val="center"/>
+      </w:pPr>
+      <w:r>
+        <w:drawing>
+          <wp:inline distT="0" distB="0" distL="0" distR="0">
+            <wp:extent cx="3619500" cy="6686550"/>
+            <wp:effectExtent t="0" r="0" b="0" l="0"/>
+            <wp:docPr id="1" name="13-yard.png" descr="The 8-project group around Augusta." title="The 8-project group around Augusta."/>
+            <wp:cNvGraphicFramePr>
+              <a:graphicFrameLocks xmlns:a="http://schemas.openxmlformats.org/drawingml/2006/main" noChangeAspect="1"/>
+            </wp:cNvGraphicFramePr>
+            <a:graphic xmlns:a="http://schemas.openxmlformats.org/drawingml/2006/main">
+              <a:graphicData uri="http://schemas.openxmlformats.org/drawingml/2006/picture">
+                <pic:pic xmlns:pic="http://schemas.openxmlformats.org/drawingml/2006/picture">
+                  <pic:nvPicPr>
+                    <pic:cNvPr id="0" name="" descr=""/>
+                    <pic:cNvPicPr>
+                      <a:picLocks noChangeAspect="1" noChangeArrowheads="1"/>
+                    </pic:cNvPicPr>
+                  </pic:nvPicPr>
+                  <pic:blipFill>
+                    <a:blip r:embed="rId19" cstate="none"/>
+                    <a:srcRect/>
+                    <a:stretch>
+                      <a:fillRect/>
+                    </a:stretch>
+                  </pic:blipFill>
+                  <pic:spPr bwMode="auto">
+                    <a:xfrm>
+                      <a:off x="0" y="0"/>
+                      <a:ext cx="3619500" cy="6686550"/>
+                    </a:xfrm>
+                    <a:prstGeom prst="rect">
+                      <a:avLst/>
+                    </a:prstGeom>
+                  </pic:spPr>
+                </pic:pic>
+              </a:graphicData>
+            </a:graphic>
+          </wp:inline>
+        </w:drawing>
+      </w:r>
+    </w:p>
+    <w:p>
+      <w:pPr>
+        <w:spacing w:after="200"/>
+        <w:jc w:val="center"/>
+      </w:pPr>
+      <w:r>
+        <w:rPr>
+          <w:i/>
+          <w:iCs/>
+          <w:color w:val="77878D"/>
+          <w:sz w:val="18"/>
+          <w:szCs w:val="18"/>
+        </w:rPr>
+        <w:t xml:space="preserve">The 8-project group around Augusta.</w:t>
+      </w:r>
+    </w:p>
+    <w:p>
+      <w:pPr>
+        <w:spacing w:after="140"/>
+      </w:pPr>
+      <w:r>
+        <w:t xml:space="preserve">A staging yard is where a job keeps its materials, trucks and equipment. Crews drive from it to the work every day, so it only works for sites within about 40 km. Seamline looks for the one best spot for a shared yard: the point with the least total driving to every work site. If an existing substation or power plant is almost as good, it picks that instead, because those already have road access and fenced land.</w:t>
+      </w:r>
+    </w:p>
+    <w:p>
+      <w:pPr>
+        <w:spacing w:after="140"/>
+      </w:pPr>
+      <w:r>
+        <w:rPr>
+          <w:b/>
+          <w:bCs/>
+        </w:rPr>
+        <w:t xml:space="preserve">Shared yards</w:t>
+      </w:r>
+      <w:r>
+        <w:t xml:space="preserve"> at the top of the list shows groups of 3 or more projects, from both companies, that are built at the same time and could all use one yard. Click one to see the yard, how far each site is from it, and what it saves on the road: truck-miles, driver-hours and tons of CO2, using the EPA's figure for diesel. Heavy loads for every extra project can ride shared trips to one yard; the extra driving from the yard to each site is subtracted.</w:t>
+      </w:r>
+    </w:p>
+    <w:p>
+      <w:pPr>
+        <w:spacing w:after="140"/>
+      </w:pPr>
+      <w:r>
+        <w:t xml:space="preserve">The biggest group is 8 projects around Augusta. Its best yard is at </w:t>
+      </w:r>
+      <w:r>
+        <w:rPr>
+          <w:b/>
+          <w:bCs/>
+        </w:rPr>
+        <w:t xml:space="preserve">Stevens Creek Hydro</w:t>
+      </w:r>
+      <w:r>
+        <w:t xml:space="preserve">, DESC's own plant in Georgia, with every site within 35 km. That saves about 6,250 truck-miles, 139 driver-hours and 10.6 t of CO2, plus 7 yards that don't need building.</w:t>
+      </w:r>
+    </w:p>
+    <w:p>
+      <w:pPr>
+        <w:spacing w:after="40" w:before="80"/>
+        <w:jc w:val="center"/>
+      </w:pPr>
+      <w:r>
+        <w:drawing>
+          <wp:inline distT="0" distB="0" distL="0" distR="0">
+            <wp:extent cx="4381500" cy="4333875"/>
+            <wp:effectExtent t="0" r="0" b="0" l="0"/>
+            <wp:docPr id="1" name="13b-yard-map.png" descr="The square is the yard. The dashed circle is a 40 km day's drive, and a dotted line runs to each site." title="The square is the yard. The dashed circle is a 40 km day's drive, and a dotted line runs to each site."/>
+            <wp:cNvGraphicFramePr>
+              <a:graphicFrameLocks xmlns:a="http://schemas.openxmlformats.org/drawingml/2006/main" noChangeAspect="1"/>
+            </wp:cNvGraphicFramePr>
+            <a:graphic xmlns:a="http://schemas.openxmlformats.org/drawingml/2006/main">
+              <a:graphicData uri="http://schemas.openxmlformats.org/drawingml/2006/picture">
+                <pic:pic xmlns:pic="http://schemas.openxmlformats.org/drawingml/2006/picture">
+                  <pic:nvPicPr>
+                    <pic:cNvPr id="0" name="" descr=""/>
+                    <pic:cNvPicPr>
+                      <a:picLocks noChangeAspect="1" noChangeArrowheads="1"/>
+                    </pic:cNvPicPr>
+                  </pic:nvPicPr>
+                  <pic:blipFill>
+                    <a:blip r:embed="rId20" cstate="none"/>
+                    <a:srcRect/>
+                    <a:stretch>
+                      <a:fillRect/>
+                    </a:stretch>
+                  </pic:blipFill>
+                  <pic:spPr bwMode="auto">
+                    <a:xfrm>
+                      <a:off x="0" y="0"/>
+                      <a:ext cx="4381500" cy="4333875"/>
+                    </a:xfrm>
+                    <a:prstGeom prst="rect">
+                      <a:avLst/>
+                    </a:prstGeom>
+                  </pic:spPr>
+                </pic:pic>
+              </a:graphicData>
+            </a:graphic>
+          </wp:inline>
+        </w:drawing>
+      </w:r>
+    </w:p>
+    <w:p>
+      <w:pPr>
+        <w:spacing w:after="200"/>
+        <w:jc w:val="center"/>
+      </w:pPr>
+      <w:r>
+        <w:rPr>
+          <w:i/>
+          <w:iCs/>
+          <w:color w:val="77878D"/>
+          <w:sz w:val="18"/>
+          <w:szCs w:val="18"/>
+        </w:rPr>
+        <w:t xml:space="preserve">The square is the yard. The dashed circle is a 40 km day's drive, and a dotted line runs to each site.</w:t>
+      </w:r>
+    </w:p>
+    <w:p>
+      <w:pPr>
+        <w:spacing w:after="140"/>
+      </w:pPr>
+      <w:r>
+        <w:t xml:space="preserve">Each pair's details and its brief also name the pair's own best yard. The numbers behind all of this are under </w:t>
+      </w:r>
+      <w:r>
+        <w:rPr>
+          <w:b/>
+          <w:bCs/>
+        </w:rPr>
+        <w:t xml:space="preserve">Cost assumptions</w:t>
+      </w:r>
+      <w:r>
+        <w:t xml:space="preserve">.</w:t>
+      </w:r>
+    </w:p>
+    <w:p>
+      <w:pPr>
+        <w:keepNext/>
+        <w:pageBreakBefore/>
+        <w:spacing w:after="40" w:before="120"/>
+      </w:pPr>
+      <w:r>
+        <w:rPr>
+          <w:rFonts w:ascii="Consolas" w:cs="Consolas" w:eastAsia="Consolas" w:hAnsi="Consolas"/>
+          <w:color w:val="9A6B2F"/>
+          <w:spacing w:val="30"/>
+          <w:sz w:val="17"/>
+          <w:szCs w:val="17"/>
+        </w:rPr>
+        <w:t xml:space="preserve">13 · FOR THE JUDGES</w:t>
       </w:r>
     </w:p>
     <w:p>
@@ -4682,6 +4966,29 @@
       </w:r>
       <w:r>
         <w:t xml:space="preserve">: this is the page you'd send to both companies.</w:t>
+      </w:r>
+    </w:p>
+    <w:p>
+      <w:pPr>
+        <w:pStyle w:val="ListParagraph"/>
+        <w:numPr>
+          <w:ilvl w:val="0"/>
+          <w:numId w:val="3"/>
+        </w:numPr>
+        <w:spacing w:after="80"/>
+      </w:pPr>
+      <w:r>
+        <w:t xml:space="preserve">Click the 8-project group under </w:t>
+      </w:r>
+      <w:r>
+        <w:rPr>
+          <w:b/>
+          <w:bCs/>
+        </w:rPr>
+        <w:t xml:space="preserve">Shared yards</w:t>
+      </w:r>
+      <w:r>
+        <w:t xml:space="preserve">: one yard at Stevens Creek Hydro serves them all.</w:t>
       </w:r>
     </w:p>
     <w:p>

</xml_diff>

<commit_message>
Make High the default 3D quality again, with Standard and Ultra as options
Removes Auto; keeps drawing the shadow map once.
</commit_message>
<xml_diff>
--- a/docs/Seamline-Field-Guide.docx
+++ b/docs/Seamline-Field-Guide.docx
@@ -3289,40 +3289,30 @@
           <w:b/>
           <w:bCs/>
         </w:rPr>
-        <w:t xml:space="preserve">Auto</w:t>
-      </w:r>
-      <w:r>
-        <w:t xml:space="preserve">, the default, draws a lighter picture while you drag so it stays smooth, then sharpens a moment after you let go. </w:t>
+        <w:t xml:space="preserve">High</w:t>
+      </w:r>
+      <w:r>
+        <w:t xml:space="preserve">, the default, is sharp with soft shading where towers and trees meet the ground. </w:t>
       </w:r>
       <w:r>
         <w:rPr>
           <w:b/>
           <w:bCs/>
         </w:rPr>
-        <w:t xml:space="preserve">Standard</w:t>
-      </w:r>
-      <w:r>
-        <w:t xml:space="preserve"> is the light look all the time, for slower computers; </w:t>
+        <w:t xml:space="preserve">Ultra</w:t>
+      </w:r>
+      <w:r>
+        <w:t xml:space="preserve"> renders at your screen's full resolution for the crispest picture on a fast computer, and </w:t>
       </w:r>
       <w:r>
         <w:rPr>
           <w:b/>
           <w:bCs/>
         </w:rPr>
-        <w:t xml:space="preserve">High</w:t>
-      </w:r>
-      <w:r>
-        <w:t xml:space="preserve"> and </w:t>
-      </w:r>
-      <w:r>
-        <w:rPr>
-          <w:b/>
-          <w:bCs/>
-        </w:rPr>
-        <w:t xml:space="preserve">Ultra</w:t>
-      </w:r>
-      <w:r>
-        <w:t xml:space="preserve"> stay sharp all the time, with soft shading where towers and trees meet the ground.</w:t>
+        <w:t xml:space="preserve">Standard</w:t>
+      </w:r>
+      <w:r>
+        <w:t xml:space="preserve"> is a lighter look for slower ones.</w:t>
       </w:r>
     </w:p>
     <w:p>

</xml_diff>

<commit_message>
Rewrite the Field Guide for the current app: rail layout, headline numbers, plan changes, optimizer, checks, briefs, Ask without a key, 3D illustration, current screenshots
Co-Authored-By: Claude Opus 5.5 (1M context) <noreply@anthropic.com>
</commit_message>
<xml_diff>
--- a/docs/Seamline-Field-Guide.docx
+++ b/docs/Seamline-Field-Guide.docx
@@ -45,7 +45,7 @@
           <w:sz w:val="24"/>
           <w:szCs w:val="24"/>
         </w:rPr>
-        <w:t xml:space="preserve">Power companies plan new lines and substations years before they build them. When two neighboring companies are building near each other at the same time, they can share crews, land, equipment and power shutoffs, and both save money. Seamline finds those spots. This guide walks through every part of the screen.</w:t>
+        <w:t xml:space="preserve">Power companies plan new lines and substations years before they build them. When two neighboring companies are building near each other at the same time, they can share crews, land, equipment and power shutoffs, and both save money. Seamline finds those spots, says how likely each one is to really happen, and which few date changes would save the most. This guide walks through every part of the screen.</w:t>
       </w:r>
     </w:p>
     <w:p>
@@ -79,7 +79,7 @@
     </w:p>
     <w:p>
       <w:pPr>
-        <w:spacing w:after="90"/>
+        <w:spacing w:after="70"/>
       </w:pPr>
       <w:r>
         <w:rPr>
@@ -100,7 +100,7 @@
     </w:p>
     <w:p>
       <w:pPr>
-        <w:spacing w:after="90"/>
+        <w:spacing w:after="70"/>
       </w:pPr>
       <w:r>
         <w:rPr>
@@ -116,12 +116,12 @@
           <w:sz w:val="23"/>
           <w:szCs w:val="23"/>
         </w:rPr>
-        <w:t xml:space="preserve">Choosing who to compare</w:t>
-      </w:r>
-    </w:p>
-    <w:p>
-      <w:pPr>
-        <w:spacing w:after="90"/>
+        <w:t xml:space="preserve">The screen at a glance</w:t>
+      </w:r>
+    </w:p>
+    <w:p>
+      <w:pPr>
+        <w:spacing w:after="70"/>
       </w:pPr>
       <w:r>
         <w:rPr>
@@ -137,12 +137,12 @@
           <w:sz w:val="23"/>
           <w:szCs w:val="23"/>
         </w:rPr>
-        <w:t xml:space="preserve">The four numbers and the four tiers</w:t>
-      </w:r>
-    </w:p>
-    <w:p>
-      <w:pPr>
-        <w:spacing w:after="90"/>
+        <w:t xml:space="preserve">The headline numbers and the four tiers</w:t>
+      </w:r>
+    </w:p>
+    <w:p>
+      <w:pPr>
+        <w:spacing w:after="70"/>
       </w:pPr>
       <w:r>
         <w:rPr>
@@ -163,7 +163,7 @@
     </w:p>
     <w:p>
       <w:pPr>
-        <w:spacing w:after="90"/>
+        <w:spacing w:after="70"/>
       </w:pPr>
       <w:r>
         <w:rPr>
@@ -184,7 +184,7 @@
     </w:p>
     <w:p>
       <w:pPr>
-        <w:spacing w:after="90"/>
+        <w:spacing w:after="70"/>
       </w:pPr>
       <w:r>
         <w:rPr>
@@ -205,7 +205,7 @@
     </w:p>
     <w:p>
       <w:pPr>
-        <w:spacing w:after="90"/>
+        <w:spacing w:after="70"/>
       </w:pPr>
       <w:r>
         <w:rPr>
@@ -221,12 +221,12 @@
           <w:sz w:val="23"/>
           <w:szCs w:val="23"/>
         </w:rPr>
-        <w:t xml:space="preserve">The construction timeline</w:t>
-      </w:r>
-    </w:p>
-    <w:p>
-      <w:pPr>
-        <w:spacing w:after="90"/>
+        <w:t xml:space="preserve">How plans change</w:t>
+      </w:r>
+    </w:p>
+    <w:p>
+      <w:pPr>
+        <w:spacing w:after="70"/>
       </w:pPr>
       <w:r>
         <w:rPr>
@@ -242,12 +242,12 @@
           <w:sz w:val="23"/>
           <w:szCs w:val="23"/>
         </w:rPr>
-        <w:t xml:space="preserve">The coordination brief</w:t>
-      </w:r>
-    </w:p>
-    <w:p>
-      <w:pPr>
-        <w:spacing w:after="90"/>
+        <w:t xml:space="preserve">The schedule optimizer</w:t>
+      </w:r>
+    </w:p>
+    <w:p>
+      <w:pPr>
+        <w:spacing w:after="70"/>
       </w:pPr>
       <w:r>
         <w:rPr>
@@ -263,12 +263,12 @@
           <w:sz w:val="23"/>
           <w:szCs w:val="23"/>
         </w:rPr>
-        <w:t xml:space="preserve">The 3D view</w:t>
-      </w:r>
-    </w:p>
-    <w:p>
-      <w:pPr>
-        <w:spacing w:after="90"/>
+        <w:t xml:space="preserve">The build-windows chart</w:t>
+      </w:r>
+    </w:p>
+    <w:p>
+      <w:pPr>
+        <w:spacing w:after="70"/>
       </w:pPr>
       <w:r>
         <w:rPr>
@@ -284,12 +284,12 @@
           <w:sz w:val="23"/>
           <w:szCs w:val="23"/>
         </w:rPr>
-        <w:t xml:space="preserve">Adding another company's plans</w:t>
-      </w:r>
-    </w:p>
-    <w:p>
-      <w:pPr>
-        <w:spacing w:after="90"/>
+        <w:t xml:space="preserve">Data checks</w:t>
+      </w:r>
+    </w:p>
+    <w:p>
+      <w:pPr>
+        <w:spacing w:after="70"/>
       </w:pPr>
       <w:r>
         <w:rPr>
@@ -305,12 +305,12 @@
           <w:sz w:val="23"/>
           <w:szCs w:val="23"/>
         </w:rPr>
-        <w:t xml:space="preserve">Looking at one company</w:t>
-      </w:r>
-    </w:p>
-    <w:p>
-      <w:pPr>
-        <w:spacing w:after="90"/>
+        <w:t xml:space="preserve">Briefs, proposals and reports</w:t>
+      </w:r>
+    </w:p>
+    <w:p>
+      <w:pPr>
+        <w:spacing w:after="70"/>
       </w:pPr>
       <w:r>
         <w:rPr>
@@ -326,12 +326,12 @@
           <w:sz w:val="23"/>
           <w:szCs w:val="23"/>
         </w:rPr>
-        <w:t xml:space="preserve">How savings are estimated</w:t>
-      </w:r>
-    </w:p>
-    <w:p>
-      <w:pPr>
-        <w:spacing w:after="90"/>
+        <w:t xml:space="preserve">Asking questions</w:t>
+      </w:r>
+    </w:p>
+    <w:p>
+      <w:pPr>
+        <w:spacing w:after="70"/>
       </w:pPr>
       <w:r>
         <w:rPr>
@@ -347,12 +347,12 @@
           <w:sz w:val="23"/>
           <w:szCs w:val="23"/>
         </w:rPr>
-        <w:t xml:space="preserve">Shared yards</w:t>
-      </w:r>
-    </w:p>
-    <w:p>
-      <w:pPr>
-        <w:spacing w:after="90"/>
+        <w:t xml:space="preserve">The 3D illustration</w:t>
+      </w:r>
+    </w:p>
+    <w:p>
+      <w:pPr>
+        <w:spacing w:after="70"/>
       </w:pPr>
       <w:r>
         <w:rPr>
@@ -362,6 +362,90 @@
           <w:szCs w:val="20"/>
         </w:rPr>
         <w:t xml:space="preserve">13   </w:t>
+      </w:r>
+      <w:r>
+        <w:rPr>
+          <w:sz w:val="23"/>
+          <w:szCs w:val="23"/>
+        </w:rPr>
+        <w:t xml:space="preserve">Adding another company's plans</w:t>
+      </w:r>
+    </w:p>
+    <w:p>
+      <w:pPr>
+        <w:spacing w:after="70"/>
+      </w:pPr>
+      <w:r>
+        <w:rPr>
+          <w:rFonts w:ascii="Consolas" w:cs="Consolas" w:eastAsia="Consolas" w:hAnsi="Consolas"/>
+          <w:color w:val="9A6B2F"/>
+          <w:sz w:val="20"/>
+          <w:szCs w:val="20"/>
+        </w:rPr>
+        <w:t xml:space="preserve">14   </w:t>
+      </w:r>
+      <w:r>
+        <w:rPr>
+          <w:sz w:val="23"/>
+          <w:szCs w:val="23"/>
+        </w:rPr>
+        <w:t xml:space="preserve">Looking at one company</w:t>
+      </w:r>
+    </w:p>
+    <w:p>
+      <w:pPr>
+        <w:spacing w:after="70"/>
+      </w:pPr>
+      <w:r>
+        <w:rPr>
+          <w:rFonts w:ascii="Consolas" w:cs="Consolas" w:eastAsia="Consolas" w:hAnsi="Consolas"/>
+          <w:color w:val="9A6B2F"/>
+          <w:sz w:val="20"/>
+          <w:szCs w:val="20"/>
+        </w:rPr>
+        <w:t xml:space="preserve">15   </w:t>
+      </w:r>
+      <w:r>
+        <w:rPr>
+          <w:sz w:val="23"/>
+          <w:szCs w:val="23"/>
+        </w:rPr>
+        <w:t xml:space="preserve">How savings are estimated</w:t>
+      </w:r>
+    </w:p>
+    <w:p>
+      <w:pPr>
+        <w:spacing w:after="70"/>
+      </w:pPr>
+      <w:r>
+        <w:rPr>
+          <w:rFonts w:ascii="Consolas" w:cs="Consolas" w:eastAsia="Consolas" w:hAnsi="Consolas"/>
+          <w:color w:val="9A6B2F"/>
+          <w:sz w:val="20"/>
+          <w:szCs w:val="20"/>
+        </w:rPr>
+        <w:t xml:space="preserve">16   </w:t>
+      </w:r>
+      <w:r>
+        <w:rPr>
+          <w:sz w:val="23"/>
+          <w:szCs w:val="23"/>
+        </w:rPr>
+        <w:t xml:space="preserve">Shared yards</w:t>
+      </w:r>
+    </w:p>
+    <w:p>
+      <w:pPr>
+        <w:spacing w:after="70"/>
+      </w:pPr>
+      <w:r>
+        <w:rPr>
+          <w:rFonts w:ascii="Consolas" w:cs="Consolas" w:eastAsia="Consolas" w:hAnsi="Consolas"/>
+          <w:color w:val="9A6B2F"/>
+          <w:sz w:val="20"/>
+          <w:szCs w:val="20"/>
+        </w:rPr>
+        <w:t xml:space="preserve">17   </w:t>
       </w:r>
       <w:r>
         <w:rPr>
@@ -511,7 +595,7 @@
           </w:tcPr>
           <w:p>
             <w:r>
-              <w:t xml:space="preserve">A power company. Here, Dominion Energy SC on one side and Georgia Power (planning together with Georgia Transmission and MEAG) on the other.</w:t>
+              <w:t xml:space="preserve">A power company. Here, Dominion Energy SC (DESC) on one side and Georgia on the other: Georgia Power, Georgia Transmission and MEAG, which plan together and show up in the app as Georgia ITS.</w:t>
             </w:r>
           </w:p>
         </w:tc>
@@ -715,7 +799,7 @@
           </w:tcPr>
           <w:p>
             <w:r>
-              <w:t xml:space="preserve">The stretch of time a project is under construction, from start to in-service. Plans rarely list the start, so Seamline estimates it from the type and size of the job.</w:t>
+              <w:t xml:space="preserve">The stretch of time a project is under construction, from start to in-service. Georgia's detail pages often publish the start; when a plan doesn't, Seamline estimates it from the type and size of the job.</w:t>
             </w:r>
           </w:p>
         </w:tc>
@@ -766,7 +850,109 @@
           </w:tcPr>
           <w:p>
             <w:r>
-              <w:t xml:space="preserve">One project from each company. Seamline checks every possible pair: 54 × 39 = 2,106 of them in the example.</w:t>
+              <w:t xml:space="preserve">One project from each company. Seamline checks every possible pair: 64 × 161 = 10,304 of them in the built-in example.</w:t>
+            </w:r>
+          </w:p>
+        </w:tc>
+      </w:tr>
+      <w:tr>
+        <w:tc>
+          <w:tcPr>
+            <w:tcW w:type="dxa" w:w="2600"/>
+            <w:tcBorders>
+              <w:top w:val="single" w:color="D5DEDD" w:sz="4"/>
+              <w:left w:val="single" w:color="D5DEDD" w:sz="4"/>
+              <w:bottom w:val="single" w:color="D5DEDD" w:sz="4"/>
+              <w:right w:val="single" w:color="D5DEDD" w:sz="4"/>
+            </w:tcBorders>
+            <w:shd w:fill="F4F7F6" w:color="auto" w:val="clear"/>
+            <w:tcMar>
+              <w:top w:type="dxa" w:w="90"/>
+              <w:left w:type="dxa" w:w="120"/>
+              <w:bottom w:type="dxa" w:w="90"/>
+              <w:right w:type="dxa" w:w="120"/>
+            </w:tcMar>
+          </w:tcPr>
+          <w:p>
+            <w:r>
+              <w:rPr>
+                <w:b/>
+                <w:bCs/>
+              </w:rPr>
+              <w:t xml:space="preserve">Chance</w:t>
+            </w:r>
+          </w:p>
+        </w:tc>
+        <w:tc>
+          <w:tcPr>
+            <w:tcW w:type="dxa" w:w="6760"/>
+            <w:tcBorders>
+              <w:top w:val="single" w:color="D5DEDD" w:sz="4"/>
+              <w:left w:val="single" w:color="D5DEDD" w:sz="4"/>
+              <w:bottom w:val="single" w:color="D5DEDD" w:sz="4"/>
+              <w:right w:val="single" w:color="D5DEDD" w:sz="4"/>
+            </w:tcBorders>
+            <w:tcMar>
+              <w:top w:type="dxa" w:w="90"/>
+              <w:left w:type="dxa" w:w="120"/>
+              <w:bottom w:type="dxa" w:w="90"/>
+              <w:right w:type="dxa" w:w="120"/>
+            </w:tcMar>
+          </w:tcPr>
+          <w:p>
+            <w:r>
+              <w:t xml:space="preserve">How likely it is that both crews are really in the field at the same time, from today on, given how much each company's dates have moved before.</w:t>
+            </w:r>
+          </w:p>
+        </w:tc>
+      </w:tr>
+      <w:tr>
+        <w:tc>
+          <w:tcPr>
+            <w:tcW w:type="dxa" w:w="2600"/>
+            <w:tcBorders>
+              <w:top w:val="single" w:color="D5DEDD" w:sz="4"/>
+              <w:left w:val="single" w:color="D5DEDD" w:sz="4"/>
+              <w:bottom w:val="single" w:color="D5DEDD" w:sz="4"/>
+              <w:right w:val="single" w:color="D5DEDD" w:sz="4"/>
+            </w:tcBorders>
+            <w:shd w:fill="F4F7F6" w:color="auto" w:val="clear"/>
+            <w:tcMar>
+              <w:top w:type="dxa" w:w="90"/>
+              <w:left w:type="dxa" w:w="120"/>
+              <w:bottom w:type="dxa" w:w="90"/>
+              <w:right w:type="dxa" w:w="120"/>
+            </w:tcMar>
+          </w:tcPr>
+          <w:p>
+            <w:r>
+              <w:rPr>
+                <w:b/>
+                <w:bCs/>
+              </w:rPr>
+              <w:t xml:space="preserve">Expected savings</w:t>
+            </w:r>
+          </w:p>
+        </w:tc>
+        <w:tc>
+          <w:tcPr>
+            <w:tcW w:type="dxa" w:w="6760"/>
+            <w:tcBorders>
+              <w:top w:val="single" w:color="D5DEDD" w:sz="4"/>
+              <w:left w:val="single" w:color="D5DEDD" w:sz="4"/>
+              <w:bottom w:val="single" w:color="D5DEDD" w:sz="4"/>
+              <w:right w:val="single" w:color="D5DEDD" w:sz="4"/>
+            </w:tcBorders>
+            <w:tcMar>
+              <w:top w:type="dxa" w:w="90"/>
+              <w:left w:type="dxa" w:w="120"/>
+              <w:bottom w:type="dxa" w:w="90"/>
+              <w:right w:type="dxa" w:w="120"/>
+            </w:tcMar>
+          </w:tcPr>
+          <w:p>
+            <w:r>
+              <w:t xml:space="preserve">What a pair would save, with the timing-dependent items counted only by that chance. The list is ranked by it.</w:t>
             </w:r>
           </w:p>
         </w:tc>
@@ -774,8 +960,35 @@
     </w:tbl>
     <w:p>
       <w:pPr>
+        <w:spacing w:after="60"/>
+      </w:pPr>
+    </w:p>
+    <w:p>
+      <w:pPr>
+        <w:spacing w:after="140"/>
+      </w:pPr>
+      <w:r>
+        <w:t xml:space="preserve">The built-in data comes from the challenge's own PDFs: </w:t>
+      </w:r>
+      <w:r>
+        <w:rPr>
+          <w:b/>
+          <w:bCs/>
+        </w:rPr>
+        <w:t xml:space="preserve">262 official records</w:t>
+      </w:r>
+      <w:r>
+        <w:t xml:space="preserve"> (44 DESC projects and 218 Georgia rows), placed on OpenStreetMap substations, plus the newer published lists. With everything loaded that is 64 DESC projects on the map against 161 Georgia ones.</w:t>
+      </w:r>
+    </w:p>
+    <w:p>
+      <w:pPr>
+        <w:pageBreakBefore/>
+      </w:pPr>
+    </w:p>
+    <w:p>
+      <w:pPr>
         <w:keepNext/>
-        <w:pageBreakBefore/>
         <w:spacing w:after="40" w:before="120"/>
       </w:pPr>
       <w:r>
@@ -786,7 +999,7 @@
           <w:sz w:val="17"/>
           <w:szCs w:val="17"/>
         </w:rPr>
-        <w:t xml:space="preserve">01 · TOP OF THE PAGE</w:t>
+        <w:t xml:space="preserve">01 · THE WHOLE SCREEN</w:t>
       </w:r>
     </w:p>
     <w:p>
@@ -794,20 +1007,21 @@
         <w:pStyle w:val="Heading1"/>
       </w:pPr>
       <w:r>
-        <w:t xml:space="preserve">Choosing who to compare</w:t>
-      </w:r>
-    </w:p>
-    <w:p>
-      <w:pPr>
+        <w:t xml:space="preserve">The screen at a glance</w:t>
+      </w:r>
+    </w:p>
+    <w:p>
+      <w:pPr>
+        <w:keepNext/>
         <w:spacing w:after="40" w:before="80"/>
         <w:jc w:val="center"/>
       </w:pPr>
       <w:r>
         <w:drawing>
           <wp:inline distT="0" distB="0" distL="0" distR="0">
-            <wp:extent cx="5943600" cy="1666875"/>
+            <wp:extent cx="5943600" cy="3045609"/>
             <wp:effectExtent t="0" r="0" b="0" l="0"/>
-            <wp:docPr id="1" name="1-top.png" descr="The header, and the bar where you choose what to compare." title="The header, and the bar where you choose what to compare."/>
+            <wp:docPr id="1" name="overview.jpg" descr="The whole screen: the rail on the left, the Overlaps panel, the map, and the build-windows bar underneath." title="The whole screen: the rail on the left, the Overlaps panel, the map, and the build-windows bar underneath."/>
             <wp:cNvGraphicFramePr>
               <a:graphicFrameLocks xmlns:a="http://schemas.openxmlformats.org/drawingml/2006/main" noChangeAspect="1"/>
             </wp:cNvGraphicFramePr>
@@ -821,7 +1035,7 @@
                     </pic:cNvPicPr>
                   </pic:nvPicPr>
                   <pic:blipFill>
-                    <a:blip r:embed="rId8" cstate="none"/>
+                    <a:blip r:embed="rId101" cstate="none"/>
                     <a:srcRect/>
                     <a:stretch>
                       <a:fillRect/>
@@ -830,7 +1044,7 @@
                   <pic:spPr bwMode="auto">
                     <a:xfrm>
                       <a:off x="0" y="0"/>
-                      <a:ext cx="5943600" cy="1666875"/>
+                      <a:ext cx="5943600" cy="3045609"/>
                     </a:xfrm>
                     <a:prstGeom prst="rect">
                       <a:avLst/>
@@ -856,7 +1070,15 @@
           <w:sz w:val="18"/>
           <w:szCs w:val="18"/>
         </w:rPr>
-        <w:t xml:space="preserve">The header, and the bar where you choose what to compare.</w:t>
+        <w:t xml:space="preserve">The whole screen: the rail on the left, the Overlaps panel, the map, and the build-windows bar underneath.</w:t>
+      </w:r>
+    </w:p>
+    <w:p>
+      <w:pPr>
+        <w:spacing w:after="140"/>
+      </w:pPr>
+      <w:r>
+        <w:t xml:space="preserve">One screen, laid out like the coordination tools planners already use: the ranked overlaps on the left, the map on the right, and the build windows underneath, all linked. Clicking something in one place highlights it in the others.</w:t>
       </w:r>
     </w:p>
     <w:tbl>
@@ -899,7 +1121,7 @@
                 <w:b/>
                 <w:bCs/>
               </w:rPr>
-              <w:t xml:space="preserve">Compare … with …</w:t>
+              <w:t xml:space="preserve">Compare … ↔ …</w:t>
             </w:r>
           </w:p>
         </w:tc>
@@ -921,17 +1143,17 @@
           </w:tcPr>
           <w:p>
             <w:r>
-              <w:t xml:space="preserve">Pick the two companies. The number in brackets is how many planned projects each one has. Pick </w:t>
-            </w:r>
-            <w:r>
-              <w:rPr>
-                <w:b/>
-                <w:bCs/>
-              </w:rPr>
-              <w:t xml:space="preserve">None</w:t>
-            </w:r>
-            <w:r>
-              <w:t xml:space="preserve"> in the second box to just look at one company's projects (section 10).</w:t>
+              <w:t xml:space="preserve">The two boxes at the top pick the two companies. The number after each name is how many planned projects it has. Pick </w:t>
+            </w:r>
+            <w:r>
+              <w:rPr>
+                <w:b/>
+                <w:bCs/>
+              </w:rPr>
+              <w:t xml:space="preserve">None: just list projects</w:t>
+            </w:r>
+            <w:r>
+              <w:t xml:space="preserve"> in the second box to look at one company on its own (section 14).</w:t>
             </w:r>
           </w:p>
         </w:tc>
@@ -960,7 +1182,7 @@
                 <w:b/>
                 <w:bCs/>
               </w:rPr>
-              <w:t xml:space="preserve">Add a utility's plans</w:t>
+              <w:t xml:space="preserve">Filters</w:t>
             </w:r>
           </w:p>
         </w:tc>
@@ -982,7 +1204,77 @@
           </w:tcPr>
           <w:p>
             <w:r>
-              <w:t xml:space="preserve">Load another company's plan from a file (section 9).</w:t>
+              <w:t xml:space="preserve">Everything that narrows the comparison: </w:t>
+            </w:r>
+            <w:r>
+              <w:rPr>
+                <w:b/>
+                <w:bCs/>
+              </w:rPr>
+              <w:t xml:space="preserve">Overlap within</w:t>
+            </w:r>
+            <w:r>
+              <w:t xml:space="preserve"> (40 km, about 25 miles, by default: roughly how far one crew yard can serve in a day), </w:t>
+            </w:r>
+            <w:r>
+              <w:rPr>
+                <w:b/>
+                <w:bCs/>
+              </w:rPr>
+              <w:t xml:space="preserve">Window buffer</w:t>
+            </w:r>
+            <w:r>
+              <w:t xml:space="preserve"> (how many months apart two build windows can be and still count as the same time), </w:t>
+            </w:r>
+            <w:r>
+              <w:rPr>
+                <w:b/>
+                <w:bCs/>
+              </w:rPr>
+              <w:t xml:space="preserve">Near / Near + same window / Same window</w:t>
+            </w:r>
+            <w:r>
+              <w:t xml:space="preserve">, the build period (</w:t>
+            </w:r>
+            <w:r>
+              <w:rPr>
+                <w:b/>
+                <w:bCs/>
+              </w:rPr>
+              <w:t xml:space="preserve">Next 12 mo</w:t>
+            </w:r>
+            <w:r>
+              <w:t xml:space="preserve">, </w:t>
+            </w:r>
+            <w:r>
+              <w:rPr>
+                <w:b/>
+                <w:bCs/>
+              </w:rPr>
+              <w:t xml:space="preserve">Next 3 yr</w:t>
+            </w:r>
+            <w:r>
+              <w:t xml:space="preserve">, </w:t>
+            </w:r>
+            <w:r>
+              <w:rPr>
+                <w:b/>
+                <w:bCs/>
+              </w:rPr>
+              <w:t xml:space="preserve">All</w:t>
+            </w:r>
+            <w:r>
+              <w:t xml:space="preserve">), and </w:t>
+            </w:r>
+            <w:r>
+              <w:rPr>
+                <w:b/>
+                <w:bCs/>
+              </w:rPr>
+              <w:t xml:space="preserve">Include dates already passed</w:t>
+            </w:r>
+            <w:r>
+              <w:t xml:space="preserve">. The button shows the current settings, for example "40 km · all dates".</w:t>
             </w:r>
           </w:p>
         </w:tc>
@@ -1011,7 +1303,7 @@
                 <w:b/>
                 <w:bCs/>
               </w:rPr>
-              <w:t xml:space="preserve">Geographic threshold</w:t>
+              <w:t xml:space="preserve">More</w:t>
             </w:r>
           </w:p>
         </w:tc>
@@ -1033,7 +1325,24 @@
           </w:tcPr>
           <w:p>
             <w:r>
-              <w:t xml:space="preserve">How close two projects must be to count. The default is 40 km (about 25 miles), roughly how far one crew yard can serve in a day. Slide it to be stricter or looser.</w:t>
+              <w:rPr>
+                <w:b/>
+                <w:bCs/>
+              </w:rPr>
+              <w:t xml:space="preserve">Share this view</w:t>
+            </w:r>
+            <w:r>
+              <w:t xml:space="preserve"> copies a link to exactly what's on screen (companies, filters, tab, selected pair, basemap, 3D and camera), so the other company opens the same view. </w:t>
+            </w:r>
+            <w:r>
+              <w:rPr>
+                <w:b/>
+                <w:bCs/>
+              </w:rPr>
+              <w:t xml:space="preserve">Export CSV</w:t>
+            </w:r>
+            <w:r>
+              <w:t xml:space="preserve"> downloads the list for Excel or Google Sheets. Import plans and Unit costs are here too.</w:t>
             </w:r>
           </w:p>
         </w:tc>
@@ -1062,7 +1371,7 @@
                 <w:b/>
                 <w:bCs/>
               </w:rPr>
-              <w:t xml:space="preserve">Build-window buffer</w:t>
+              <w:t xml:space="preserve">The rail</w:t>
             </w:r>
           </w:p>
         </w:tc>
@@ -1084,7 +1393,87 @@
           </w:tcPr>
           <w:p>
             <w:r>
-              <w:t xml:space="preserve">How many months apart two build windows can be and still count as "at the same time". At ±0 they must actually overlap. At ±6, jobs half a year apart also count.</w:t>
+              <w:t xml:space="preserve">The labeled buttons down the left switch the panel: </w:t>
+            </w:r>
+            <w:r>
+              <w:rPr>
+                <w:b/>
+                <w:bCs/>
+              </w:rPr>
+              <w:t xml:space="preserve">Overlaps</w:t>
+            </w:r>
+            <w:r>
+              <w:t xml:space="preserve">, </w:t>
+            </w:r>
+            <w:r>
+              <w:rPr>
+                <w:b/>
+                <w:bCs/>
+              </w:rPr>
+              <w:t xml:space="preserve">Changes</w:t>
+            </w:r>
+            <w:r>
+              <w:t xml:space="preserve"> (how plans moved, section 6), </w:t>
+            </w:r>
+            <w:r>
+              <w:rPr>
+                <w:b/>
+                <w:bCs/>
+              </w:rPr>
+              <w:t xml:space="preserve">Plan</w:t>
+            </w:r>
+            <w:r>
+              <w:t xml:space="preserve"> (the schedule optimizer, section 7), </w:t>
+            </w:r>
+            <w:r>
+              <w:rPr>
+                <w:b/>
+                <w:bCs/>
+              </w:rPr>
+              <w:t xml:space="preserve">Windows</w:t>
+            </w:r>
+            <w:r>
+              <w:t xml:space="preserve"> (unfolds the build-windows chart under the map, section 8), </w:t>
+            </w:r>
+            <w:r>
+              <w:rPr>
+                <w:b/>
+                <w:bCs/>
+              </w:rPr>
+              <w:t xml:space="preserve">Checks</w:t>
+            </w:r>
+            <w:r>
+              <w:t xml:space="preserve"> (section 9) and </w:t>
+            </w:r>
+            <w:r>
+              <w:rPr>
+                <w:b/>
+                <w:bCs/>
+              </w:rPr>
+              <w:t xml:space="preserve">Ask</w:t>
+            </w:r>
+            <w:r>
+              <w:t xml:space="preserve"> (section 11). </w:t>
+            </w:r>
+            <w:r>
+              <w:rPr>
+                <w:b/>
+                <w:bCs/>
+              </w:rPr>
+              <w:t xml:space="preserve">Import</w:t>
+            </w:r>
+            <w:r>
+              <w:t xml:space="preserve"> and </w:t>
+            </w:r>
+            <w:r>
+              <w:rPr>
+                <w:b/>
+                <w:bCs/>
+              </w:rPr>
+              <w:t xml:space="preserve">Costs</w:t>
+            </w:r>
+            <w:r>
+              <w:t xml:space="preserve"> sit at the bottom.</w:t>
             </w:r>
           </w:p>
         </w:tc>
@@ -1113,7 +1502,7 @@
                 <w:b/>
                 <w:bCs/>
               </w:rPr>
-              <w:t xml:space="preserve">Show pairs that are</w:t>
+              <w:t xml:space="preserve">Ask button</w:t>
             </w:r>
           </w:p>
         </w:tc>
@@ -1135,34 +1524,17 @@
           </w:tcPr>
           <w:p>
             <w:r>
-              <w:rPr>
-                <w:b/>
-                <w:bCs/>
-              </w:rPr>
-              <w:t xml:space="preserve">Near</w:t>
-            </w:r>
-            <w:r>
-              <w:t xml:space="preserve"> shows every close pair. </w:t>
-            </w:r>
-            <w:r>
-              <w:rPr>
-                <w:b/>
-                <w:bCs/>
-              </w:rPr>
-              <w:t xml:space="preserve">Near, same window</w:t>
-            </w:r>
-            <w:r>
-              <w:t xml:space="preserve"> keeps only close pairs built at the same time, the best opportunities. </w:t>
-            </w:r>
-            <w:r>
-              <w:rPr>
-                <w:b/>
-                <w:bCs/>
-              </w:rPr>
-              <w:t xml:space="preserve">Same window</w:t>
-            </w:r>
-            <w:r>
-              <w:t xml:space="preserve"> ignores distance and shows everything built at the same time.</w:t>
+              <w:t xml:space="preserve">The floating </w:t>
+            </w:r>
+            <w:r>
+              <w:rPr>
+                <w:b/>
+                <w:bCs/>
+              </w:rPr>
+              <w:t xml:space="preserve">Ask</w:t>
+            </w:r>
+            <w:r>
+              <w:t xml:space="preserve"> button at the top left of the map opens the assistant from anywhere.</w:t>
             </w:r>
           </w:p>
         </w:tc>
@@ -1170,8 +1542,12 @@
     </w:tbl>
     <w:p>
       <w:pPr>
+        <w:pageBreakBefore/>
+      </w:pPr>
+    </w:p>
+    <w:p>
+      <w:pPr>
         <w:keepNext/>
-        <w:pageBreakBefore/>
         <w:spacing w:after="40" w:before="120"/>
       </w:pPr>
       <w:r>
@@ -1190,69 +1566,15 @@
         <w:pStyle w:val="Heading1"/>
       </w:pPr>
       <w:r>
-        <w:t xml:space="preserve">The four numbers and the four tiers</w:t>
-      </w:r>
-    </w:p>
-    <w:p>
-      <w:pPr>
-        <w:spacing w:after="40" w:before="80"/>
-        <w:jc w:val="center"/>
-      </w:pPr>
-      <w:r>
-        <w:drawing>
-          <wp:inline distT="0" distB="0" distL="0" distR="0">
-            <wp:extent cx="5943600" cy="1085850"/>
-            <wp:effectExtent t="0" r="0" b="0" l="0"/>
-            <wp:docPr id="1" name="2-numbers.png" descr="Read this row first: it is the answer in one glance." title="Read this row first: it is the answer in one glance."/>
-            <wp:cNvGraphicFramePr>
-              <a:graphicFrameLocks xmlns:a="http://schemas.openxmlformats.org/drawingml/2006/main" noChangeAspect="1"/>
-            </wp:cNvGraphicFramePr>
-            <a:graphic xmlns:a="http://schemas.openxmlformats.org/drawingml/2006/main">
-              <a:graphicData uri="http://schemas.openxmlformats.org/drawingml/2006/picture">
-                <pic:pic xmlns:pic="http://schemas.openxmlformats.org/drawingml/2006/picture">
-                  <pic:nvPicPr>
-                    <pic:cNvPr id="0" name="" descr=""/>
-                    <pic:cNvPicPr>
-                      <a:picLocks noChangeAspect="1" noChangeArrowheads="1"/>
-                    </pic:cNvPicPr>
-                  </pic:nvPicPr>
-                  <pic:blipFill>
-                    <a:blip r:embed="rId9" cstate="none"/>
-                    <a:srcRect/>
-                    <a:stretch>
-                      <a:fillRect/>
-                    </a:stretch>
-                  </pic:blipFill>
-                  <pic:spPr bwMode="auto">
-                    <a:xfrm>
-                      <a:off x="0" y="0"/>
-                      <a:ext cx="5943600" cy="1085850"/>
-                    </a:xfrm>
-                    <a:prstGeom prst="rect">
-                      <a:avLst/>
-                    </a:prstGeom>
-                  </pic:spPr>
-                </pic:pic>
-              </a:graphicData>
-            </a:graphic>
-          </wp:inline>
-        </w:drawing>
-      </w:r>
-    </w:p>
-    <w:p>
-      <w:pPr>
-        <w:spacing w:after="200"/>
-        <w:jc w:val="center"/>
-      </w:pPr>
-      <w:r>
-        <w:rPr>
-          <w:i/>
-          <w:iCs/>
-          <w:color w:val="77878D"/>
-          <w:sz w:val="18"/>
-          <w:szCs w:val="18"/>
-        </w:rPr>
-        <w:t xml:space="preserve">Read this row first: it is the answer in one glance.</w:t>
+        <w:t xml:space="preserve">The headline numbers and the four tiers</w:t>
+      </w:r>
+    </w:p>
+    <w:p>
+      <w:pPr>
+        <w:spacing w:after="140"/>
+      </w:pPr>
+      <w:r>
+        <w:t xml:space="preserve">The Overlaps panel opens with four tiles. Read them first: they are the answer in one glance.</w:t>
       </w:r>
     </w:p>
     <w:tbl>
@@ -1295,7 +1617,7 @@
                 <w:b/>
                 <w:bCs/>
               </w:rPr>
-              <w:t xml:space="preserve">54 / 39</w:t>
+              <w:t xml:space="preserve">169 overlaps</w:t>
             </w:r>
           </w:p>
         </w:tc>
@@ -1317,7 +1639,7 @@
           </w:tcPr>
           <w:p>
             <w:r>
-              <w:t xml:space="preserve">Planned projects for each company.</w:t>
+              <w:t xml:space="preserve">Of the 10,304 pairs checked, 169 come within 40 km of each other, all along the Savannah River between Savannah and Lake Thurmond. Most planned work is far apart, which is why finding these matters.</w:t>
             </w:r>
           </w:p>
         </w:tc>
@@ -1346,7 +1668,7 @@
                 <w:b/>
                 <w:bCs/>
               </w:rPr>
-              <w:t xml:space="preserve">20</w:t>
+              <w:t xml:space="preserve">$13.6M expected savings</w:t>
             </w:r>
           </w:p>
         </w:tc>
@@ -1368,7 +1690,7 @@
           </w:tcPr>
           <w:p>
             <w:r>
-              <w:t xml:space="preserve">Of the 2,106 possible pairs, 20 come within 40 km of each other. Most planned work is far apart, which is why finding the 20 matters.</w:t>
+              <w:t xml:space="preserve">What the flagged pairs could save by coordinating, weighted by the chance they really share a window. It would be $15.2M if every date held (section 15).</w:t>
             </w:r>
           </w:p>
         </w:tc>
@@ -1397,7 +1719,7 @@
                 <w:b/>
                 <w:bCs/>
               </w:rPr>
-              <w:t xml:space="preserve">9</w:t>
+              <w:t xml:space="preserve">+$2.5M joint schedule</w:t>
             </w:r>
           </w:p>
         </w:tc>
@@ -1419,7 +1741,7 @@
           </w:tcPr>
           <w:p>
             <w:r>
-              <w:t xml:space="preserve">Of those 20, nine are also built at the same time. Those are the strongest chances to share.</w:t>
+              <w:t xml:space="preserve">What the optimizer's 8 suggested date moves would add (section 7).</w:t>
             </w:r>
           </w:p>
         </w:tc>
@@ -1448,7 +1770,7 @@
                 <w:b/>
                 <w:bCs/>
               </w:rPr>
-              <w:t xml:space="preserve">~$4.0M</w:t>
+              <w:t xml:space="preserve">4 to check</w:t>
             </w:r>
           </w:p>
         </w:tc>
@@ -1470,7 +1792,7 @@
           </w:tcPr>
           <w:p>
             <w:r>
-              <w:t xml:space="preserve">A rough total of what the listed pairs could save by coordinating (section 11).</w:t>
+              <w:t xml:space="preserve">Data checks that flagged records to review (section 9). The same number sits on the Checks button in the rail.</w:t>
             </w:r>
           </w:p>
         </w:tc>
@@ -1486,7 +1808,7 @@
         <w:spacing w:after="140"/>
       </w:pPr>
       <w:r>
-        <w:t xml:space="preserve">Each close pair falls into one of four tiers based on the distance between the closest points of the two projects. Closer means more can be shared. Click a tier card in the app to hide or show that tier.</w:t>
+        <w:t xml:space="preserve">Each close pair falls into one of four tiers based on the distance between the closest points of the two projects, measured between the lines and points themselves, not their centers. Closer means more can be shared.</w:t>
       </w:r>
     </w:p>
     <w:tbl>
@@ -1901,8 +2223,70 @@
     </w:p>
     <w:p>
       <w:pPr>
+        <w:spacing w:after="140"/>
+      </w:pPr>
+      <w:r>
+        <w:t xml:space="preserve">The chips under the tiles filter the list by tier: </w:t>
+      </w:r>
+      <w:r>
+        <w:rPr>
+          <w:b/>
+          <w:bCs/>
+        </w:rPr>
+        <w:t xml:space="preserve">All 169</w:t>
+      </w:r>
+      <w:r>
+        <w:t xml:space="preserve">, </w:t>
+      </w:r>
+      <w:r>
+        <w:rPr>
+          <w:b/>
+          <w:bCs/>
+        </w:rPr>
+        <w:t xml:space="preserve">Touching 4</w:t>
+      </w:r>
+      <w:r>
+        <w:t xml:space="preserve">, </w:t>
+      </w:r>
+      <w:r>
+        <w:rPr>
+          <w:b/>
+          <w:bCs/>
+        </w:rPr>
+        <w:t xml:space="preserve">&lt; 1.6 km 1</w:t>
+      </w:r>
+      <w:r>
+        <w:t xml:space="preserve">, </w:t>
+      </w:r>
+      <w:r>
+        <w:rPr>
+          <w:b/>
+          <w:bCs/>
+        </w:rPr>
+        <w:t xml:space="preserve">&lt; 8 km 12</w:t>
+      </w:r>
+      <w:r>
+        <w:t xml:space="preserve"> and </w:t>
+      </w:r>
+      <w:r>
+        <w:rPr>
+          <w:b/>
+          <w:bCs/>
+        </w:rPr>
+        <w:t xml:space="preserve">&lt; 40 km 152</w:t>
+      </w:r>
+      <w:r>
+        <w:t xml:space="preserve">.</w:t>
+      </w:r>
+    </w:p>
+    <w:p>
+      <w:pPr>
+        <w:pageBreakBefore/>
+      </w:pPr>
+    </w:p>
+    <w:p>
+      <w:pPr>
         <w:keepNext/>
-        <w:pageBreakBefore/>
         <w:spacing w:after="40" w:before="120"/>
       </w:pPr>
       <w:r>
@@ -1922,68 +2306,6 @@
       </w:pPr>
       <w:r>
         <w:t xml:space="preserve">The map</w:t>
-      </w:r>
-    </w:p>
-    <w:p>
-      <w:pPr>
-        <w:spacing w:after="40" w:before="80"/>
-        <w:jc w:val="center"/>
-      </w:pPr>
-      <w:r>
-        <w:drawing>
-          <wp:inline distT="0" distB="0" distL="0" distR="0">
-            <wp:extent cx="5334000" cy="5648325"/>
-            <wp:effectExtent t="0" r="0" b="0" l="0"/>
-            <wp:docPr id="1" name="3-map.png" descr="The map, paused on April 2028 during playback." title="The map, paused on April 2028 during playback."/>
-            <wp:cNvGraphicFramePr>
-              <a:graphicFrameLocks xmlns:a="http://schemas.openxmlformats.org/drawingml/2006/main" noChangeAspect="1"/>
-            </wp:cNvGraphicFramePr>
-            <a:graphic xmlns:a="http://schemas.openxmlformats.org/drawingml/2006/main">
-              <a:graphicData uri="http://schemas.openxmlformats.org/drawingml/2006/picture">
-                <pic:pic xmlns:pic="http://schemas.openxmlformats.org/drawingml/2006/picture">
-                  <pic:nvPicPr>
-                    <pic:cNvPr id="0" name="" descr=""/>
-                    <pic:cNvPicPr>
-                      <a:picLocks noChangeAspect="1" noChangeArrowheads="1"/>
-                    </pic:cNvPicPr>
-                  </pic:nvPicPr>
-                  <pic:blipFill>
-                    <a:blip r:embed="rId10" cstate="none"/>
-                    <a:srcRect/>
-                    <a:stretch>
-                      <a:fillRect/>
-                    </a:stretch>
-                  </pic:blipFill>
-                  <pic:spPr bwMode="auto">
-                    <a:xfrm>
-                      <a:off x="0" y="0"/>
-                      <a:ext cx="5334000" cy="5648325"/>
-                    </a:xfrm>
-                    <a:prstGeom prst="rect">
-                      <a:avLst/>
-                    </a:prstGeom>
-                  </pic:spPr>
-                </pic:pic>
-              </a:graphicData>
-            </a:graphic>
-          </wp:inline>
-        </w:drawing>
-      </w:r>
-    </w:p>
-    <w:p>
-      <w:pPr>
-        <w:spacing w:after="200"/>
-        <w:jc w:val="center"/>
-      </w:pPr>
-      <w:r>
-        <w:rPr>
-          <w:i/>
-          <w:iCs/>
-          <w:color w:val="77878D"/>
-          <w:sz w:val="18"/>
-          <w:szCs w:val="18"/>
-        </w:rPr>
-        <w:t xml:space="preserve">The map, paused on April 2028 during playback.</w:t>
       </w:r>
     </w:p>
     <w:tbl>
@@ -2048,26 +2370,7 @@
           </w:tcPr>
           <w:p>
             <w:r>
-              <w:rPr>
-                <w:b/>
-                <w:bCs/>
-                <w:color w:val="0E6F8C"/>
-              </w:rPr>
-              <w:t xml:space="preserve">Blue</w:t>
-            </w:r>
-            <w:r>
-              <w:t xml:space="preserve"> is the first company, </w:t>
-            </w:r>
-            <w:r>
-              <w:rPr>
-                <w:b/>
-                <w:bCs/>
-                <w:color w:val="B4560F"/>
-              </w:rPr>
-              <w:t xml:space="preserve">orange</w:t>
-            </w:r>
-            <w:r>
-              <w:t xml:space="preserve"> is the second. Lines are power lines; dots are substations and plants. Thicker lines carry higher voltage.</w:t>
+              <w:t xml:space="preserve">Blue is the first company, orange is the second. Lines are power lines; dots are substations and plants. Thicker lines carry higher voltage.</w:t>
             </w:r>
           </w:p>
         </w:tc>
@@ -2096,7 +2399,7 @@
                 <w:b/>
                 <w:bCs/>
               </w:rPr>
-              <w:t xml:space="preserve">Dashed lines, hollow dots</w:t>
+              <w:t xml:space="preserve">Dashed and dotted</w:t>
             </w:r>
           </w:p>
         </w:tc>
@@ -2118,7 +2421,7 @@
           </w:tcPr>
           <w:p>
             <w:r>
-              <w:t xml:space="preserve">Public plans name places but don't give exact coordinates, so locations were placed by hand. Dashed or hollow means "best guess".</w:t>
+              <w:t xml:space="preserve">Dashed means the location is approximate. Dotted or faded means the in-service date has already passed.</w:t>
             </w:r>
           </w:p>
         </w:tc>
@@ -2147,7 +2450,7 @@
                 <w:b/>
                 <w:bCs/>
               </w:rPr>
-              <w:t xml:space="preserve">Grey lines and diamonds</w:t>
+              <w:t xml:space="preserve">Existing grid</w:t>
             </w:r>
           </w:p>
         </w:tc>
@@ -2169,7 +2472,14 @@
           </w:tcPr>
           <w:p>
             <w:r>
-              <w:t xml:space="preserve">Things that already exist, like Plant Vogtle, shown for reference.</w:t>
+              <w:rPr>
+                <w:b/>
+                <w:bCs/>
+              </w:rPr>
+              <w:t xml:space="preserve">Grid</w:t>
+            </w:r>
+            <w:r>
+              <w:t xml:space="preserve"> draws today's transmission lines underneath: 10,092 lines of 115 kV and up in Georgia and South Carolina, from OpenStreetMap, colored by voltage. It shows when the app is served (npm start or the website), not when index.html is opened straight from disk.</w:t>
             </w:r>
           </w:p>
         </w:tc>
@@ -2198,7 +2508,7 @@
                 <w:b/>
                 <w:bCs/>
               </w:rPr>
-              <w:t xml:space="preserve">Thin dotted links</w:t>
+              <w:t xml:space="preserve">Links and rings</w:t>
             </w:r>
           </w:p>
         </w:tc>
@@ -2220,7 +2530,7 @@
           </w:tcPr>
           <w:p>
             <w:r>
-              <w:t xml:space="preserve">Each link joins the two closest points of a flagged pair. Its color is the pair's tier. Click one to open that pair.</w:t>
+              <w:t xml:space="preserve">Each thin link joins the two closest points of a flagged pair, in its tier's color, and is labeled with the gap (the open pair always, all of them from closer zoom). Rings mark how close a pair is; round dots mark shared staging yards. Click one to open it.</w:t>
             </w:r>
           </w:p>
         </w:tc>
@@ -2249,7 +2559,7 @@
                 <w:b/>
                 <w:bCs/>
               </w:rPr>
-              <w:t xml:space="preserve">Rings</w:t>
+              <w:t xml:space="preserve">Top buttons</w:t>
             </w:r>
           </w:p>
         </w:tc>
@@ -2271,7 +2581,84 @@
           </w:tcPr>
           <w:p>
             <w:r>
-              <w:t xml:space="preserve">Mark pairs that touch or are under 1.6 km apart.</w:t>
+              <w:rPr>
+                <w:b/>
+                <w:bCs/>
+              </w:rPr>
+              <w:t xml:space="preserve">Overlaps</w:t>
+            </w:r>
+            <w:r>
+              <w:t xml:space="preserve"> zooms to where the flagged pairs are; </w:t>
+            </w:r>
+            <w:r>
+              <w:rPr>
+                <w:b/>
+                <w:bCs/>
+              </w:rPr>
+              <w:t xml:space="preserve">All projects</w:t>
+            </w:r>
+            <w:r>
+              <w:t xml:space="preserve"> shows everything. </w:t>
+            </w:r>
+            <w:r>
+              <w:rPr>
+                <w:b/>
+                <w:bCs/>
+              </w:rPr>
+              <w:t xml:space="preserve">Plain</w:t>
+            </w:r>
+            <w:r>
+              <w:t xml:space="preserve"> (works offline), </w:t>
+            </w:r>
+            <w:r>
+              <w:rPr>
+                <w:b/>
+                <w:bCs/>
+              </w:rPr>
+              <w:t xml:space="preserve">Relief</w:t>
+            </w:r>
+            <w:r>
+              <w:t xml:space="preserve"> (color by elevation with hillshade), </w:t>
+            </w:r>
+            <w:r>
+              <w:rPr>
+                <w:b/>
+                <w:bCs/>
+              </w:rPr>
+              <w:t xml:space="preserve">Satellite</w:t>
+            </w:r>
+            <w:r>
+              <w:t xml:space="preserve"> and </w:t>
+            </w:r>
+            <w:r>
+              <w:rPr>
+                <w:b/>
+                <w:bCs/>
+              </w:rPr>
+              <w:t xml:space="preserve">Topo</w:t>
+            </w:r>
+            <w:r>
+              <w:t xml:space="preserve"> switch the basemap. </w:t>
+            </w:r>
+            <w:r>
+              <w:rPr>
+                <w:b/>
+                <w:bCs/>
+              </w:rPr>
+              <w:t xml:space="preserve">Grid</w:t>
+            </w:r>
+            <w:r>
+              <w:t xml:space="preserve"> toggles the existing lines, and </w:t>
+            </w:r>
+            <w:r>
+              <w:rPr>
+                <w:b/>
+                <w:bCs/>
+              </w:rPr>
+              <w:t xml:space="preserve">3D</w:t>
+            </w:r>
+            <w:r>
+              <w:t xml:space="preserve"> tilts the map.</w:t>
             </w:r>
           </w:p>
         </w:tc>
@@ -2300,7 +2687,7 @@
                 <w:b/>
                 <w:bCs/>
               </w:rPr>
-              <w:t xml:space="preserve">The stitched line</w:t>
+              <w:t xml:space="preserve">Bottom right</w:t>
             </w:r>
           </w:p>
         </w:tc>
@@ -2322,75 +2709,17 @@
           </w:tcPr>
           <w:p>
             <w:r>
-              <w:t xml:space="preserve">The Georgia and South Carolina border, which is the Savannah River. It's drawn as a seam because that's where the two companies' work meets.</w:t>
-            </w:r>
-          </w:p>
-        </w:tc>
-      </w:tr>
-      <w:tr>
-        <w:tc>
-          <w:tcPr>
-            <w:tcW w:type="dxa" w:w="2600"/>
-            <w:tcBorders>
-              <w:top w:val="single" w:color="D5DEDD" w:sz="4"/>
-              <w:left w:val="single" w:color="D5DEDD" w:sz="4"/>
-              <w:bottom w:val="single" w:color="D5DEDD" w:sz="4"/>
-              <w:right w:val="single" w:color="D5DEDD" w:sz="4"/>
-            </w:tcBorders>
-            <w:shd w:fill="F4F7F6" w:color="auto" w:val="clear"/>
-            <w:tcMar>
-              <w:top w:type="dxa" w:w="90"/>
-              <w:left w:type="dxa" w:w="120"/>
-              <w:bottom w:type="dxa" w:w="90"/>
-              <w:right w:type="dxa" w:w="120"/>
-            </w:tcMar>
-          </w:tcPr>
-          <w:p>
-            <w:r>
-              <w:rPr>
-                <w:b/>
-                <w:bCs/>
-              </w:rPr>
-              <w:t xml:space="preserve">Map buttons</w:t>
-            </w:r>
-          </w:p>
-        </w:tc>
-        <w:tc>
-          <w:tcPr>
-            <w:tcW w:type="dxa" w:w="6760"/>
-            <w:tcBorders>
-              <w:top w:val="single" w:color="D5DEDD" w:sz="4"/>
-              <w:left w:val="single" w:color="D5DEDD" w:sz="4"/>
-              <w:bottom w:val="single" w:color="D5DEDD" w:sz="4"/>
-              <w:right w:val="single" w:color="D5DEDD" w:sz="4"/>
-            </w:tcBorders>
-            <w:tcMar>
-              <w:top w:type="dxa" w:w="90"/>
-              <w:left w:type="dxa" w:w="120"/>
-              <w:bottom w:type="dxa" w:w="90"/>
-              <w:right w:type="dxa" w:w="120"/>
-            </w:tcMar>
-          </w:tcPr>
-          <w:p>
-            <w:r>
-              <w:rPr>
-                <w:b/>
-                <w:bCs/>
-              </w:rPr>
-              <w:t xml:space="preserve">Overlap area</w:t>
-            </w:r>
-            <w:r>
-              <w:t xml:space="preserve"> zooms to where the flagged pairs are; </w:t>
-            </w:r>
-            <w:r>
-              <w:rPr>
-                <w:b/>
-                <w:bCs/>
-              </w:rPr>
-              <w:t xml:space="preserve">All projects</w:t>
-            </w:r>
-            <w:r>
-              <w:t xml:space="preserve"> shows everything. The style box switches between Plain, Streets, Satellite and Terrain. Drag to move, scroll to zoom.</w:t>
+              <w:t xml:space="preserve">The orange </w:t>
+            </w:r>
+            <w:r>
+              <w:rPr>
+                <w:b/>
+                <w:bCs/>
+              </w:rPr>
+              <w:t xml:space="preserve">walker</w:t>
+            </w:r>
+            <w:r>
+              <w:t xml:space="preserve"> figure (see below), recenter, a click-to-measure ruler (each leg and the total in miles and km), zoom, compass, and scale bars in miles and km.</w:t>
             </w:r>
           </w:p>
         </w:tc>
@@ -2400,6 +2729,84 @@
       <w:pPr>
         <w:spacing w:after="60"/>
       </w:pPr>
+    </w:p>
+    <w:p>
+      <w:pPr>
+        <w:keepNext/>
+        <w:spacing w:after="40" w:before="80"/>
+        <w:jc w:val="center"/>
+      </w:pPr>
+      <w:r>
+        <w:drawing>
+          <wp:inline distT="0" distB="0" distL="0" distR="0">
+            <wp:extent cx="5943600" cy="3045609"/>
+            <wp:effectExtent t="0" r="0" b="0" l="0"/>
+            <wp:docPr id="2" name="3d.jpg" descr="The map in 3D over satellite imagery: towers along the Jasper - Okatie 230 kV line, with pair #4 open on the left." title="The map in 3D over satellite imagery: towers along the Jasper - Okatie 230 kV line, with pair #4 open on the left."/>
+            <wp:cNvGraphicFramePr>
+              <a:graphicFrameLocks xmlns:a="http://schemas.openxmlformats.org/drawingml/2006/main" noChangeAspect="1"/>
+            </wp:cNvGraphicFramePr>
+            <a:graphic xmlns:a="http://schemas.openxmlformats.org/drawingml/2006/main">
+              <a:graphicData uri="http://schemas.openxmlformats.org/drawingml/2006/picture">
+                <pic:pic xmlns:pic="http://schemas.openxmlformats.org/drawingml/2006/picture">
+                  <pic:nvPicPr>
+                    <pic:cNvPr id="0" name="" descr=""/>
+                    <pic:cNvPicPr>
+                      <a:picLocks noChangeAspect="1" noChangeArrowheads="1"/>
+                    </pic:cNvPicPr>
+                  </pic:nvPicPr>
+                  <pic:blipFill>
+                    <a:blip r:embed="rId102" cstate="none"/>
+                    <a:srcRect/>
+                    <a:stretch>
+                      <a:fillRect/>
+                    </a:stretch>
+                  </pic:blipFill>
+                  <pic:spPr bwMode="auto">
+                    <a:xfrm>
+                      <a:off x="0" y="0"/>
+                      <a:ext cx="5943600" cy="3045609"/>
+                    </a:xfrm>
+                    <a:prstGeom prst="rect">
+                      <a:avLst/>
+                    </a:prstGeom>
+                  </pic:spPr>
+                </pic:pic>
+              </a:graphicData>
+            </a:graphic>
+          </wp:inline>
+        </w:drawing>
+      </w:r>
+    </w:p>
+    <w:p>
+      <w:pPr>
+        <w:spacing w:after="200"/>
+        <w:jc w:val="center"/>
+      </w:pPr>
+      <w:r>
+        <w:rPr>
+          <w:i/>
+          <w:iCs/>
+          <w:color w:val="77878D"/>
+          <w:sz w:val="18"/>
+          <w:szCs w:val="18"/>
+        </w:rPr>
+        <w:t xml:space="preserve">The map in 3D over satellite imagery: towers along the Jasper - Okatie 230 kV line, with pair #4 open on the left.</w:t>
+      </w:r>
+    </w:p>
+    <w:p>
+      <w:pPr>
+        <w:spacing w:after="140"/>
+      </w:pPr>
+      <w:r>
+        <w:rPr>
+          <w:b/>
+          <w:bCs/>
+        </w:rPr>
+        <w:t xml:space="preserve">3D</w:t>
+      </w:r>
+      <w:r>
+        <w:t xml:space="preserve"> tilts the map over real terrain (elevation exaggerated 3× because the Southeast is low), adds hillshading and a sky, and raises a tower about every 450 m along each planned line. Satellite imagery and terrain need an internet connection; Plain works without one.</w:t>
+      </w:r>
     </w:p>
     <w:tbl>
       <w:tblPr>
@@ -2446,32 +2853,12 @@
                 <w:sz w:val="24"/>
                 <w:szCs w:val="24"/>
               </w:rPr>
-              <w:t xml:space="preserve">Play the build years</w:t>
-            </w:r>
-          </w:p>
-          <w:p>
-            <w:r>
-              <w:t xml:space="preserve">Press </w:t>
-            </w:r>
-            <w:r>
-              <w:rPr>
-                <w:b/>
-                <w:bCs/>
-              </w:rPr>
-              <w:t xml:space="preserve">Play</w:t>
-            </w:r>
-            <w:r>
-              <w:t xml:space="preserve"> under the map and it steps forward one month at a time. Projects brighten while they're under construction and fade before they start. When both projects in a flagged pair are under construction in the same month, a pulsing ring appears between them: that's a live chance to share. Drag the slider to jump to any month, and press </w:t>
-            </w:r>
-            <w:r>
-              <w:rPr>
-                <w:b/>
-                <w:bCs/>
-              </w:rPr>
-              <w:t xml:space="preserve">Show all years</w:t>
-            </w:r>
-            <w:r>
-              <w:t xml:space="preserve"> to go back.</w:t>
+              <w:t xml:space="preserve">Drop in and walk</w:t>
+            </w:r>
+          </w:p>
+          <w:p>
+            <w:r>
+              <w:t xml:space="preserve">Drag the orange figure from the bottom right of the map onto any project, like Street View. The 3D illustration of that project's most valuable pair opens at ground level where it landed (section 12). Walk with W A S D or the arrow keys, drag to look around, hold Shift to run.</w:t>
             </w:r>
           </w:p>
         </w:tc>
@@ -2479,13 +2866,12 @@
     </w:tbl>
     <w:p>
       <w:pPr>
-        <w:spacing w:after="120"/>
+        <w:pageBreakBefore/>
       </w:pPr>
     </w:p>
     <w:p>
       <w:pPr>
         <w:keepNext/>
-        <w:pageBreakBefore/>
         <w:spacing w:after="40" w:before="120"/>
       </w:pPr>
       <w:r>
@@ -2509,15 +2895,247 @@
     </w:p>
     <w:p>
       <w:pPr>
+        <w:spacing w:after="140"/>
+      </w:pPr>
+      <w:r>
+        <w:t xml:space="preserve">Every flagged pair, best first. </w:t>
+      </w:r>
+      <w:r>
+        <w:rPr>
+          <w:b/>
+          <w:bCs/>
+        </w:rPr>
+        <w:t xml:space="preserve">Sort</w:t>
+      </w:r>
+      <w:r>
+        <w:t xml:space="preserve"> puts them in order of expected savings (the default), chance of a shared window, or distance. Each row reads left to right:</w:t>
+      </w:r>
+    </w:p>
+    <w:p>
+      <w:pPr>
+        <w:pStyle w:val="ListParagraph"/>
+        <w:numPr>
+          <w:ilvl w:val="0"/>
+          <w:numId w:val="2"/>
+        </w:numPr>
+        <w:spacing w:after="80"/>
+      </w:pPr>
+      <w:r>
+        <w:rPr>
+          <w:b/>
+          <w:bCs/>
+        </w:rPr>
+        <w:t xml:space="preserve">The rank</w:t>
+      </w:r>
+      <w:r>
+        <w:t xml:space="preserve">, then </w:t>
+      </w:r>
+      <w:r>
+        <w:rPr>
+          <w:b/>
+          <w:bCs/>
+        </w:rPr>
+        <w:t xml:space="preserve">the distance</w:t>
+      </w:r>
+      <w:r>
+        <w:t xml:space="preserve">: the tier tag (Touching, &lt; 1.6 km, &lt; 8 km or &lt; 40 km) and the distance between the closest points, for example 4.3 km.</w:t>
+      </w:r>
+    </w:p>
+    <w:p>
+      <w:pPr>
+        <w:pStyle w:val="ListParagraph"/>
+        <w:numPr>
+          <w:ilvl w:val="0"/>
+          <w:numId w:val="2"/>
+        </w:numPr>
+        <w:spacing w:after="80"/>
+      </w:pPr>
+      <w:r>
+        <w:rPr>
+          <w:b/>
+          <w:bCs/>
+        </w:rPr>
+        <w:t xml:space="preserve">The project pair</w:t>
+      </w:r>
+      <w:r>
+        <w:t xml:space="preserve">: the two project names, marked with each company's color.</w:t>
+      </w:r>
+    </w:p>
+    <w:p>
+      <w:pPr>
+        <w:pStyle w:val="ListParagraph"/>
+        <w:numPr>
+          <w:ilvl w:val="0"/>
+          <w:numId w:val="2"/>
+        </w:numPr>
+        <w:spacing w:after="80"/>
+      </w:pPr>
+      <w:r>
+        <w:rPr>
+          <w:b/>
+          <w:bCs/>
+        </w:rPr>
+        <w:t xml:space="preserve">Same window</w:t>
+      </w:r>
+      <w:r>
+        <w:t xml:space="preserve">: a bar with the chance both are in the field together, and what the plan says, for example "on paper 6 mo apart".</w:t>
+      </w:r>
+    </w:p>
+    <w:p>
+      <w:pPr>
+        <w:pStyle w:val="ListParagraph"/>
+        <w:numPr>
+          <w:ilvl w:val="0"/>
+          <w:numId w:val="2"/>
+        </w:numPr>
+        <w:spacing w:after="80"/>
+      </w:pPr>
+      <w:r>
+        <w:rPr>
+          <w:b/>
+          <w:bCs/>
+        </w:rPr>
+        <w:t xml:space="preserve">Expected</w:t>
+      </w:r>
+      <w:r>
+        <w:t xml:space="preserve">: the expected savings. When it differs a lot from the plan's figure, that figure shows underneath.</w:t>
+      </w:r>
+    </w:p>
+    <w:p>
+      <w:pPr>
+        <w:spacing w:after="140"/>
+      </w:pPr>
+      <w:r>
+        <w:t xml:space="preserve">Type in the search box to find a project, place or TEAMS id. </w:t>
+      </w:r>
+      <w:r>
+        <w:rPr>
+          <w:b/>
+          <w:bCs/>
+        </w:rPr>
+        <w:t xml:space="preserve">Shared yards</w:t>
+      </w:r>
+      <w:r>
+        <w:t xml:space="preserve"> above the list shows groups of projects that could use one yard (section 16). </w:t>
+      </w:r>
+      <w:r>
+        <w:rPr>
+          <w:b/>
+          <w:bCs/>
+        </w:rPr>
+        <w:t xml:space="preserve">Export CSV</w:t>
+      </w:r>
+      <w:r>
+        <w:t xml:space="preserve"> under More downloads the list.</w:t>
+      </w:r>
+    </w:p>
+    <w:tbl>
+      <w:tblPr>
+        <w:tblW w:type="dxa" w:w="9360"/>
+        <w:tblBorders>
+          <w:top w:val="single" w:color="auto" w:sz="4"/>
+          <w:left w:val="single" w:color="auto" w:sz="4"/>
+          <w:bottom w:val="single" w:color="auto" w:sz="4"/>
+          <w:right w:val="single" w:color="auto" w:sz="4"/>
+          <w:insideH w:val="single" w:color="auto" w:sz="4"/>
+          <w:insideV w:val="single" w:color="auto" w:sz="4"/>
+        </w:tblBorders>
+      </w:tblPr>
+      <w:tblGrid>
+        <w:gridCol w:w="9360"/>
+      </w:tblGrid>
+      <w:tr>
+        <w:tc>
+          <w:tcPr>
+            <w:tcW w:type="dxa" w:w="9360"/>
+            <w:tcBorders>
+              <w:top w:val="none" w:color="FFFFFF" w:sz="0"/>
+              <w:left w:val="single" w:color="9A6B2F" w:sz="24"/>
+              <w:bottom w:val="none" w:color="FFFFFF" w:sz="0"/>
+              <w:right w:val="none" w:color="FFFFFF" w:sz="0"/>
+            </w:tcBorders>
+            <w:shd w:fill="F6EFE4" w:color="auto" w:val="clear"/>
+            <w:tcMar>
+              <w:top w:type="dxa" w:w="140"/>
+              <w:left w:type="dxa" w:w="200"/>
+              <w:bottom w:type="dxa" w:w="140"/>
+              <w:right w:type="dxa" w:w="200"/>
+            </w:tcMar>
+          </w:tcPr>
+          <w:p>
+            <w:pPr>
+              <w:spacing w:after="60"/>
+            </w:pPr>
+            <w:r>
+              <w:rPr>
+                <w:b/>
+                <w:bCs/>
+                <w:color w:val="9A6B2F"/>
+                <w:sz w:val="24"/>
+                <w:szCs w:val="24"/>
+              </w:rPr>
+              <w:t xml:space="preserve">Just outside the line</w:t>
+            </w:r>
+          </w:p>
+          <w:p>
+            <w:r>
+              <w:t xml:space="preserve">Under the list, Seamline also names the pairs that just miss the distance screen: 13 more pairs sit between 40 and 42 km, the closest at 40.3 km. They are kept out of the ranking and every total, but shown so the 40 km line reads as a chosen threshold, not a cliff. Widen </w:t>
+            </w:r>
+            <w:r>
+              <w:rPr>
+                <w:b/>
+                <w:bCs/>
+              </w:rPr>
+              <w:t xml:space="preserve">Overlap within</w:t>
+            </w:r>
+            <w:r>
+              <w:t xml:space="preserve"> under Filters to include them.</w:t>
+            </w:r>
+          </w:p>
+        </w:tc>
+      </w:tr>
+    </w:tbl>
+    <w:p>
+      <w:pPr>
+        <w:pageBreakBefore/>
+      </w:pPr>
+    </w:p>
+    <w:p>
+      <w:pPr>
+        <w:keepNext/>
+        <w:spacing w:after="40" w:before="120"/>
+      </w:pPr>
+      <w:r>
+        <w:rPr>
+          <w:rFonts w:ascii="Consolas" w:cs="Consolas" w:eastAsia="Consolas" w:hAnsi="Consolas"/>
+          <w:color w:val="9A6B2F"/>
+          <w:spacing w:val="30"/>
+          <w:sz w:val="17"/>
+          <w:szCs w:val="17"/>
+        </w:rPr>
+        <w:t xml:space="preserve">05 · CLICK ANY PAIR</w:t>
+      </w:r>
+    </w:p>
+    <w:p>
+      <w:pPr>
+        <w:pStyle w:val="Heading1"/>
+      </w:pPr>
+      <w:r>
+        <w:t xml:space="preserve">A pair up close</w:t>
+      </w:r>
+    </w:p>
+    <w:p>
+      <w:pPr>
+        <w:keepNext/>
         <w:spacing w:after="40" w:before="80"/>
         <w:jc w:val="center"/>
       </w:pPr>
       <w:r>
         <w:drawing>
           <wp:inline distT="0" distB="0" distL="0" distR="0">
-            <wp:extent cx="4000500" cy="3105150"/>
+            <wp:extent cx="5943600" cy="3045609"/>
             <wp:effectExtent t="0" r="0" b="0" l="0"/>
-            <wp:docPr id="1" name="4-list.png" descr="Best opportunities first." title="Best opportunities first."/>
+            <wp:docPr id="3" name="pair.jpg" descr="Pair #4 of 169, Jasper - Okatie #2 and Plant McIntosh Unit 12, with the map flown to it." title="Pair #4 of 169, Jasper - Okatie #2 and Plant McIntosh Unit 12, with the map flown to it."/>
             <wp:cNvGraphicFramePr>
               <a:graphicFrameLocks xmlns:a="http://schemas.openxmlformats.org/drawingml/2006/main" noChangeAspect="1"/>
             </wp:cNvGraphicFramePr>
@@ -2531,7 +3149,7 @@
                     </pic:cNvPicPr>
                   </pic:nvPicPr>
                   <pic:blipFill>
-                    <a:blip r:embed="rId11" cstate="none"/>
+                    <a:blip r:embed="rId103" cstate="none"/>
                     <a:srcRect/>
                     <a:stretch>
                       <a:fillRect/>
@@ -2540,7 +3158,7 @@
                   <pic:spPr bwMode="auto">
                     <a:xfrm>
                       <a:off x="0" y="0"/>
-                      <a:ext cx="4000500" cy="3105150"/>
+                      <a:ext cx="5943600" cy="3045609"/>
                     </a:xfrm>
                     <a:prstGeom prst="rect">
                       <a:avLst/>
@@ -2566,7 +3184,7 @@
           <w:sz w:val="18"/>
           <w:szCs w:val="18"/>
         </w:rPr>
-        <w:t xml:space="preserve">Best opportunities first.</w:t>
+        <w:t xml:space="preserve">Pair #4 of 169, Jasper - Okatie #2 and Plant McIntosh Unit 12, with the map flown to it.</w:t>
       </w:r>
     </w:p>
     <w:p>
@@ -2574,110 +3192,34 @@
         <w:spacing w:after="140"/>
       </w:pPr>
       <w:r>
-        <w:t xml:space="preserve">Every flagged pair, best first. The order is: closer tier first, then pairs built at the same time, then shorter distance. Each row reads left to right:</w:t>
-      </w:r>
-    </w:p>
-    <w:p>
-      <w:pPr>
-        <w:pStyle w:val="ListParagraph"/>
-        <w:numPr>
-          <w:ilvl w:val="0"/>
-          <w:numId w:val="2"/>
-        </w:numPr>
-        <w:spacing w:after="80"/>
-      </w:pPr>
-      <w:r>
-        <w:rPr>
-          <w:b/>
-          <w:bCs/>
-        </w:rPr>
-        <w:t xml:space="preserve">The tier</w:t>
-      </w:r>
-      <w:r>
-        <w:t xml:space="preserve">, for example TOUCHING or SHARED CREWS, in the tier's color.</w:t>
-      </w:r>
-    </w:p>
-    <w:p>
-      <w:pPr>
-        <w:pStyle w:val="ListParagraph"/>
-        <w:numPr>
-          <w:ilvl w:val="0"/>
-          <w:numId w:val="2"/>
-        </w:numPr>
-        <w:spacing w:after="80"/>
-      </w:pPr>
-      <w:r>
-        <w:rPr>
-          <w:b/>
-          <w:bCs/>
-        </w:rPr>
-        <w:t xml:space="preserve">The distance</w:t>
-      </w:r>
-      <w:r>
-        <w:t xml:space="preserve"> between the closest points, for example 0 km.</w:t>
-      </w:r>
-    </w:p>
-    <w:p>
-      <w:pPr>
-        <w:pStyle w:val="ListParagraph"/>
-        <w:numPr>
-          <w:ilvl w:val="0"/>
-          <w:numId w:val="2"/>
-        </w:numPr>
-        <w:spacing w:after="80"/>
-      </w:pPr>
-      <w:r>
-        <w:rPr>
-          <w:b/>
-          <w:bCs/>
-        </w:rPr>
-        <w:t xml:space="preserve">The timing</w:t>
-      </w:r>
-      <w:r>
-        <w:t xml:space="preserve">: "13 mo same window" means both jobs are under way together for 13 months; "6 mo apart" means they miss each other.</w:t>
-      </w:r>
-    </w:p>
-    <w:p>
-      <w:pPr>
-        <w:pStyle w:val="ListParagraph"/>
-        <w:numPr>
-          <w:ilvl w:val="0"/>
-          <w:numId w:val="2"/>
-        </w:numPr>
-        <w:spacing w:after="80"/>
-      </w:pPr>
-      <w:r>
-        <w:rPr>
-          <w:b/>
-          <w:bCs/>
-        </w:rPr>
-        <w:t xml:space="preserve">The rough savings</w:t>
-      </w:r>
-      <w:r>
-        <w:t xml:space="preserve">, for example ~$1.0M.</w:t>
-      </w:r>
-    </w:p>
-    <w:p>
-      <w:pPr>
-        <w:pStyle w:val="ListParagraph"/>
-        <w:numPr>
-          <w:ilvl w:val="0"/>
-          <w:numId w:val="2"/>
-        </w:numPr>
-        <w:spacing w:after="80"/>
-      </w:pPr>
-      <w:r>
-        <w:t xml:space="preserve">Below that, </w:t>
-      </w:r>
-      <w:r>
-        <w:rPr>
-          <w:b/>
-          <w:bCs/>
-        </w:rPr>
-        <w:t xml:space="preserve">the two project names</w:t>
-      </w:r>
-      <w:r>
-        <w:t xml:space="preserve">, colored by company, with their in-service dates.</w:t>
+        <w:rPr>
+          <w:b/>
+          <w:bCs/>
+        </w:rPr>
+        <w:t xml:space="preserve">The top line.</w:t>
+      </w:r>
+      <w:r>
+        <w:t xml:space="preserve"> Back to Overlaps, the pair's rank (#4 of 169), and the </w:t>
+      </w:r>
+      <w:r>
+        <w:rPr>
+          <w:b/>
+          <w:bCs/>
+        </w:rPr>
+        <w:t xml:space="preserve">3D illustration</w:t>
+      </w:r>
+      <w:r>
+        <w:t xml:space="preserve"> and </w:t>
+      </w:r>
+      <w:r>
+        <w:rPr>
+          <w:b/>
+          <w:bCs/>
+        </w:rPr>
+        <w:t xml:space="preserve">Coordination brief</w:t>
+      </w:r>
+      <w:r>
+        <w:t xml:space="preserve"> buttons. The tag gives the tier, and the four facts give the closest points, how the build windows line up, the chance and the expected savings.</w:t>
       </w:r>
     </w:p>
     <w:p>
@@ -2685,23 +3227,124 @@
         <w:spacing w:after="140"/>
       </w:pPr>
       <w:r>
-        <w:t xml:space="preserve">Type in the filter box to search by project or place. </w:t>
-      </w:r>
-      <w:r>
-        <w:rPr>
-          <w:b/>
-          <w:bCs/>
-        </w:rPr>
-        <w:t xml:space="preserve">Copy as CSV</w:t>
-      </w:r>
-      <w:r>
-        <w:t xml:space="preserve"> copies the list so you can paste it into Excel or Google Sheets.</w:t>
-      </w:r>
+        <w:rPr>
+          <w:b/>
+          <w:bCs/>
+        </w:rPr>
+        <w:t xml:space="preserve">The chance.</w:t>
+      </w:r>
+      <w:r>
+        <w:t xml:space="preserve"> A colored box explains it in words. Pair #4 is six months apart on paper, but it has a </w:t>
+      </w:r>
+      <w:r>
+        <w:rPr>
+          <w:b/>
+          <w:bCs/>
+        </w:rPr>
+        <w:t xml:space="preserve">68%</w:t>
+      </w:r>
+      <w:r>
+        <w:t xml:space="preserve"> chance of both crews being in the field together, because DESC's dates usually move later. The number is the share of 2,000 schedule draws in which both are working at the same time from today on.</w:t>
+      </w:r>
+    </w:p>
+    <w:p>
+      <w:pPr>
+        <w:spacing w:after="140"/>
+      </w:pPr>
+      <w:r>
+        <w:rPr>
+          <w:b/>
+          <w:bCs/>
+        </w:rPr>
+        <w:t xml:space="preserve">Side by side.</w:t>
+      </w:r>
+      <w:r>
+        <w:t xml:space="preserve"> Each project's work, build window ("est." when the start is estimated), plan drift since the previous plan, cost, how each end point was located, and a link to the page of the public plan it came from.</w:t>
+      </w:r>
+    </w:p>
+    <w:p>
+      <w:pPr>
+        <w:spacing w:after="140"/>
+      </w:pPr>
+      <w:r>
+        <w:rPr>
+          <w:b/>
+          <w:bCs/>
+        </w:rPr>
+        <w:t xml:space="preserve">What they can share.</w:t>
+      </w:r>
+      <w:r>
+        <w:t xml:space="preserve"> Every item the pair's tier allows, each with its own dollar figure and the math under it, like "20 days × $6.5K/day × 50%". </w:t>
+      </w:r>
+      <w:r>
+        <w:rPr>
+          <w:b/>
+          <w:bCs/>
+        </w:rPr>
+        <w:t xml:space="preserve">Edit unit costs</w:t>
+      </w:r>
+      <w:r>
+        <w:t xml:space="preserve"> opens the numbers behind them. Below that, the pair's best shared yard.</w:t>
+      </w:r>
+    </w:p>
+    <w:p>
+      <w:pPr>
+        <w:spacing w:after="140"/>
+      </w:pPr>
+      <w:r>
+        <w:rPr>
+          <w:b/>
+          <w:bCs/>
+        </w:rPr>
+        <w:t xml:space="preserve">Schedule what-if.</w:t>
+      </w:r>
+      <w:r>
+        <w:t xml:space="preserve"> Choose which company's project to move, then slide it up to three years earlier or later. The chart shows both build windows and the months they share, with a dashed outline where the moved project was; the savings update as you slide. </w:t>
+      </w:r>
+      <w:r>
+        <w:rPr>
+          <w:b/>
+          <w:bCs/>
+        </w:rPr>
+        <w:t xml:space="preserve">Try …</w:t>
+      </w:r>
+      <w:r>
+        <w:t xml:space="preserve"> jumps to the suggested move when there is one, and </w:t>
+      </w:r>
+      <w:r>
+        <w:rPr>
+          <w:b/>
+          <w:bCs/>
+        </w:rPr>
+        <w:t xml:space="preserve">Reset to plan</w:t>
+      </w:r>
+      <w:r>
+        <w:t xml:space="preserve"> puts the dates back.</w:t>
+      </w:r>
+    </w:p>
+    <w:p>
+      <w:pPr>
+        <w:spacing w:after="140"/>
+      </w:pPr>
+      <w:r>
+        <w:rPr>
+          <w:b/>
+          <w:bCs/>
+        </w:rPr>
+        <w:t xml:space="preserve">Status.</w:t>
+      </w:r>
+      <w:r>
+        <w:t xml:space="preserve"> Mark the pair Open, Contacted, Coordinating or Not pursuing. It's saved on that device and shows in the list.</w:t>
+      </w:r>
+    </w:p>
+    <w:p>
+      <w:pPr>
+        <w:pageBreakBefore/>
+      </w:pPr>
     </w:p>
     <w:p>
       <w:pPr>
         <w:keepNext/>
-        <w:pageBreakBefore/>
         <w:spacing w:after="40" w:before="120"/>
       </w:pPr>
       <w:r>
@@ -2712,7 +3355,7 @@
           <w:sz w:val="17"/>
           <w:szCs w:val="17"/>
         </w:rPr>
-        <w:t xml:space="preserve">05 · CLICK ANY PAIR</w:t>
+        <w:t xml:space="preserve">06 · PLANS MOVE</w:t>
       </w:r>
     </w:p>
     <w:p>
@@ -2720,20 +3363,21 @@
         <w:pStyle w:val="Heading1"/>
       </w:pPr>
       <w:r>
-        <w:t xml:space="preserve">A pair up close</w:t>
-      </w:r>
-    </w:p>
-    <w:p>
-      <w:pPr>
+        <w:t xml:space="preserve">How plans change</w:t>
+      </w:r>
+    </w:p>
+    <w:p>
+      <w:pPr>
+        <w:keepNext/>
         <w:spacing w:after="40" w:before="80"/>
         <w:jc w:val="center"/>
       </w:pPr>
       <w:r>
         <w:drawing>
           <wp:inline distT="0" distB="0" distL="0" distR="0">
-            <wp:extent cx="2552700" cy="7239000"/>
+            <wp:extent cx="5943600" cy="3045609"/>
             <wp:effectExtent t="0" r="0" b="0" l="0"/>
-            <wp:docPr id="1" name="5-detail.png" descr="A pair's details after pressing the suggested move." title="A pair's details after pressing the suggested move."/>
+            <wp:docPr id="4" name="changes.jpg" descr="Changes: how each company's dates moved, and the shared windows the latest plans opened." title="Changes: how each company's dates moved, and the shared windows the latest plans opened."/>
             <wp:cNvGraphicFramePr>
               <a:graphicFrameLocks xmlns:a="http://schemas.openxmlformats.org/drawingml/2006/main" noChangeAspect="1"/>
             </wp:cNvGraphicFramePr>
@@ -2747,7 +3391,7 @@
                     </pic:cNvPicPr>
                   </pic:nvPicPr>
                   <pic:blipFill>
-                    <a:blip r:embed="rId12" cstate="none"/>
+                    <a:blip r:embed="rId104" cstate="none"/>
                     <a:srcRect/>
                     <a:stretch>
                       <a:fillRect/>
@@ -2756,7 +3400,7 @@
                   <pic:spPr bwMode="auto">
                     <a:xfrm>
                       <a:off x="0" y="0"/>
-                      <a:ext cx="2552700" cy="7239000"/>
+                      <a:ext cx="5943600" cy="3045609"/>
                     </a:xfrm>
                     <a:prstGeom prst="rect">
                       <a:avLst/>
@@ -2782,7 +3426,7 @@
           <w:sz w:val="18"/>
           <w:szCs w:val="18"/>
         </w:rPr>
-        <w:t xml:space="preserve">A pair's details after pressing the suggested move.</w:t>
+        <w:t xml:space="preserve">Changes: how each company's dates moved, and the shared windows the latest plans opened.</w:t>
       </w:r>
     </w:p>
     <w:p>
@@ -2790,14 +3434,57 @@
         <w:spacing w:after="140"/>
       </w:pPr>
       <w:r>
-        <w:rPr>
-          <w:b/>
-          <w:bCs/>
-        </w:rPr>
-        <w:t xml:space="preserve">Project cards.</w:t>
-      </w:r>
-      <w:r>
-        <w:t xml:space="preserve"> Each project's company, voltage, type, length, cost, estimated start and in-service date, with a link to the public plan it came from.</w:t>
+        <w:t xml:space="preserve">An overlap on paper is not an overlap in the field, because planned dates move. </w:t>
+      </w:r>
+      <w:r>
+        <w:rPr>
+          <w:b/>
+          <w:bCs/>
+        </w:rPr>
+        <w:t xml:space="preserve">Changes</w:t>
+      </w:r>
+      <w:r>
+        <w:t xml:space="preserve"> shows how much, from the plans themselves.</w:t>
+      </w:r>
+    </w:p>
+    <w:p>
+      <w:pPr>
+        <w:pStyle w:val="ListParagraph"/>
+        <w:numPr>
+          <w:ilvl w:val="0"/>
+          <w:numId w:val="2"/>
+        </w:numPr>
+        <w:spacing w:after="80"/>
+      </w:pPr>
+      <w:r>
+        <w:rPr>
+          <w:b/>
+          <w:bCs/>
+        </w:rPr>
+        <w:t xml:space="preserve">DESC:</w:t>
+      </w:r>
+      <w:r>
+        <w:t xml:space="preserve"> 30 projects appear in both the 2024-2028 and the 2026-2030 lists. 23 of them moved later, 12 months at the median; none moved earlier.</w:t>
+      </w:r>
+    </w:p>
+    <w:p>
+      <w:pPr>
+        <w:pStyle w:val="ListParagraph"/>
+        <w:numPr>
+          <w:ilvl w:val="0"/>
+          <w:numId w:val="2"/>
+        </w:numPr>
+        <w:spacing w:after="80"/>
+      </w:pPr>
+      <w:r>
+        <w:rPr>
+          <w:b/>
+          <w:bCs/>
+        </w:rPr>
+        <w:t xml:space="preserve">Georgia:</w:t>
+      </w:r>
+      <w:r>
+        <w:t xml:space="preserve"> each project page says how it changed since the previous ten-year plan. Of 94 projects with a history, 66 kept their date, 16 moved later and 12 earlier.</w:t>
       </w:r>
     </w:p>
     <w:p>
@@ -2805,103 +3492,37 @@
         <w:spacing w:after="140"/>
       </w:pPr>
       <w:r>
-        <w:rPr>
-          <w:b/>
-          <w:bCs/>
-        </w:rPr>
-        <w:t xml:space="preserve">Why this pair.</w:t>
-      </w:r>
-      <w:r>
-        <w:t xml:space="preserve"> A plain summary: how close they are, what that tier lets them share, how their schedules line up, and anything else they have in common, like the same crew type or heavy cranes.</w:t>
-      </w:r>
-    </w:p>
-    <w:p>
-      <w:pPr>
-        <w:spacing w:after="140"/>
-      </w:pPr>
-      <w:r>
-        <w:rPr>
-          <w:b/>
-          <w:bCs/>
-        </w:rPr>
-        <w:t xml:space="preserve">What if a schedule moved?</w:t>
-      </w:r>
-      <w:r>
-        <w:t xml:space="preserve"> Choose which project to move, then slide it earlier or later. The bars show both build windows, the green band is the time they overlap, and the dashed outline is where the moved project was. The savings update as you slide, and the note says how much better or worse the move is than the plan.</w:t>
-      </w:r>
-    </w:p>
-    <w:p>
-      <w:pPr>
-        <w:spacing w:after="140"/>
-      </w:pPr>
-      <w:r>
-        <w:t xml:space="preserve">The </w:t>
-      </w:r>
-      <w:r>
-        <w:rPr>
-          <w:b/>
-          <w:bCs/>
-        </w:rPr>
-        <w:t xml:space="preserve">Try …</w:t>
-      </w:r>
-      <w:r>
-        <w:t xml:space="preserve"> button picks the smallest move that gives both jobs at least six months together. It only appears when the plan doesn't already share that much time. </w:t>
-      </w:r>
-      <w:r>
-        <w:rPr>
-          <w:b/>
-          <w:bCs/>
-        </w:rPr>
-        <w:t xml:space="preserve">Reset to plan</w:t>
-      </w:r>
-      <w:r>
-        <w:t xml:space="preserve"> puts the dates back. In this example, the Jasper to Okatie line and McIntosh Unit 12 miss each other by six months. Starting McIntosh a year earlier gives them six months together and unlocks about </w:t>
-      </w:r>
-      <w:r>
-        <w:rPr>
-          <w:b/>
-          <w:bCs/>
-        </w:rPr>
-        <w:t xml:space="preserve">$643K</w:t>
-      </w:r>
-      <w:r>
-        <w:t xml:space="preserve">: $482K of shared crew mobilization, $65K of crane time and $96K of contractor setup.</w:t>
-      </w:r>
-    </w:p>
-    <w:p>
-      <w:pPr>
-        <w:spacing w:after="140"/>
-      </w:pPr>
-      <w:r>
-        <w:rPr>
-          <w:b/>
-          <w:bCs/>
-        </w:rPr>
-        <w:t xml:space="preserve">What they can share.</w:t>
-      </w:r>
-      <w:r>
-        <w:t xml:space="preserve"> Every item the pair's tier allows, each with its own dollar figure and the math under it, like "20 days × $6.5K/day × 50%". Items that need both jobs running at the same time are greyed out until they are.</w:t>
-      </w:r>
-    </w:p>
-    <w:p>
-      <w:pPr>
-        <w:spacing w:after="140"/>
-      </w:pPr>
-      <w:r>
-        <w:rPr>
-          <w:b/>
-          <w:bCs/>
-        </w:rPr>
-        <w:t xml:space="preserve">Cost and impact estimate.</w:t>
-      </w:r>
-      <w:r>
-        <w:t xml:space="preserve"> The total of those items.</w:t>
-      </w:r>
+        <w:t xml:space="preserve">Seamline then replays every pair with the dates the previous plan listed. The latest updates opened </w:t>
+      </w:r>
+      <w:r>
+        <w:rPr>
+          <w:b/>
+          <w:bCs/>
+        </w:rPr>
+        <w:t xml:space="preserve">9</w:t>
+      </w:r>
+      <w:r>
+        <w:t xml:space="preserve"> shared windows and closed </w:t>
+      </w:r>
+      <w:r>
+        <w:rPr>
+          <w:b/>
+          <w:bCs/>
+        </w:rPr>
+        <w:t xml:space="preserve">3</w:t>
+      </w:r>
+      <w:r>
+        <w:t xml:space="preserve">, each listed with the reason. For example, the challenge's reference overlap OVL_3 shares a window only because DESC moved Jasper - Okatie #2 eleven months later. The same history drives every chance in the app.</w:t>
+      </w:r>
+    </w:p>
+    <w:p>
+      <w:pPr>
+        <w:pageBreakBefore/>
+      </w:pPr>
     </w:p>
     <w:p>
       <w:pPr>
         <w:keepNext/>
-        <w:pageBreakBefore/>
         <w:spacing w:after="40" w:before="120"/>
       </w:pPr>
       <w:r>
@@ -2912,7 +3533,7 @@
           <w:sz w:val="17"/>
           <w:szCs w:val="17"/>
         </w:rPr>
-        <w:t xml:space="preserve">06 · WHEN</w:t>
+        <w:t xml:space="preserve">07 · WHAT TO DO ABOUT IT</w:t>
       </w:r>
     </w:p>
     <w:p>
@@ -2920,20 +3541,21 @@
         <w:pStyle w:val="Heading1"/>
       </w:pPr>
       <w:r>
-        <w:t xml:space="preserve">The construction timeline</w:t>
-      </w:r>
-    </w:p>
-    <w:p>
-      <w:pPr>
+        <w:t xml:space="preserve">The schedule optimizer</w:t>
+      </w:r>
+    </w:p>
+    <w:p>
+      <w:pPr>
+        <w:keepNext/>
         <w:spacing w:after="40" w:before="80"/>
         <w:jc w:val="center"/>
       </w:pPr>
       <w:r>
         <w:drawing>
           <wp:inline distT="0" distB="0" distL="0" distR="0">
-            <wp:extent cx="5943600" cy="1619250"/>
+            <wp:extent cx="5943600" cy="3045609"/>
             <wp:effectExtent t="0" r="0" b="0" l="0"/>
-            <wp:docPr id="1" name="6-timeline.png" descr="One bar per flagged project." title="One bar per flagged project."/>
+            <wp:docPr id="5" name="optimize.jpg" descr="Plan: the date moves that raise expected savings the most." title="Plan: the date moves that raise expected savings the most."/>
             <wp:cNvGraphicFramePr>
               <a:graphicFrameLocks xmlns:a="http://schemas.openxmlformats.org/drawingml/2006/main" noChangeAspect="1"/>
             </wp:cNvGraphicFramePr>
@@ -2947,7 +3569,7 @@
                     </pic:cNvPicPr>
                   </pic:nvPicPr>
                   <pic:blipFill>
-                    <a:blip r:embed="rId13" cstate="none"/>
+                    <a:blip r:embed="rId105" cstate="none"/>
                     <a:srcRect/>
                     <a:stretch>
                       <a:fillRect/>
@@ -2956,7 +3578,7 @@
                   <pic:spPr bwMode="auto">
                     <a:xfrm>
                       <a:off x="0" y="0"/>
-                      <a:ext cx="5943600" cy="1619250"/>
+                      <a:ext cx="5943600" cy="3045609"/>
                     </a:xfrm>
                     <a:prstGeom prst="rect">
                       <a:avLst/>
@@ -2982,7 +3604,7 @@
           <w:sz w:val="18"/>
           <w:szCs w:val="18"/>
         </w:rPr>
-        <w:t xml:space="preserve">One bar per flagged project.</w:t>
+        <w:t xml:space="preserve">Plan: the date moves that raise expected savings the most.</w:t>
       </w:r>
     </w:p>
     <w:p>
@@ -2990,13 +3612,97 @@
         <w:spacing w:after="140"/>
       </w:pPr>
       <w:r>
-        <w:t xml:space="preserve">Each bar runs from the estimated start to the planned in-service date, with a solid tick at the end. When you pick a pair, its two bars stay bright, the rest fade, and the months they share are shaded. During playback, a line marks the current month.</w:t>
-      </w:r>
+        <w:rPr>
+          <w:b/>
+          <w:bCs/>
+        </w:rPr>
+        <w:t xml:space="preserve">Plan</w:t>
+      </w:r>
+      <w:r>
+        <w:t xml:space="preserve"> asks which few date moves would raise the pairs' total expected savings the most. It only moves projects that haven't started, by 3 or 6 months, never to before today, and stops when no move is worth $25K.</w:t>
+      </w:r>
+    </w:p>
+    <w:p>
+      <w:pPr>
+        <w:spacing w:after="140"/>
+      </w:pPr>
+      <w:r>
+        <w:t xml:space="preserve">On the built-in data, </w:t>
+      </w:r>
+      <w:r>
+        <w:rPr>
+          <w:b/>
+          <w:bCs/>
+        </w:rPr>
+        <w:t xml:space="preserve">8 moves</w:t>
+      </w:r>
+      <w:r>
+        <w:t xml:space="preserve"> of at most 6 months raise expected savings from </w:t>
+      </w:r>
+      <w:r>
+        <w:rPr>
+          <w:b/>
+          <w:bCs/>
+        </w:rPr>
+        <w:t xml:space="preserve">$13.6M to $16.1M</w:t>
+      </w:r>
+      <w:r>
+        <w:t xml:space="preserve">, and 42 pairs become more likely to share a crew window. Most bring a Georgia project earlier, toward where DESC's usually late dates are likely to land. Each row names the move, the new in-service date, the pair it helps most, and what it adds.</w:t>
+      </w:r>
+    </w:p>
+    <w:p>
+      <w:pPr>
+        <w:spacing w:after="140"/>
+      </w:pPr>
+      <w:r>
+        <w:rPr>
+          <w:b/>
+          <w:bCs/>
+        </w:rPr>
+        <w:t xml:space="preserve">Largest move</w:t>
+      </w:r>
+      <w:r>
+        <w:t xml:space="preserve"> and </w:t>
+      </w:r>
+      <w:r>
+        <w:rPr>
+          <w:b/>
+          <w:bCs/>
+        </w:rPr>
+        <w:t xml:space="preserve">Move</w:t>
+      </w:r>
+      <w:r>
+        <w:t xml:space="preserve"> (both companies, or just one) set the limits. </w:t>
+      </w:r>
+      <w:r>
+        <w:rPr>
+          <w:b/>
+          <w:bCs/>
+        </w:rPr>
+        <w:t xml:space="preserve">Show on map</w:t>
+      </w:r>
+      <w:r>
+        <w:t xml:space="preserve"> draws the moves; </w:t>
+      </w:r>
+      <w:r>
+        <w:rPr>
+          <w:b/>
+          <w:bCs/>
+        </w:rPr>
+        <w:t xml:space="preserve">Joint brief</w:t>
+      </w:r>
+      <w:r>
+        <w:t xml:space="preserve"> prints them as a joint schedule proposal for both planning teams (section 10).</w:t>
+      </w:r>
+    </w:p>
+    <w:p>
+      <w:pPr>
+        <w:pageBreakBefore/>
+      </w:pPr>
     </w:p>
     <w:p>
       <w:pPr>
         <w:keepNext/>
-        <w:pageBreakBefore/>
         <w:spacing w:after="40" w:before="120"/>
       </w:pPr>
       <w:r>
@@ -3007,7 +3713,7 @@
           <w:sz w:val="17"/>
           <w:szCs w:val="17"/>
         </w:rPr>
-        <w:t xml:space="preserve">07 · SOMETHING TO HAND OVER</w:t>
+        <w:t xml:space="preserve">08 · WHEN</w:t>
       </w:r>
     </w:p>
     <w:p>
@@ -3015,20 +3721,466 @@
         <w:pStyle w:val="Heading1"/>
       </w:pPr>
       <w:r>
-        <w:t xml:space="preserve">The coordination brief</w:t>
-      </w:r>
-    </w:p>
-    <w:p>
-      <w:pPr>
+        <w:t xml:space="preserve">The build-windows chart</w:t>
+      </w:r>
+    </w:p>
+    <w:p>
+      <w:pPr>
+        <w:spacing w:after="140"/>
+      </w:pPr>
+      <w:r>
+        <w:t xml:space="preserve">Press </w:t>
+      </w:r>
+      <w:r>
+        <w:rPr>
+          <w:b/>
+          <w:bCs/>
+        </w:rPr>
+        <w:t xml:space="preserve">Windows</w:t>
+      </w:r>
+      <w:r>
+        <w:t xml:space="preserve"> in the rail to unfold the build-windows chart under the map. It has one bar per project for the top pairs in the list, running from the start to the planned in-service date, green where both projects in a pair are in the field. When you pick a pair, its two bars stay bright and the rest fade.</w:t>
+      </w:r>
+    </w:p>
+    <w:tbl>
+      <w:tblPr>
+        <w:tblW w:type="dxa" w:w="9360"/>
+        <w:tblBorders>
+          <w:top w:val="single" w:color="auto" w:sz="4"/>
+          <w:left w:val="single" w:color="auto" w:sz="4"/>
+          <w:bottom w:val="single" w:color="auto" w:sz="4"/>
+          <w:right w:val="single" w:color="auto" w:sz="4"/>
+          <w:insideH w:val="single" w:color="auto" w:sz="4"/>
+          <w:insideV w:val="single" w:color="auto" w:sz="4"/>
+        </w:tblBorders>
+      </w:tblPr>
+      <w:tblGrid>
+        <w:gridCol w:w="9360"/>
+      </w:tblGrid>
+      <w:tr>
+        <w:tc>
+          <w:tcPr>
+            <w:tcW w:type="dxa" w:w="9360"/>
+            <w:tcBorders>
+              <w:top w:val="none" w:color="FFFFFF" w:sz="0"/>
+              <w:left w:val="single" w:color="9A6B2F" w:sz="24"/>
+              <w:bottom w:val="none" w:color="FFFFFF" w:sz="0"/>
+              <w:right w:val="none" w:color="FFFFFF" w:sz="0"/>
+            </w:tcBorders>
+            <w:shd w:fill="F6EFE4" w:color="auto" w:val="clear"/>
+            <w:tcMar>
+              <w:top w:type="dxa" w:w="140"/>
+              <w:left w:type="dxa" w:w="200"/>
+              <w:bottom w:type="dxa" w:w="140"/>
+              <w:right w:type="dxa" w:w="200"/>
+            </w:tcMar>
+          </w:tcPr>
+          <w:p>
+            <w:pPr>
+              <w:spacing w:after="60"/>
+            </w:pPr>
+            <w:r>
+              <w:rPr>
+                <w:b/>
+                <w:bCs/>
+                <w:color w:val="9A6B2F"/>
+                <w:sz w:val="24"/>
+                <w:szCs w:val="24"/>
+              </w:rPr>
+              <w:t xml:space="preserve">Play the build years</w:t>
+            </w:r>
+          </w:p>
+          <w:p>
+            <w:r>
+              <w:t xml:space="preserve">Press </w:t>
+            </w:r>
+            <w:r>
+              <w:rPr>
+                <w:b/>
+                <w:bCs/>
+              </w:rPr>
+              <w:t xml:space="preserve">Play</w:t>
+            </w:r>
+            <w:r>
+              <w:t xml:space="preserve"> in the Build windows bar under the map and it steps forward one month at a time. Projects light up while they're under construction and fade outside it. When both projects in a flagged pair are under construction in the same month, the pair sparks: that's a live chance to share. Drag the slider to jump to any month; the label at the end goes back to </w:t>
+            </w:r>
+            <w:r>
+              <w:rPr>
+                <w:b/>
+                <w:bCs/>
+              </w:rPr>
+              <w:t xml:space="preserve">All years</w:t>
+            </w:r>
+            <w:r>
+              <w:t xml:space="preserve">.</w:t>
+            </w:r>
+          </w:p>
+        </w:tc>
+      </w:tr>
+    </w:tbl>
+    <w:p>
+      <w:pPr>
+        <w:pageBreakBefore/>
+      </w:pPr>
+    </w:p>
+    <w:p>
+      <w:pPr>
+        <w:keepNext/>
+        <w:spacing w:after="40" w:before="120"/>
+      </w:pPr>
+      <w:r>
+        <w:rPr>
+          <w:rFonts w:ascii="Consolas" w:cs="Consolas" w:eastAsia="Consolas" w:hAnsi="Consolas"/>
+          <w:color w:val="9A6B2F"/>
+          <w:spacing w:val="30"/>
+          <w:sz w:val="17"/>
+          <w:szCs w:val="17"/>
+        </w:rPr>
+        <w:t xml:space="preserve">09 · WHERE THE NUMBERS COME FROM</w:t>
+      </w:r>
+    </w:p>
+    <w:p>
+      <w:pPr>
+        <w:pStyle w:val="Heading1"/>
+      </w:pPr>
+      <w:r>
+        <w:t xml:space="preserve">Data checks</w:t>
+      </w:r>
+    </w:p>
+    <w:p>
+      <w:pPr>
+        <w:spacing w:after="140"/>
+      </w:pPr>
+      <w:r>
+        <w:rPr>
+          <w:b/>
+          <w:bCs/>
+        </w:rPr>
+        <w:t xml:space="preserve">Checks</w:t>
+      </w:r>
+      <w:r>
+        <w:t xml:space="preserve"> shows the data pipeline's validation report. The top line traces the numbers: 2 PDFs → 262 official records → the newer SCRTP and SERTP lists → the projects on the map → 169 overlaps. A test confirms Seamline reproduces </w:t>
+      </w:r>
+      <w:r>
+        <w:rPr>
+          <w:b/>
+          <w:bCs/>
+        </w:rPr>
+        <w:t xml:space="preserve">all 6</w:t>
+      </w:r>
+      <w:r>
+        <w:t xml:space="preserve"> overlaps in the challenge's reference table (6 of 6), measured between closest points as the challenge asks.</w:t>
+      </w:r>
+    </w:p>
+    <w:p>
+      <w:pPr>
+        <w:spacing w:after="140"/>
+      </w:pPr>
+      <w:r>
+        <w:t xml:space="preserve">Below that are the 10 checks that run on every rebuild: every row of both PDFs read, detail pages matched, start dates before need dates, TEAMS numbers unique, projects in two plans counted once, OpenStreetMap namesakes rejected, line end points consistent with the plan's line length, projects not placed, dates already passed, and plan-change notes not understood. Open one to see the records it caught. The report downloads as JSON. The 4 marked for review are the number on the rail.</w:t>
+      </w:r>
+    </w:p>
+    <w:p>
+      <w:pPr>
+        <w:pageBreakBefore/>
+      </w:pPr>
+    </w:p>
+    <w:p>
+      <w:pPr>
+        <w:keepNext/>
+        <w:spacing w:after="40" w:before="120"/>
+      </w:pPr>
+      <w:r>
+        <w:rPr>
+          <w:rFonts w:ascii="Consolas" w:cs="Consolas" w:eastAsia="Consolas" w:hAnsi="Consolas"/>
+          <w:color w:val="9A6B2F"/>
+          <w:spacing w:val="30"/>
+          <w:sz w:val="17"/>
+          <w:szCs w:val="17"/>
+        </w:rPr>
+        <w:t xml:space="preserve">10 · SOMETHING TO HAND OVER</w:t>
+      </w:r>
+    </w:p>
+    <w:p>
+      <w:pPr>
+        <w:pStyle w:val="Heading1"/>
+      </w:pPr>
+      <w:r>
+        <w:t xml:space="preserve">Briefs, proposals and reports</w:t>
+      </w:r>
+    </w:p>
+    <w:p>
+      <w:pPr>
+        <w:spacing w:after="140"/>
+      </w:pPr>
+      <w:r>
+        <w:t xml:space="preserve">Seamline prints three kinds of page. Each opens in a window with </w:t>
+      </w:r>
+      <w:r>
+        <w:rPr>
+          <w:b/>
+          <w:bCs/>
+        </w:rPr>
+        <w:t xml:space="preserve">Print or save as PDF</w:t>
+      </w:r>
+      <w:r>
+        <w:t xml:space="preserve"> and </w:t>
+      </w:r>
+      <w:r>
+        <w:rPr>
+          <w:b/>
+          <w:bCs/>
+        </w:rPr>
+        <w:t xml:space="preserve">Copy text</w:t>
+      </w:r>
+      <w:r>
+        <w:t xml:space="preserve"> to paste into an email. Printing works when the app is opened from the repo or a website.</w:t>
+      </w:r>
+    </w:p>
+    <w:tbl>
+      <w:tblPr>
+        <w:tblW w:type="dxa" w:w="9360"/>
+        <w:tblBorders>
+          <w:top w:val="single" w:color="auto" w:sz="4"/>
+          <w:left w:val="single" w:color="auto" w:sz="4"/>
+          <w:bottom w:val="single" w:color="auto" w:sz="4"/>
+          <w:right w:val="single" w:color="auto" w:sz="4"/>
+          <w:insideH w:val="single" w:color="auto" w:sz="4"/>
+          <w:insideV w:val="single" w:color="auto" w:sz="4"/>
+        </w:tblBorders>
+      </w:tblPr>
+      <w:tblGrid>
+        <w:gridCol w:w="2600"/>
+        <w:gridCol w:w="6760"/>
+      </w:tblGrid>
+      <w:tr>
+        <w:tc>
+          <w:tcPr>
+            <w:tcW w:type="dxa" w:w="2600"/>
+            <w:tcBorders>
+              <w:top w:val="single" w:color="D5DEDD" w:sz="4"/>
+              <w:left w:val="single" w:color="D5DEDD" w:sz="4"/>
+              <w:bottom w:val="single" w:color="D5DEDD" w:sz="4"/>
+              <w:right w:val="single" w:color="D5DEDD" w:sz="4"/>
+            </w:tcBorders>
+            <w:shd w:fill="F4F7F6" w:color="auto" w:val="clear"/>
+            <w:tcMar>
+              <w:top w:type="dxa" w:w="90"/>
+              <w:left w:type="dxa" w:w="120"/>
+              <w:bottom w:type="dxa" w:w="90"/>
+              <w:right w:type="dxa" w:w="120"/>
+            </w:tcMar>
+          </w:tcPr>
+          <w:p>
+            <w:r>
+              <w:rPr>
+                <w:b/>
+                <w:bCs/>
+              </w:rPr>
+              <w:t xml:space="preserve">Coordination brief</w:t>
+            </w:r>
+          </w:p>
+        </w:tc>
+        <w:tc>
+          <w:tcPr>
+            <w:tcW w:type="dxa" w:w="6760"/>
+            <w:tcBorders>
+              <w:top w:val="single" w:color="D5DEDD" w:sz="4"/>
+              <w:left w:val="single" w:color="D5DEDD" w:sz="4"/>
+              <w:bottom w:val="single" w:color="D5DEDD" w:sz="4"/>
+              <w:right w:val="single" w:color="D5DEDD" w:sz="4"/>
+            </w:tcBorders>
+            <w:tcMar>
+              <w:top w:type="dxa" w:w="90"/>
+              <w:left w:type="dxa" w:w="120"/>
+              <w:bottom w:type="dxa" w:w="90"/>
+              <w:right w:type="dxa" w:w="120"/>
+            </w:tcMar>
+          </w:tcPr>
+          <w:p>
+            <w:r>
+              <w:t xml:space="preserve">Press </w:t>
+            </w:r>
+            <w:r>
+              <w:rPr>
+                <w:b/>
+                <w:bCs/>
+              </w:rPr>
+              <w:t xml:space="preserve">Coordination brief</w:t>
+            </w:r>
+            <w:r>
+              <w:t xml:space="preserve"> on any pair. A one-page memo addressed to both companies' planning teams: how close the projects are, when they overlap, the chance and what coordinating would save, a small locator map, both projects, each shareable item with its dollar figure and math, the best shared yard, and next steps. If you used the what-if and the move helps, the brief includes it and marks the new dates as proposed.</w:t>
+            </w:r>
+          </w:p>
+        </w:tc>
+      </w:tr>
+      <w:tr>
+        <w:tc>
+          <w:tcPr>
+            <w:tcW w:type="dxa" w:w="2600"/>
+            <w:tcBorders>
+              <w:top w:val="single" w:color="D5DEDD" w:sz="4"/>
+              <w:left w:val="single" w:color="D5DEDD" w:sz="4"/>
+              <w:bottom w:val="single" w:color="D5DEDD" w:sz="4"/>
+              <w:right w:val="single" w:color="D5DEDD" w:sz="4"/>
+            </w:tcBorders>
+            <w:shd w:fill="F4F7F6" w:color="auto" w:val="clear"/>
+            <w:tcMar>
+              <w:top w:type="dxa" w:w="90"/>
+              <w:left w:type="dxa" w:w="120"/>
+              <w:bottom w:type="dxa" w:w="90"/>
+              <w:right w:type="dxa" w:w="120"/>
+            </w:tcMar>
+          </w:tcPr>
+          <w:p>
+            <w:r>
+              <w:rPr>
+                <w:b/>
+                <w:bCs/>
+              </w:rPr>
+              <w:t xml:space="preserve">Joint schedule proposal</w:t>
+            </w:r>
+          </w:p>
+        </w:tc>
+        <w:tc>
+          <w:tcPr>
+            <w:tcW w:type="dxa" w:w="6760"/>
+            <w:tcBorders>
+              <w:top w:val="single" w:color="D5DEDD" w:sz="4"/>
+              <w:left w:val="single" w:color="D5DEDD" w:sz="4"/>
+              <w:bottom w:val="single" w:color="D5DEDD" w:sz="4"/>
+              <w:right w:val="single" w:color="D5DEDD" w:sz="4"/>
+            </w:tcBorders>
+            <w:tcMar>
+              <w:top w:type="dxa" w:w="90"/>
+              <w:left w:type="dxa" w:w="120"/>
+              <w:bottom w:type="dxa" w:w="90"/>
+              <w:right w:type="dxa" w:w="120"/>
+            </w:tcMar>
+          </w:tcPr>
+          <w:p>
+            <w:r>
+              <w:t xml:space="preserve">Press </w:t>
+            </w:r>
+            <w:r>
+              <w:rPr>
+                <w:b/>
+                <w:bCs/>
+              </w:rPr>
+              <w:t xml:space="preserve">Joint brief</w:t>
+            </w:r>
+            <w:r>
+              <w:t xml:space="preserve"> in Plan. The optimizer's date moves, what each adds, and the pairs they help, for both companies to agree on.</w:t>
+            </w:r>
+          </w:p>
+        </w:tc>
+      </w:tr>
+      <w:tr>
+        <w:tc>
+          <w:tcPr>
+            <w:tcW w:type="dxa" w:w="2600"/>
+            <w:tcBorders>
+              <w:top w:val="single" w:color="D5DEDD" w:sz="4"/>
+              <w:left w:val="single" w:color="D5DEDD" w:sz="4"/>
+              <w:bottom w:val="single" w:color="D5DEDD" w:sz="4"/>
+              <w:right w:val="single" w:color="D5DEDD" w:sz="4"/>
+            </w:tcBorders>
+            <w:shd w:fill="F4F7F6" w:color="auto" w:val="clear"/>
+            <w:tcMar>
+              <w:top w:type="dxa" w:w="90"/>
+              <w:left w:type="dxa" w:w="120"/>
+              <w:bottom w:type="dxa" w:w="90"/>
+              <w:right w:type="dxa" w:w="120"/>
+            </w:tcMar>
+          </w:tcPr>
+          <w:p>
+            <w:r>
+              <w:rPr>
+                <w:b/>
+                <w:bCs/>
+              </w:rPr>
+              <w:t xml:space="preserve">Report</w:t>
+            </w:r>
+          </w:p>
+        </w:tc>
+        <w:tc>
+          <w:tcPr>
+            <w:tcW w:type="dxa" w:w="6760"/>
+            <w:tcBorders>
+              <w:top w:val="single" w:color="D5DEDD" w:sz="4"/>
+              <w:left w:val="single" w:color="D5DEDD" w:sz="4"/>
+              <w:bottom w:val="single" w:color="D5DEDD" w:sz="4"/>
+              <w:right w:val="single" w:color="D5DEDD" w:sz="4"/>
+            </w:tcBorders>
+            <w:tcMar>
+              <w:top w:type="dxa" w:w="90"/>
+              <w:left w:type="dxa" w:w="120"/>
+              <w:bottom w:type="dxa" w:w="90"/>
+              <w:right w:type="dxa" w:w="120"/>
+            </w:tcMar>
+          </w:tcPr>
+          <w:p>
+            <w:r>
+              <w:t xml:space="preserve">A report over the whole comparison: pairs checked, pairs flagged, expected savings and the pairs just outside the screen, with the projects ranked. Ask for it in Ask, for example "a report of the longest projects"; this works without a key too.</w:t>
+            </w:r>
+          </w:p>
+        </w:tc>
+      </w:tr>
+    </w:tbl>
+    <w:p>
+      <w:pPr>
+        <w:spacing w:after="60"/>
+      </w:pPr>
+    </w:p>
+    <w:p>
+      <w:pPr>
+        <w:spacing w:after="140"/>
+      </w:pPr>
+      <w:r>
+        <w:t xml:space="preserve">Ask can open any of the three for you, and in Spanish when you ask in Spanish.</w:t>
+      </w:r>
+    </w:p>
+    <w:p>
+      <w:pPr>
+        <w:pageBreakBefore/>
+      </w:pPr>
+    </w:p>
+    <w:p>
+      <w:pPr>
+        <w:keepNext/>
+        <w:spacing w:after="40" w:before="120"/>
+      </w:pPr>
+      <w:r>
+        <w:rPr>
+          <w:rFonts w:ascii="Consolas" w:cs="Consolas" w:eastAsia="Consolas" w:hAnsi="Consolas"/>
+          <w:color w:val="9A6B2F"/>
+          <w:spacing w:val="30"/>
+          <w:sz w:val="17"/>
+          <w:szCs w:val="17"/>
+        </w:rPr>
+        <w:t xml:space="preserve">11 · JUST ASK</w:t>
+      </w:r>
+    </w:p>
+    <w:p>
+      <w:pPr>
+        <w:pStyle w:val="Heading1"/>
+      </w:pPr>
+      <w:r>
+        <w:t xml:space="preserve">Asking questions</w:t>
+      </w:r>
+    </w:p>
+    <w:p>
+      <w:pPr>
+        <w:keepNext/>
         <w:spacing w:after="40" w:before="80"/>
         <w:jc w:val="center"/>
       </w:pPr>
       <w:r>
         <w:drawing>
           <wp:inline distT="0" distB="0" distL="0" distR="0">
-            <wp:extent cx="4381500" cy="6372225"/>
+            <wp:extent cx="5943600" cy="3045609"/>
             <wp:effectExtent t="0" r="0" b="0" l="0"/>
-            <wp:docPr id="1" name="7-brief.png" descr="One page per pair, addressed to both companies." title="One page per pair, addressed to both companies."/>
+            <wp:docPr id="6" name="ask.jpg" descr="Ask with no API key: why a pair is not flagged, and one pair explained." title="Ask with no API key: why a pair is not flagged, and one pair explained."/>
             <wp:cNvGraphicFramePr>
               <a:graphicFrameLocks xmlns:a="http://schemas.openxmlformats.org/drawingml/2006/main" noChangeAspect="1"/>
             </wp:cNvGraphicFramePr>
@@ -3042,7 +4194,7 @@
                     </pic:cNvPicPr>
                   </pic:nvPicPr>
                   <pic:blipFill>
-                    <a:blip r:embed="rId14" cstate="none"/>
+                    <a:blip r:embed="rId106" cstate="none"/>
                     <a:srcRect/>
                     <a:stretch>
                       <a:fillRect/>
@@ -3051,7 +4203,7 @@
                   <pic:spPr bwMode="auto">
                     <a:xfrm>
                       <a:off x="0" y="0"/>
-                      <a:ext cx="4381500" cy="6372225"/>
+                      <a:ext cx="5943600" cy="3045609"/>
                     </a:xfrm>
                     <a:prstGeom prst="rect">
                       <a:avLst/>
@@ -3077,7 +4229,7 @@
           <w:sz w:val="18"/>
           <w:szCs w:val="18"/>
         </w:rPr>
-        <w:t xml:space="preserve">One page per pair, addressed to both companies.</w:t>
+        <w:t xml:space="preserve">Ask with no API key: why a pair is not flagged, and one pair explained.</w:t>
       </w:r>
     </w:p>
     <w:p>
@@ -3092,10 +4244,20 @@
           <w:b/>
           <w:bCs/>
         </w:rPr>
-        <w:t xml:space="preserve">Coordination brief</w:t>
-      </w:r>
-      <w:r>
-        <w:t xml:space="preserve"> on any pair and Seamline writes a one-page memo addressed to both companies' planning teams.</w:t>
+        <w:t xml:space="preserve">Ask</w:t>
+      </w:r>
+      <w:r>
+        <w:t xml:space="preserve"> in the rail or on the map and type a question in plain language, in English or Spanish (the </w:t>
+      </w:r>
+      <w:r>
+        <w:rPr>
+          <w:b/>
+          <w:bCs/>
+        </w:rPr>
+        <w:t xml:space="preserve">EN / ES</w:t>
+      </w:r>
+      <w:r>
+        <w:t xml:space="preserve"> switch at the top), or click one of the suggestions above the box. For example: "Which overlaps near Augusta are most likely to happen?", "Why isn't DESC-11 paired with IRP-20277?" or "¿Qué cambió en el plan de DESC?".</w:t>
       </w:r>
     </w:p>
     <w:p>
@@ -3103,46 +4265,96 @@
         <w:spacing w:after="140"/>
       </w:pPr>
       <w:r>
-        <w:t xml:space="preserve">It says in one paragraph how close the projects are, when they overlap, and roughly what coordinating would save. Then it shows a small locator map, the three key numbers, both projects, each shareable item with its dollar figure and math, and the next steps to take.</w:t>
-      </w:r>
+        <w:t xml:space="preserve">The assistant answers from the same data as the screen, using 14 tools: search and rank projects, list and explain overlaps, compare two projects, say why a pair is not flagged, plan changes, the schedule optimizer and the data checks, plus four that act on the page: show something on the map, and open a coordination brief, the joint schedule proposal or a report.</w:t>
+      </w:r>
+    </w:p>
+    <w:tbl>
+      <w:tblPr>
+        <w:tblW w:type="dxa" w:w="9360"/>
+        <w:tblBorders>
+          <w:top w:val="single" w:color="auto" w:sz="4"/>
+          <w:left w:val="single" w:color="auto" w:sz="4"/>
+          <w:bottom w:val="single" w:color="auto" w:sz="4"/>
+          <w:right w:val="single" w:color="auto" w:sz="4"/>
+          <w:insideH w:val="single" w:color="auto" w:sz="4"/>
+          <w:insideV w:val="single" w:color="auto" w:sz="4"/>
+        </w:tblBorders>
+      </w:tblPr>
+      <w:tblGrid>
+        <w:gridCol w:w="9360"/>
+      </w:tblGrid>
+      <w:tr>
+        <w:tc>
+          <w:tcPr>
+            <w:tcW w:type="dxa" w:w="9360"/>
+            <w:tcBorders>
+              <w:top w:val="none" w:color="FFFFFF" w:sz="0"/>
+              <w:left w:val="single" w:color="9A6B2F" w:sz="24"/>
+              <w:bottom w:val="none" w:color="FFFFFF" w:sz="0"/>
+              <w:right w:val="none" w:color="FFFFFF" w:sz="0"/>
+            </w:tcBorders>
+            <w:shd w:fill="F6EFE4" w:color="auto" w:val="clear"/>
+            <w:tcMar>
+              <w:top w:type="dxa" w:w="140"/>
+              <w:left w:type="dxa" w:w="200"/>
+              <w:bottom w:type="dxa" w:w="140"/>
+              <w:right w:type="dxa" w:w="200"/>
+            </w:tcMar>
+          </w:tcPr>
+          <w:p>
+            <w:pPr>
+              <w:spacing w:after="60"/>
+            </w:pPr>
+            <w:r>
+              <w:rPr>
+                <w:b/>
+                <w:bCs/>
+                <w:color w:val="9A6B2F"/>
+                <w:sz w:val="24"/>
+                <w:szCs w:val="24"/>
+              </w:rPr>
+              <w:t xml:space="preserve">No key needed for the common questions</w:t>
+            </w:r>
+          </w:p>
+          <w:p>
+            <w:r>
+              <w:t xml:space="preserve">Without an API key, or when it can't reach the internet, Ask still answers the common questions: the top overlaps, pairs within a distance, the most likely ones, pairs in the same window, what's planned near a place, one project or pair, what changed between plans, which date moves pay most, how many pairs were checked, and the data checks. Those answers end with "(Answered without the language model.)". Anything it can't place with confidence asks for a key instead of guessing.</w:t>
+            </w:r>
+          </w:p>
+        </w:tc>
+      </w:tr>
+    </w:tbl>
+    <w:p>
+      <w:pPr>
+        <w:spacing w:after="60"/>
+      </w:pPr>
     </w:p>
     <w:p>
       <w:pPr>
         <w:spacing w:after="140"/>
       </w:pPr>
       <w:r>
-        <w:t xml:space="preserve">If you used the what-if slider and the move improves the plan, the brief includes that move and marks the new dates as proposed. A move that makes things worse is left out, and the brief describes the plan as published.</w:t>
-      </w:r>
-    </w:p>
-    <w:p>
-      <w:pPr>
-        <w:spacing w:after="140"/>
-      </w:pPr>
-      <w:r>
-        <w:rPr>
-          <w:b/>
-          <w:bCs/>
-        </w:rPr>
-        <w:t xml:space="preserve">Print or save as PDF</w:t>
-      </w:r>
-      <w:r>
-        <w:t xml:space="preserve"> prints just the memo, and it fits on one Letter page. </w:t>
-      </w:r>
-      <w:r>
-        <w:rPr>
-          <w:b/>
-          <w:bCs/>
-        </w:rPr>
-        <w:t xml:space="preserve">Copy text</w:t>
-      </w:r>
-      <w:r>
-        <w:t xml:space="preserve"> copies it to paste into an email. Printing works when the app is opened from the repo or a website; the Claude preview blocks printing.</w:t>
-      </w:r>
+        <w:t xml:space="preserve">For open-ended questions, click </w:t>
+      </w:r>
+      <w:r>
+        <w:rPr>
+          <w:b/>
+          <w:bCs/>
+        </w:rPr>
+        <w:t xml:space="preserve">Connect an Anthropic key for open-ended questions</w:t>
+      </w:r>
+      <w:r>
+        <w:t xml:space="preserve"> at the bottom and paste your own key. The site has no server: the key stays in that browser and is sent only to Anthropic.</w:t>
+      </w:r>
+    </w:p>
+    <w:p>
+      <w:pPr>
+        <w:pageBreakBefore/>
+      </w:pPr>
     </w:p>
     <w:p>
       <w:pPr>
         <w:keepNext/>
-        <w:pageBreakBefore/>
         <w:spacing w:after="40" w:before="120"/>
       </w:pPr>
       <w:r>
@@ -3153,7 +4365,7 @@
           <w:sz w:val="17"/>
           <w:szCs w:val="17"/>
         </w:rPr>
-        <w:t xml:space="preserve">08 · SEE IT</w:t>
+        <w:t xml:space="preserve">12 · SEE IT</w:t>
       </w:r>
     </w:p>
     <w:p>
@@ -3161,20 +4373,21 @@
         <w:pStyle w:val="Heading1"/>
       </w:pPr>
       <w:r>
-        <w:t xml:space="preserve">The 3D view</w:t>
-      </w:r>
-    </w:p>
-    <w:p>
-      <w:pPr>
+        <w:t xml:space="preserve">The 3D illustration</w:t>
+      </w:r>
+    </w:p>
+    <w:p>
+      <w:pPr>
+        <w:keepNext/>
         <w:spacing w:after="40" w:before="80"/>
         <w:jc w:val="center"/>
       </w:pPr>
       <w:r>
         <w:drawing>
           <wp:inline distT="0" distB="0" distL="0" distR="0">
-            <wp:extent cx="5943600" cy="3295650"/>
+            <wp:extent cx="5943600" cy="2811038"/>
             <wp:effectExtent t="0" r="0" b="0" l="0"/>
-            <wp:docPr id="1" name="8-3d.png" descr="A shared crew yard between two lines about 22 km apart." title="A shared crew yard between two lines about 22 km apart."/>
+            <wp:docPr id="7" name="illustration.jpg" descr="Pair #4 as a landscape: Plant McIntosh's combined-cycle unit, the shared laydown yard, and the new line's towers." title="Pair #4 as a landscape: Plant McIntosh's combined-cycle unit, the shared laydown yard, and the new line's towers."/>
             <wp:cNvGraphicFramePr>
               <a:graphicFrameLocks xmlns:a="http://schemas.openxmlformats.org/drawingml/2006/main" noChangeAspect="1"/>
             </wp:cNvGraphicFramePr>
@@ -3188,7 +4401,7 @@
                     </pic:cNvPicPr>
                   </pic:nvPicPr>
                   <pic:blipFill>
-                    <a:blip r:embed="rId15" cstate="none"/>
+                    <a:blip r:embed="rId107" cstate="none"/>
                     <a:srcRect/>
                     <a:stretch>
                       <a:fillRect/>
@@ -3197,7 +4410,7 @@
                   <pic:spPr bwMode="auto">
                     <a:xfrm>
                       <a:off x="0" y="0"/>
-                      <a:ext cx="5943600" cy="3295650"/>
+                      <a:ext cx="5943600" cy="2811038"/>
                     </a:xfrm>
                     <a:prstGeom prst="rect">
                       <a:avLst/>
@@ -3223,7 +4436,7 @@
           <w:sz w:val="18"/>
           <w:szCs w:val="18"/>
         </w:rPr>
-        <w:t xml:space="preserve">A shared crew yard between two lines about 22 km apart.</w:t>
+        <w:t xml:space="preserve">Pair #4 as a landscape: Plant McIntosh's combined-cycle unit, the shared laydown yard, and the new line's towers.</w:t>
       </w:r>
     </w:p>
     <w:p>
@@ -3238,10 +4451,10 @@
           <w:b/>
           <w:bCs/>
         </w:rPr>
-        <w:t xml:space="preserve">View in 3D</w:t>
-      </w:r>
-      <w:r>
-        <w:t xml:space="preserve"> on a pair to see it as a small landscape: both companies' towers and wires (in their colors), substations or plants, work crews, and what the tier lets them share. That's a cleared strip and road for close pairs, or a storage or crew yard for farther ones. The glowing marker is the closest point, labeled with the distance.</w:t>
+        <w:t xml:space="preserve">3D illustration</w:t>
+      </w:r>
+      <w:r>
+        <w:t xml:space="preserve"> on a pair, or drop the walker on a project, to see it as a small landscape: both companies' towers and wires in their colors, substations with transformers and breakers, a power plant modeled on a combined-cycle station, work crews with pickups, bucket trucks, a crane and an excavator, and what the tier lets them share, like a cleared strip and road for close pairs or a laydown yard for farther ones.</w:t>
       </w:r>
     </w:p>
     <w:p>
@@ -3249,7 +4462,7 @@
         <w:spacing w:after="140"/>
       </w:pPr>
       <w:r>
-        <w:t xml:space="preserve">Drag to look around and scroll to zoom. Distances along the ground are to scale; towers are drawn taller than life so you can see them.</w:t>
+        <w:t xml:space="preserve">The ground is a cut-out block shaped from real elevation data; heights are stretched so the flat river country reads, and the footer gives the real range. Distances along the ground are to scale. Offline, it falls back to an illustrative ground.</w:t>
       </w:r>
     </w:p>
     <w:p>
@@ -3257,23 +4470,28 @@
         <w:spacing w:after="140"/>
       </w:pPr>
       <w:r>
-        <w:t xml:space="preserve">The </w:t>
-      </w:r>
-      <w:r>
-        <w:rPr>
-          <w:b/>
-          <w:bCs/>
-        </w:rPr>
-        <w:t xml:space="preserve">Labels on / Labels off</w:t>
-      </w:r>
-      <w:r>
-        <w:t xml:space="preserve"> button next to Close hides the floating name tags and the hint for a clean view. The app remembers your choice next time.</w:t>
-      </w:r>
-    </w:p>
-    <w:p>
-      <w:pPr>
-        <w:spacing w:after="140"/>
-      </w:pPr>
+        <w:t xml:space="preserve">Drag to look around and scroll to zoom. </w:t>
+      </w:r>
+      <w:r>
+        <w:rPr>
+          <w:b/>
+          <w:bCs/>
+        </w:rPr>
+        <w:t xml:space="preserve">Walk</w:t>
+      </w:r>
+      <w:r>
+        <w:t xml:space="preserve"> switches between the orbit view and walking at ground level. </w:t>
+      </w:r>
+      <w:r>
+        <w:rPr>
+          <w:b/>
+          <w:bCs/>
+        </w:rPr>
+        <w:t xml:space="preserve">Labels off</w:t>
+      </w:r>
+      <w:r>
+        <w:t xml:space="preserve"> hides the floating name tags for a clean view. </w:t>
+      </w:r>
       <w:r>
         <w:rPr>
           <w:b/>
@@ -3282,43 +4500,37 @@
         <w:t xml:space="preserve">Quality</w:t>
       </w:r>
       <w:r>
-        <w:t xml:space="preserve"> sets how sharp the scene is. </w:t>
-      </w:r>
-      <w:r>
-        <w:rPr>
-          <w:b/>
-          <w:bCs/>
-        </w:rPr>
-        <w:t xml:space="preserve">High</w:t>
-      </w:r>
-      <w:r>
-        <w:t xml:space="preserve">, the default, is sharp with soft shading where towers and trees meet the ground. </w:t>
-      </w:r>
-      <w:r>
-        <w:rPr>
-          <w:b/>
-          <w:bCs/>
-        </w:rPr>
-        <w:t xml:space="preserve">Ultra</w:t>
-      </w:r>
-      <w:r>
-        <w:t xml:space="preserve"> renders at your screen's full resolution for the crispest picture on a fast computer, and </w:t>
-      </w:r>
-      <w:r>
-        <w:rPr>
-          <w:b/>
-          <w:bCs/>
-        </w:rPr>
-        <w:t xml:space="preserve">Standard</w:t>
-      </w:r>
-      <w:r>
-        <w:t xml:space="preserve"> is a lighter look for slower ones.</w:t>
-      </w:r>
+        <w:t xml:space="preserve"> has two looks: </w:t>
+      </w:r>
+      <w:r>
+        <w:rPr>
+          <w:b/>
+          <w:bCs/>
+        </w:rPr>
+        <w:t xml:space="preserve">Detailed</w:t>
+      </w:r>
+      <w:r>
+        <w:t xml:space="preserve">, the default, stylized and fast, and </w:t>
+      </w:r>
+      <w:r>
+        <w:rPr>
+          <w:b/>
+          <w:bCs/>
+        </w:rPr>
+        <w:t xml:space="preserve">Ultra-realistic</w:t>
+      </w:r>
+      <w:r>
+        <w:t xml:space="preserve">, with textured siding, concrete and gravel, metal wires, loblolly pines, denser ground cover and finer terrain for a fast computer.</w:t>
+      </w:r>
+    </w:p>
+    <w:p>
+      <w:pPr>
+        <w:pageBreakBefore/>
+      </w:pPr>
     </w:p>
     <w:p>
       <w:pPr>
         <w:keepNext/>
-        <w:pageBreakBefore/>
         <w:spacing w:after="40" w:before="120"/>
       </w:pPr>
       <w:r>
@@ -3329,7 +4541,7 @@
           <w:sz w:val="17"/>
           <w:szCs w:val="17"/>
         </w:rPr>
-        <w:t xml:space="preserve">09 · ANY COMPANY, ANY FILE</w:t>
+        <w:t xml:space="preserve">13 · ANY COMPANY, ANY FILE</w:t>
       </w:r>
     </w:p>
     <w:p>
@@ -3342,68 +4554,6 @@
     </w:p>
     <w:p>
       <w:pPr>
-        <w:spacing w:after="40" w:before="80"/>
-        <w:jc w:val="center"/>
-      </w:pPr>
-      <w:r>
-        <w:drawing>
-          <wp:inline distT="0" distB="0" distL="0" distR="0">
-            <wp:extent cx="5943600" cy="2733675"/>
-            <wp:effectExtent t="0" r="0" b="0" l="0"/>
-            <wp:docPr id="1" name="9-import.png" descr="After dropping an Excel plan: 4 rows loaded, 1 skipped with the reason." title="After dropping an Excel plan: 4 rows loaded, 1 skipped with the reason."/>
-            <wp:cNvGraphicFramePr>
-              <a:graphicFrameLocks xmlns:a="http://schemas.openxmlformats.org/drawingml/2006/main" noChangeAspect="1"/>
-            </wp:cNvGraphicFramePr>
-            <a:graphic xmlns:a="http://schemas.openxmlformats.org/drawingml/2006/main">
-              <a:graphicData uri="http://schemas.openxmlformats.org/drawingml/2006/picture">
-                <pic:pic xmlns:pic="http://schemas.openxmlformats.org/drawingml/2006/picture">
-                  <pic:nvPicPr>
-                    <pic:cNvPr id="0" name="" descr=""/>
-                    <pic:cNvPicPr>
-                      <a:picLocks noChangeAspect="1" noChangeArrowheads="1"/>
-                    </pic:cNvPicPr>
-                  </pic:nvPicPr>
-                  <pic:blipFill>
-                    <a:blip r:embed="rId16" cstate="none"/>
-                    <a:srcRect/>
-                    <a:stretch>
-                      <a:fillRect/>
-                    </a:stretch>
-                  </pic:blipFill>
-                  <pic:spPr bwMode="auto">
-                    <a:xfrm>
-                      <a:off x="0" y="0"/>
-                      <a:ext cx="5943600" cy="2733675"/>
-                    </a:xfrm>
-                    <a:prstGeom prst="rect">
-                      <a:avLst/>
-                    </a:prstGeom>
-                  </pic:spPr>
-                </pic:pic>
-              </a:graphicData>
-            </a:graphic>
-          </wp:inline>
-        </w:drawing>
-      </w:r>
-    </w:p>
-    <w:p>
-      <w:pPr>
-        <w:spacing w:after="200"/>
-        <w:jc w:val="center"/>
-      </w:pPr>
-      <w:r>
-        <w:rPr>
-          <w:i/>
-          <w:iCs/>
-          <w:color w:val="77878D"/>
-          <w:sz w:val="18"/>
-          <w:szCs w:val="18"/>
-        </w:rPr>
-        <w:t xml:space="preserve">After dropping an Excel plan: 4 rows loaded, 1 skipped with the reason.</w:t>
-      </w:r>
-    </w:p>
-    <w:p>
-      <w:pPr>
         <w:spacing w:after="140"/>
       </w:pPr>
       <w:r>
@@ -3414,10 +4564,10 @@
           <w:b/>
           <w:bCs/>
         </w:rPr>
-        <w:t xml:space="preserve">Add a utility's plans</w:t>
-      </w:r>
-      <w:r>
-        <w:t xml:space="preserve"> and drop in the file the way the company published it. Seamline reads the file types power companies actually use:</w:t>
+        <w:t xml:space="preserve">Import</w:t>
+      </w:r>
+      <w:r>
+        <w:t xml:space="preserve"> at the bottom of the rail and drop in the file the way the company published it. Seamline reads the file types power companies actually use:</w:t>
       </w:r>
     </w:p>
     <w:p>
@@ -3430,14 +4580,7 @@
         <w:spacing w:after="80"/>
       </w:pPr>
       <w:r>
-        <w:rPr>
-          <w:b/>
-          <w:bCs/>
-        </w:rPr>
-        <w:t xml:space="preserve">Spreadsheets:</w:t>
-      </w:r>
-      <w:r>
-        <w:t xml:space="preserve"> Excel, CSV and TSV.</w:t>
+        <w:t xml:space="preserve">Spreadsheets: Excel, CSV and TSV. Every sheet is read, and title rows above the header are skipped.</w:t>
       </w:r>
     </w:p>
     <w:p>
@@ -3450,14 +4593,7 @@
         <w:spacing w:after="80"/>
       </w:pPr>
       <w:r>
-        <w:rPr>
-          <w:b/>
-          <w:bCs/>
-        </w:rPr>
-        <w:t xml:space="preserve">Map files:</w:t>
-      </w:r>
-      <w:r>
-        <w:t xml:space="preserve"> KML and KMZ (Google Earth), shapefiles (from GIS departments), GeoJSON, and GPX (from GPS surveys).</w:t>
+        <w:t xml:space="preserve">Map files: KML and KMZ (Google Earth), shapefiles (from GIS departments), GeoJSON, and GPX (from GPS surveys).</w:t>
       </w:r>
     </w:p>
     <w:p>
@@ -3465,7 +4601,17 @@
         <w:spacing w:after="140"/>
       </w:pPr>
       <w:r>
-        <w:t xml:space="preserve">It matches column names loosely, so "Owner", "Voltage (kV)" or "ISD" all work. If a file has no company name or no dates, type them in the boxes above the drop area. The report underneath says what loaded and why any rows were skipped. After loading, Seamline compares the new company with whichever existing one has the closest project.</w:t>
+        <w:t xml:space="preserve">It matches column names loosely, so "Owner", "Voltage (kV)" or "ISD" all work. If a file has no company name or no dates, type them in the boxes above the drop area. The report underneath says what loaded and why any rows were skipped. Tick </w:t>
+      </w:r>
+      <w:r>
+        <w:rPr>
+          <w:b/>
+          <w:bCs/>
+        </w:rPr>
+        <w:t xml:space="preserve">These are existing lines</w:t>
+      </w:r>
+      <w:r>
+        <w:t xml:space="preserve"> to load a file like a HIFLD download as a background layer instead of comparing it. After loading, Seamline compares the new company with whichever one has the closest project.</w:t>
       </w:r>
     </w:p>
     <w:p>
@@ -3473,13 +4619,17 @@
         <w:spacing w:after="140"/>
       </w:pPr>
       <w:r>
-        <w:t xml:space="preserve">The samples folder in the repo has nine made-up plans, one per file type, to try this with.</w:t>
-      </w:r>
+        <w:t xml:space="preserve">The samples folder in the repo has nine made-up plans, one per file type, plus an example existing-lines layer, to try this with.</w:t>
+      </w:r>
+    </w:p>
+    <w:p>
+      <w:pPr>
+        <w:pageBreakBefore/>
+      </w:pPr>
     </w:p>
     <w:p>
       <w:pPr>
         <w:keepNext/>
-        <w:pageBreakBefore/>
         <w:spacing w:after="40" w:before="120"/>
       </w:pPr>
       <w:r>
@@ -3490,7 +4640,7 @@
           <w:sz w:val="17"/>
           <w:szCs w:val="17"/>
         </w:rPr>
-        <w:t xml:space="preserve">10 · JUST BROWSING</w:t>
+        <w:t xml:space="preserve">14 · JUST BROWSING</w:t>
       </w:r>
     </w:p>
     <w:p>
@@ -3503,68 +4653,6 @@
     </w:p>
     <w:p>
       <w:pPr>
-        <w:spacing w:after="40" w:before="80"/>
-        <w:jc w:val="center"/>
-      </w:pPr>
-      <w:r>
-        <w:drawing>
-          <wp:inline distT="0" distB="0" distL="0" distR="0">
-            <wp:extent cx="3810000" cy="3286125"/>
-            <wp:effectExtent t="0" r="0" b="0" l="0"/>
-            <wp:docPr id="1" name="10-none.png" descr="Compare set to None." title="Compare set to None."/>
-            <wp:cNvGraphicFramePr>
-              <a:graphicFrameLocks xmlns:a="http://schemas.openxmlformats.org/drawingml/2006/main" noChangeAspect="1"/>
-            </wp:cNvGraphicFramePr>
-            <a:graphic xmlns:a="http://schemas.openxmlformats.org/drawingml/2006/main">
-              <a:graphicData uri="http://schemas.openxmlformats.org/drawingml/2006/picture">
-                <pic:pic xmlns:pic="http://schemas.openxmlformats.org/drawingml/2006/picture">
-                  <pic:nvPicPr>
-                    <pic:cNvPr id="0" name="" descr=""/>
-                    <pic:cNvPicPr>
-                      <a:picLocks noChangeAspect="1" noChangeArrowheads="1"/>
-                    </pic:cNvPicPr>
-                  </pic:nvPicPr>
-                  <pic:blipFill>
-                    <a:blip r:embed="rId17" cstate="none"/>
-                    <a:srcRect/>
-                    <a:stretch>
-                      <a:fillRect/>
-                    </a:stretch>
-                  </pic:blipFill>
-                  <pic:spPr bwMode="auto">
-                    <a:xfrm>
-                      <a:off x="0" y="0"/>
-                      <a:ext cx="3810000" cy="3286125"/>
-                    </a:xfrm>
-                    <a:prstGeom prst="rect">
-                      <a:avLst/>
-                    </a:prstGeom>
-                  </pic:spPr>
-                </pic:pic>
-              </a:graphicData>
-            </a:graphic>
-          </wp:inline>
-        </w:drawing>
-      </w:r>
-    </w:p>
-    <w:p>
-      <w:pPr>
-        <w:spacing w:after="200"/>
-        <w:jc w:val="center"/>
-      </w:pPr>
-      <w:r>
-        <w:rPr>
-          <w:i/>
-          <w:iCs/>
-          <w:color w:val="77878D"/>
-          <w:sz w:val="18"/>
-          <w:szCs w:val="18"/>
-        </w:rPr>
-        <w:t xml:space="preserve">Compare set to None.</w:t>
-      </w:r>
-    </w:p>
-    <w:p>
-      <w:pPr>
         <w:spacing w:after="140"/>
       </w:pPr>
       <w:r>
@@ -3575,10 +4663,10 @@
           <w:b/>
           <w:bCs/>
         </w:rPr>
-        <w:t xml:space="preserve">None</w:t>
-      </w:r>
-      <w:r>
-        <w:t xml:space="preserve"> and Seamline stops pairing. It lists every project for the first company in the order they start, with type, voltage and cost.</w:t>
+        <w:t xml:space="preserve">None: just list projects</w:t>
+      </w:r>
+      <w:r>
+        <w:t xml:space="preserve"> and Seamline stops pairing. It lists every project for the first company with voltage, type, name, in-service date and cost. The headline tiles and pair links go away because there's nothing to compare.</w:t>
       </w:r>
     </w:p>
     <w:p>
@@ -3586,13 +4674,17 @@
         <w:spacing w:after="140"/>
       </w:pPr>
       <w:r>
-        <w:t xml:space="preserve">The four numbers change to project count, kilometers of line, in-service years and total cost. The sliders grey out because there's nothing to compare. Click a project to see its details, or press Play to watch that company's building years.</w:t>
-      </w:r>
+        <w:t xml:space="preserve">Click a project to see its details and source, or press Play to watch that company's building years. Pick a second company at the top to find projects near it again.</w:t>
+      </w:r>
+    </w:p>
+    <w:p>
+      <w:pPr>
+        <w:pageBreakBefore/>
+      </w:pPr>
     </w:p>
     <w:p>
       <w:pPr>
         <w:keepNext/>
-        <w:pageBreakBefore/>
         <w:spacing w:after="40" w:before="120"/>
       </w:pPr>
       <w:r>
@@ -3603,7 +4695,7 @@
           <w:sz w:val="17"/>
           <w:szCs w:val="17"/>
         </w:rPr>
-        <w:t xml:space="preserve">11 · THE MONEY</w:t>
+        <w:t xml:space="preserve">15 · THE MONEY</w:t>
       </w:r>
     </w:p>
     <w:p>
@@ -4430,68 +5522,6 @@
     </w:p>
     <w:p>
       <w:pPr>
-        <w:spacing w:after="40" w:before="80"/>
-        <w:jc w:val="center"/>
-      </w:pPr>
-      <w:r>
-        <w:drawing>
-          <wp:inline distT="0" distB="0" distL="0" distR="0">
-            <wp:extent cx="5943600" cy="5324475"/>
-            <wp:effectExtent t="0" r="0" b="0" l="0"/>
-            <wp:docPr id="1" name="12-assume.png" descr="Cost assumptions, at the bottom of the page. A changed number is outlined and shows its default." title="Cost assumptions, at the bottom of the page. A changed number is outlined and shows its default."/>
-            <wp:cNvGraphicFramePr>
-              <a:graphicFrameLocks xmlns:a="http://schemas.openxmlformats.org/drawingml/2006/main" noChangeAspect="1"/>
-            </wp:cNvGraphicFramePr>
-            <a:graphic xmlns:a="http://schemas.openxmlformats.org/drawingml/2006/main">
-              <a:graphicData uri="http://schemas.openxmlformats.org/drawingml/2006/picture">
-                <pic:pic xmlns:pic="http://schemas.openxmlformats.org/drawingml/2006/picture">
-                  <pic:nvPicPr>
-                    <pic:cNvPr id="0" name="" descr=""/>
-                    <pic:cNvPicPr>
-                      <a:picLocks noChangeAspect="1" noChangeArrowheads="1"/>
-                    </pic:cNvPicPr>
-                  </pic:nvPicPr>
-                  <pic:blipFill>
-                    <a:blip r:embed="rId18" cstate="none"/>
-                    <a:srcRect/>
-                    <a:stretch>
-                      <a:fillRect/>
-                    </a:stretch>
-                  </pic:blipFill>
-                  <pic:spPr bwMode="auto">
-                    <a:xfrm>
-                      <a:off x="0" y="0"/>
-                      <a:ext cx="5943600" cy="5324475"/>
-                    </a:xfrm>
-                    <a:prstGeom prst="rect">
-                      <a:avLst/>
-                    </a:prstGeom>
-                  </pic:spPr>
-                </pic:pic>
-              </a:graphicData>
-            </a:graphic>
-          </wp:inline>
-        </w:drawing>
-      </w:r>
-    </w:p>
-    <w:p>
-      <w:pPr>
-        <w:spacing w:after="200"/>
-        <w:jc w:val="center"/>
-      </w:pPr>
-      <w:r>
-        <w:rPr>
-          <w:i/>
-          <w:iCs/>
-          <w:color w:val="77878D"/>
-          <w:sz w:val="18"/>
-          <w:szCs w:val="18"/>
-        </w:rPr>
-        <w:t xml:space="preserve">Cost assumptions, at the bottom of the page. A changed number is outlined and shows its default.</w:t>
-      </w:r>
-    </w:p>
-    <w:p>
-      <w:pPr>
         <w:spacing w:after="140"/>
       </w:pPr>
       <w:r>
@@ -4499,30 +5529,35 @@
           <w:b/>
           <w:bCs/>
         </w:rPr>
+        <w:t xml:space="preserve">Chance and expected savings.</w:t>
+      </w:r>
+      <w:r>
+        <w:t xml:space="preserve"> Land and permit items, and a shared shutoff or crossing, don't depend on timing, so they count in full. Yards, deliveries, crews, cranes and contractors need both crews in the field together, so they are counted by the pair's chance. That's the expected savings: $13.6M over all 169 pairs, against $15.2M if every date held.</w:t>
+      </w:r>
+    </w:p>
+    <w:p>
+      <w:pPr>
+        <w:spacing w:after="140"/>
+      </w:pPr>
+      <w:r>
+        <w:rPr>
+          <w:b/>
+          <w:bCs/>
+        </w:rPr>
         <w:t xml:space="preserve">Change any number.</w:t>
       </w:r>
       <w:r>
-        <w:t xml:space="preserve"> Every unit cost above is in the </w:t>
-      </w:r>
-      <w:r>
-        <w:rPr>
-          <w:b/>
-          <w:bCs/>
-        </w:rPr>
-        <w:t xml:space="preserve">Cost assumptions</w:t>
-      </w:r>
-      <w:r>
-        <w:t xml:space="preserve"> table at the bottom of the page. Type a new value and every pair, the total and the brief update at once. Your numbers are remembered on that device, and </w:t>
-      </w:r>
-      <w:r>
-        <w:rPr>
-          <w:b/>
-          <w:bCs/>
-        </w:rPr>
-        <w:t xml:space="preserve">Reset to defaults</w:t>
-      </w:r>
-      <w:r>
-        <w:t xml:space="preserve"> puts them back. To check them, compare with USDA NASS Land Values for land, the MISO Transmission Cost Estimation Guide for line, road and yard costs, and local crane rental and trucking rates.</w:t>
+        <w:t xml:space="preserve"> Press </w:t>
+      </w:r>
+      <w:r>
+        <w:rPr>
+          <w:b/>
+          <w:bCs/>
+        </w:rPr>
+        <w:t xml:space="preserve">Costs</w:t>
+      </w:r>
+      <w:r>
+        <w:t xml:space="preserve"> at the bottom of the rail to open Unit costs. Type a new value and every pair, the totals and the briefs update at once. Your numbers are remembered on that device, and Reset to defaults puts them back. To check them, compare with USDA NASS Land Values for land, the MISO Transmission Cost Estimation Guide for line, road and yard costs, and local crane rental and heavy-haul rates.</w:t>
       </w:r>
     </w:p>
     <w:p>
@@ -4583,7 +5618,7 @@
           </w:p>
           <w:p>
             <w:r>
-              <w:t xml:space="preserve">Locations are placed by hand from substation names, start dates are estimated, and costs are estimates unless the plan lists them. Seamline points at where to look; the two companies confirm the details.</w:t>
+              <w:t xml:space="preserve">Locations are matched from substation names to OpenStreetMap and checked by hand, start dates are estimated unless the plan publishes them, and costs are estimates unless the plan lists them. The chance assumes each project moves once more, like the moves already seen. Seamline points at where to look; the two companies confirm the details.</w:t>
             </w:r>
           </w:p>
         </w:tc>
@@ -4591,13 +5626,12 @@
     </w:tbl>
     <w:p>
       <w:pPr>
-        <w:spacing w:after="120"/>
+        <w:pageBreakBefore/>
       </w:pPr>
     </w:p>
     <w:p>
       <w:pPr>
         <w:keepNext/>
-        <w:pageBreakBefore/>
         <w:spacing w:after="40" w:before="120"/>
       </w:pPr>
       <w:r>
@@ -4608,7 +5642,7 @@
           <w:sz w:val="17"/>
           <w:szCs w:val="17"/>
         </w:rPr>
-        <w:t xml:space="preserve">12 · ONE YARD FOR MANY JOBS</w:t>
+        <w:t xml:space="preserve">16 · ONE YARD FOR MANY JOBS</w:t>
       </w:r>
     </w:p>
     <w:p>
@@ -4621,68 +5655,6 @@
     </w:p>
     <w:p>
       <w:pPr>
-        <w:spacing w:after="40" w:before="80"/>
-        <w:jc w:val="center"/>
-      </w:pPr>
-      <w:r>
-        <w:drawing>
-          <wp:inline distT="0" distB="0" distL="0" distR="0">
-            <wp:extent cx="3619500" cy="6686550"/>
-            <wp:effectExtent t="0" r="0" b="0" l="0"/>
-            <wp:docPr id="1" name="13-yard.png" descr="The 8-project group around Augusta." title="The 8-project group around Augusta."/>
-            <wp:cNvGraphicFramePr>
-              <a:graphicFrameLocks xmlns:a="http://schemas.openxmlformats.org/drawingml/2006/main" noChangeAspect="1"/>
-            </wp:cNvGraphicFramePr>
-            <a:graphic xmlns:a="http://schemas.openxmlformats.org/drawingml/2006/main">
-              <a:graphicData uri="http://schemas.openxmlformats.org/drawingml/2006/picture">
-                <pic:pic xmlns:pic="http://schemas.openxmlformats.org/drawingml/2006/picture">
-                  <pic:nvPicPr>
-                    <pic:cNvPr id="0" name="" descr=""/>
-                    <pic:cNvPicPr>
-                      <a:picLocks noChangeAspect="1" noChangeArrowheads="1"/>
-                    </pic:cNvPicPr>
-                  </pic:nvPicPr>
-                  <pic:blipFill>
-                    <a:blip r:embed="rId19" cstate="none"/>
-                    <a:srcRect/>
-                    <a:stretch>
-                      <a:fillRect/>
-                    </a:stretch>
-                  </pic:blipFill>
-                  <pic:spPr bwMode="auto">
-                    <a:xfrm>
-                      <a:off x="0" y="0"/>
-                      <a:ext cx="3619500" cy="6686550"/>
-                    </a:xfrm>
-                    <a:prstGeom prst="rect">
-                      <a:avLst/>
-                    </a:prstGeom>
-                  </pic:spPr>
-                </pic:pic>
-              </a:graphicData>
-            </a:graphic>
-          </wp:inline>
-        </w:drawing>
-      </w:r>
-    </w:p>
-    <w:p>
-      <w:pPr>
-        <w:spacing w:after="200"/>
-        <w:jc w:val="center"/>
-      </w:pPr>
-      <w:r>
-        <w:rPr>
-          <w:i/>
-          <w:iCs/>
-          <w:color w:val="77878D"/>
-          <w:sz w:val="18"/>
-          <w:szCs w:val="18"/>
-        </w:rPr>
-        <w:t xml:space="preserve">The 8-project group around Augusta.</w:t>
-      </w:r>
-    </w:p>
-    <w:p>
-      <w:pPr>
         <w:spacing w:after="140"/>
       </w:pPr>
       <w:r>
@@ -4701,7 +5673,7 @@
         <w:t xml:space="preserve">Shared yards</w:t>
       </w:r>
       <w:r>
-        <w:t xml:space="preserve"> at the top of the list shows groups of 3 or more projects, from both companies, that are built at the same time and could all use one yard. Click one to see the yard, how far each site is from it, and what it saves on the road: truck-miles, driver-hours and tons of CO2, using the EPA's figure for diesel. Heavy loads for every extra project can ride shared trips to one yard; the extra driving from the yard to each site is subtracted.</w:t>
+        <w:t xml:space="preserve"> at the top of the Overlaps list shows groups of projects, from both companies, that are built at the same time and could all use one yard. Click one to see the yard, how far each site is from it, and what it saves on the road: truck-miles, driver-hours and tons of CO2, using the EPA's figure for diesel. Heavy loads for every extra project can ride shared trips to one yard; the extra driving from the yard to each site is subtracted.</w:t>
       </w:r>
     </w:p>
     <w:p>
@@ -4709,79 +5681,7 @@
         <w:spacing w:after="140"/>
       </w:pPr>
       <w:r>
-        <w:t xml:space="preserve">The biggest group is 8 projects around Augusta. Its best yard is at </w:t>
-      </w:r>
-      <w:r>
-        <w:rPr>
-          <w:b/>
-          <w:bCs/>
-        </w:rPr>
-        <w:t xml:space="preserve">Stevens Creek Hydro</w:t>
-      </w:r>
-      <w:r>
-        <w:t xml:space="preserve">, DESC's own plant in Georgia, with every site within 35 km. That saves about 6,250 truck-miles, 139 driver-hours and 10.6 t of CO2, plus 7 yards that don't need building.</w:t>
-      </w:r>
-    </w:p>
-    <w:p>
-      <w:pPr>
-        <w:spacing w:after="40" w:before="80"/>
-        <w:jc w:val="center"/>
-      </w:pPr>
-      <w:r>
-        <w:drawing>
-          <wp:inline distT="0" distB="0" distL="0" distR="0">
-            <wp:extent cx="4381500" cy="4333875"/>
-            <wp:effectExtent t="0" r="0" b="0" l="0"/>
-            <wp:docPr id="1" name="13b-yard-map.png" descr="The square is the yard. The dashed circle is a 40 km day's drive, and a dotted line runs to each site." title="The square is the yard. The dashed circle is a 40 km day's drive, and a dotted line runs to each site."/>
-            <wp:cNvGraphicFramePr>
-              <a:graphicFrameLocks xmlns:a="http://schemas.openxmlformats.org/drawingml/2006/main" noChangeAspect="1"/>
-            </wp:cNvGraphicFramePr>
-            <a:graphic xmlns:a="http://schemas.openxmlformats.org/drawingml/2006/main">
-              <a:graphicData uri="http://schemas.openxmlformats.org/drawingml/2006/picture">
-                <pic:pic xmlns:pic="http://schemas.openxmlformats.org/drawingml/2006/picture">
-                  <pic:nvPicPr>
-                    <pic:cNvPr id="0" name="" descr=""/>
-                    <pic:cNvPicPr>
-                      <a:picLocks noChangeAspect="1" noChangeArrowheads="1"/>
-                    </pic:cNvPicPr>
-                  </pic:nvPicPr>
-                  <pic:blipFill>
-                    <a:blip r:embed="rId20" cstate="none"/>
-                    <a:srcRect/>
-                    <a:stretch>
-                      <a:fillRect/>
-                    </a:stretch>
-                  </pic:blipFill>
-                  <pic:spPr bwMode="auto">
-                    <a:xfrm>
-                      <a:off x="0" y="0"/>
-                      <a:ext cx="4381500" cy="4333875"/>
-                    </a:xfrm>
-                    <a:prstGeom prst="rect">
-                      <a:avLst/>
-                    </a:prstGeom>
-                  </pic:spPr>
-                </pic:pic>
-              </a:graphicData>
-            </a:graphic>
-          </wp:inline>
-        </w:drawing>
-      </w:r>
-    </w:p>
-    <w:p>
-      <w:pPr>
-        <w:spacing w:after="200"/>
-        <w:jc w:val="center"/>
-      </w:pPr>
-      <w:r>
-        <w:rPr>
-          <w:i/>
-          <w:iCs/>
-          <w:color w:val="77878D"/>
-          <w:sz w:val="18"/>
-          <w:szCs w:val="18"/>
-        </w:rPr>
-        <w:t xml:space="preserve">The square is the yard. The dashed circle is a 40 km day's drive, and a dotted line runs to each site.</w:t>
+        <w:t xml:space="preserve">The biggest group has 12 projects, with every site within 38 km of one yard on open land. That saves about 12,841 truck-miles, 285 driver-hours and 21.9 t of CO2, plus 11 yards that don't need building.</w:t>
       </w:r>
     </w:p>
     <w:p>
@@ -4789,23 +5689,17 @@
         <w:spacing w:after="140"/>
       </w:pPr>
       <w:r>
-        <w:t xml:space="preserve">Each pair's details and its brief also name the pair's own best yard. The numbers behind all of this are under </w:t>
-      </w:r>
-      <w:r>
-        <w:rPr>
-          <w:b/>
-          <w:bCs/>
-        </w:rPr>
-        <w:t xml:space="preserve">Cost assumptions</w:t>
-      </w:r>
-      <w:r>
-        <w:t xml:space="preserve">.</w:t>
-      </w:r>
+        <w:t xml:space="preserve">Each pair's details and its brief also name the pair's own best yard. The numbers behind all of this are under Costs.</w:t>
+      </w:r>
+    </w:p>
+    <w:p>
+      <w:pPr>
+        <w:pageBreakBefore/>
+      </w:pPr>
     </w:p>
     <w:p>
       <w:pPr>
         <w:keepNext/>
-        <w:pageBreakBefore/>
         <w:spacing w:after="40" w:before="120"/>
       </w:pPr>
       <w:r>
@@ -4816,7 +5710,7 @@
           <w:sz w:val="17"/>
           <w:szCs w:val="17"/>
         </w:rPr>
-        <w:t xml:space="preserve">13 · FOR THE JUDGES</w:t>
+        <w:t xml:space="preserve">17 · FOR THE JUDGES</w:t>
       </w:r>
     </w:p>
     <w:p>
@@ -4837,7 +5731,7 @@
         <w:spacing w:after="80"/>
       </w:pPr>
       <w:r>
-        <w:t xml:space="preserve">Open the app. Point at the four numbers: 2,106 pairs checked, 20 close, 9 at the same time, about $4.0M.</w:t>
+        <w:t xml:space="preserve">Open the app with Relief and Grid on. Point at the tiles: 10,304 pairs checked, 169 overlaps, $13.6M expected savings. The thin lines underneath are today's grid, 10,092 real lines.</w:t>
       </w:r>
     </w:p>
     <w:p>
@@ -4850,7 +5744,17 @@
         <w:spacing w:after="80"/>
       </w:pPr>
       <w:r>
-        <w:t xml:space="preserve">Point at the stitched river on the map: that's the seam where the two companies meet.</w:t>
+        <w:t xml:space="preserve">Press </w:t>
+      </w:r>
+      <w:r>
+        <w:rPr>
+          <w:b/>
+          <w:bCs/>
+        </w:rPr>
+        <w:t xml:space="preserve">Checks</w:t>
+      </w:r>
+      <w:r>
+        <w:t xml:space="preserve">: 2 PDFs → 262 official records, and all 6 of the challenge's reference overlaps reproduced.</w:t>
       </w:r>
     </w:p>
     <w:p>
@@ -4870,10 +5774,10 @@
           <w:b/>
           <w:bCs/>
         </w:rPr>
-        <w:t xml:space="preserve">Play</w:t>
-      </w:r>
-      <w:r>
-        <w:t xml:space="preserve">. Watch pairs spark when both are being built in the same month.</w:t>
+        <w:t xml:space="preserve">Changes</w:t>
+      </w:r>
+      <w:r>
+        <w:t xml:space="preserve">: 23 of 30 DESC projects slipped, a year at the median, and the last updates opened 9 shared windows and closed 3.</w:t>
       </w:r>
     </w:p>
     <w:p>
@@ -4886,7 +5790,17 @@
         <w:spacing w:after="80"/>
       </w:pPr>
       <w:r>
-        <w:t xml:space="preserve">Click pair #1, Okatie to McIntosh. They touch, so one shared shutoff saves money on its own.</w:t>
+        <w:t xml:space="preserve">Back in </w:t>
+      </w:r>
+      <w:r>
+        <w:rPr>
+          <w:b/>
+          <w:bCs/>
+        </w:rPr>
+        <w:t xml:space="preserve">Overlaps</w:t>
+      </w:r>
+      <w:r>
+        <w:t xml:space="preserve">, open pair #4, Jasper - Okatie #2 × McIntosh Unit 12: six months apart on paper, but a 68% chance both crews meet.</w:t>
       </w:r>
     </w:p>
     <w:p>
@@ -4899,27 +5813,7 @@
         <w:spacing w:after="80"/>
       </w:pPr>
       <w:r>
-        <w:t xml:space="preserve">Press </w:t>
-      </w:r>
-      <w:r>
-        <w:rPr>
-          <w:b/>
-          <w:bCs/>
-        </w:rPr>
-        <w:t xml:space="preserve">View in 3D</w:t>
-      </w:r>
-      <w:r>
-        <w:t xml:space="preserve"> to show the shared strip of land and road. Turn </w:t>
-      </w:r>
-      <w:r>
-        <w:rPr>
-          <w:b/>
-          <w:bCs/>
-        </w:rPr>
-        <w:t xml:space="preserve">Labels off</w:t>
-      </w:r>
-      <w:r>
-        <w:t xml:space="preserve"> for a clean shot, then close it.</w:t>
+        <w:t xml:space="preserve">Drag the orange walker onto the Jasper - Okatie line, walk with W toward the towers and the shared yard, then close it.</w:t>
       </w:r>
     </w:p>
     <w:p>
@@ -4932,7 +5826,27 @@
         <w:spacing w:after="80"/>
       </w:pPr>
       <w:r>
-        <w:t xml:space="preserve">Open a pair that misses by a few months, press the suggested move, and watch the savings appear.</w:t>
+        <w:t xml:space="preserve">Switch to </w:t>
+      </w:r>
+      <w:r>
+        <w:rPr>
+          <w:b/>
+          <w:bCs/>
+        </w:rPr>
+        <w:t xml:space="preserve">Satellite</w:t>
+      </w:r>
+      <w:r>
+        <w:t xml:space="preserve"> and </w:t>
+      </w:r>
+      <w:r>
+        <w:rPr>
+          <w:b/>
+          <w:bCs/>
+        </w:rPr>
+        <w:t xml:space="preserve">3D</w:t>
+      </w:r>
+      <w:r>
+        <w:t xml:space="preserve">: the real place, with the new line's towers and Plant McIntosh 4.3 km away.</w:t>
       </w:r>
     </w:p>
     <w:p>
@@ -4952,10 +5866,20 @@
           <w:b/>
           <w:bCs/>
         </w:rPr>
-        <w:t xml:space="preserve">Coordination brief</w:t>
-      </w:r>
-      <w:r>
-        <w:t xml:space="preserve">: this is the page you'd send to both companies.</w:t>
+        <w:t xml:space="preserve">Plan</w:t>
+      </w:r>
+      <w:r>
+        <w:t xml:space="preserve">: 8 date moves of at most 6 months raise expected savings from $13.6M to $16.1M. </w:t>
+      </w:r>
+      <w:r>
+        <w:rPr>
+          <w:b/>
+          <w:bCs/>
+        </w:rPr>
+        <w:t xml:space="preserve">Joint brief</w:t>
+      </w:r>
+      <w:r>
+        <w:t xml:space="preserve"> prints the proposal.</w:t>
       </w:r>
     </w:p>
     <w:p>
@@ -4968,17 +5892,14 @@
         <w:spacing w:after="80"/>
       </w:pPr>
       <w:r>
-        <w:t xml:space="preserve">Click the 8-project group under </w:t>
-      </w:r>
-      <w:r>
-        <w:rPr>
-          <w:b/>
-          <w:bCs/>
-        </w:rPr>
-        <w:t xml:space="preserve">Shared yards</w:t>
-      </w:r>
-      <w:r>
-        <w:t xml:space="preserve">: one yard at Stevens Creek Hydro serves them all.</w:t>
+        <w:rPr>
+          <w:b/>
+          <w:bCs/>
+        </w:rPr>
+        <w:t xml:space="preserve">More → Share this view</w:t>
+      </w:r>
+      <w:r>
+        <w:t xml:space="preserve">: the other company opens exactly this.</w:t>
       </w:r>
     </w:p>
     <w:p>
@@ -4991,17 +5912,17 @@
         <w:spacing w:after="80"/>
       </w:pPr>
       <w:r>
-        <w:t xml:space="preserve">Finish by dropping a sample file into </w:t>
-      </w:r>
-      <w:r>
-        <w:rPr>
-          <w:b/>
-          <w:bCs/>
-        </w:rPr>
-        <w:t xml:space="preserve">Add a utility's plans</w:t>
-      </w:r>
-      <w:r>
-        <w:t xml:space="preserve"> to show it works for any company.</w:t>
+        <w:t xml:space="preserve">Press </w:t>
+      </w:r>
+      <w:r>
+        <w:rPr>
+          <w:b/>
+          <w:bCs/>
+        </w:rPr>
+        <w:t xml:space="preserve">Ask</w:t>
+      </w:r>
+      <w:r>
+        <w:t xml:space="preserve"> and click a suggestion. The common questions work even without a key.</w:t>
       </w:r>
     </w:p>
     <w:sectPr>

</xml_diff>